<commit_message>
Aplicar indicaciones del profesor: OS en %, factor q>=1 (Ec. 13), lsim estricto y trimf con a<b<c; regenerar 15 corridas, figuras, Notebook y DOCX
</commit_message>
<xml_diff>
--- a/Reporte_Parcial2_ComputacionFlexible.docx
+++ b/Reporte_Parcial2_ComputacionFlexible.docx
@@ -20,12 +20,12 @@
     </w:p>
     <w:p>
       <w:r>
-        <w:t>Este informe presenta el diseño, implementación, optimización evolutiva y análisis crítico de tres controladores difusos tipo Mamdani (con 5, 7 y 9 términos lingüísticos por entrada y salida) aplicados al control en lazo cerrado de la posición angular de un servomotor de corriente directa con función de transferencia G(s) = 0.5 / (s^3 + 13.6667 s^2 + 23.3487 s), simulado exclusivamente mediante scipy.signal.lti y scipy.signal.lsim durante T_sim = 200 s ante una referencia cuadrada de ±1 rad y período de 100 s, en ausencia total de ruido.</w:t>
+        <w:t>Este informe presenta el diseño, implementación, optimización evolutiva y análisis crítico de tres controladores difusos tipo Mamdani (con 5, 7 y 9 términos lingüísticos por entrada y salida) aplicados al control en lazo cerrado de la posición angular de un servomotor de corriente directa con función de transferencia G(s) = 0.5 / (s^3 + 13.6667 s^2 + 23.3487 s), simulado estrictamente mediante scipy.signal.lti y scipy.signal.lsim durante T_sim = 200 s ante una referencia cuadrada de ±1 rad y período de 100 s, en ausencia total de ruido.</w:t>
       </w:r>
     </w:p>
     <w:p>
       <w:r>
-        <w:t>Siguiendo la metodología de Téllez-Velázquez et al. (2017), se implementó en PyGAD la optimización simultánea de los centros, anchuras/solapamientos de las funciones de membresía de entrada y salida, la activación y desactivación de reglas difusas y sus consecuentes, evaluando cada individuo mediante las Ecuaciones (12) y (13) con t_r^0 = 9 s, t_s^0 = 13 s y pesos w_1 = ... = w_8 = 0.125.</w:t>
+        <w:t>Siguiendo la metodología de Téllez-Velázquez et al. (2017), se implementó en PyGAD la optimización simultánea de la forma, centros y traslapes de las funciones de membresía triangulares (cuidando siempre el orden estricto a &lt; b &lt; c), la activación y desactivación de reglas difusas y sus consecuentes, evaluando cada individuo mediante las Ecuaciones (12) y (13) con sobreimpulso OS en porcentaje (%) como en la Tabla 10 del artículo, penalización q &gt;= 1.0, t_r^0 = 9 s, t_s^0 = 13 s y pesos w_1 = ... = w_8 = 0.125.</w:t>
       </w:r>
     </w:p>
     <w:p>
@@ -40,7 +40,7 @@
       <w:r>
         <w:t>• Universos de discurso fijos: error e in [-pi/2, pi/2] rad, cambio del error de in [-pi/6, pi/6] rad/s, voltaje de control v in [-8.18, 8.18] V.</w:t>
         <w:br/>
-        <w:t>• Codificación genética: L(N) = 9N + 2N^2 genes (95 genes para 5 términos, 161 genes para 7 términos, 243 genes para 9 términos), con reparación de orden y fronteras.</w:t>
+        <w:t>• Codificación genética: L(N) = 9N + 2N^2 genes (95 genes para 5 términos, 161 genes para 7 términos, 243 genes para 9 términos), con funciones triangulares trimf que garantizan a &lt; b &lt; c y traslapes válidos.</w:t>
         <w:br/>
         <w:t>• Parámetros de PyGAD: sol_per_pop = 20 individuos, num_generations = 30 generaciones, selección por torneo (K=3), cruza de dos puntos (p_c = 0.80), mutación aleatoria acotada (p_m = 0.15) y elitismo (2 individuos).</w:t>
         <w:br/>
@@ -126,7 +126,7 @@
           </w:tcPr>
           <w:p>
             <w:r>
-              <w:t>0.8257 ± 0.0713</w:t>
+              <w:t>0.7218 ± 0.0488</w:t>
             </w:r>
           </w:p>
         </w:tc>
@@ -136,7 +136,7 @@
           </w:tcPr>
           <w:p>
             <w:r>
-              <w:t>0.7728 ± 0.0849</w:t>
+              <w:t>0.7299 ± 0.0593</w:t>
             </w:r>
           </w:p>
         </w:tc>
@@ -146,7 +146,7 @@
           </w:tcPr>
           <w:p>
             <w:r>
-              <w:t>0.7678 ± 0.0472</w:t>
+              <w:t>0.7134 ± 0.0649</w:t>
             </w:r>
           </w:p>
         </w:tc>
@@ -168,7 +168,7 @@
           </w:tcPr>
           <w:p>
             <w:r>
-              <w:t>0.8992 (semilla 42)</w:t>
+              <w:t>0.7616 (semilla 999)</w:t>
             </w:r>
           </w:p>
         </w:tc>
@@ -178,7 +178,7 @@
           </w:tcPr>
           <w:p>
             <w:r>
-              <w:t>0.8879 (semilla 42)</w:t>
+              <w:t>0.8199 (semilla 42)</w:t>
             </w:r>
           </w:p>
         </w:tc>
@@ -188,7 +188,7 @@
           </w:tcPr>
           <w:p>
             <w:r>
-              <w:t>0.8133 (semilla 777)</w:t>
+              <w:t>0.7946 (semilla 999)</w:t>
             </w:r>
           </w:p>
         </w:tc>
@@ -200,7 +200,7 @@
           </w:tcPr>
           <w:p>
             <w:r>
-              <w:t>OS+ (mejor / media ± DE)</w:t>
+              <w:t>OS+ [%] (mejor / media ± DE)</w:t>
             </w:r>
           </w:p>
         </w:tc>
@@ -210,7 +210,7 @@
           </w:tcPr>
           <w:p>
             <w:r>
-              <w:t>0.0321 (0.0129 ± 0.0173)</w:t>
+              <w:t>0.0577 (0.0115 ± 0.0258)</w:t>
             </w:r>
           </w:p>
         </w:tc>
@@ -220,7 +220,7 @@
           </w:tcPr>
           <w:p>
             <w:r>
-              <w:t>0.0124 (0.0174 ± 0.0190)</w:t>
+              <w:t>0.7896 (1.2004 ± 1.3434)</w:t>
             </w:r>
           </w:p>
         </w:tc>
@@ -230,7 +230,7 @@
           </w:tcPr>
           <w:p>
             <w:r>
-              <w:t>0.0216 (0.0204 ± 0.0348)</w:t>
+              <w:t>0.0000 (0.4326 ± 0.9673)</w:t>
             </w:r>
           </w:p>
         </w:tc>
@@ -242,7 +242,7 @@
           </w:tcPr>
           <w:p>
             <w:r>
-              <w:t>OS- (mejor / media ± DE)</w:t>
+              <w:t>OS- [%] (mejor / media ± DE)</w:t>
             </w:r>
           </w:p>
         </w:tc>
@@ -252,7 +252,7 @@
           </w:tcPr>
           <w:p>
             <w:r>
-              <w:t>0.0000 (0.0114 ± 0.0107)</w:t>
+              <w:t>0.0000 (0.2439 ± 0.5453)</w:t>
             </w:r>
           </w:p>
         </w:tc>
@@ -262,7 +262,7 @@
           </w:tcPr>
           <w:p>
             <w:r>
-              <w:t>0.0000 (0.0065 ± 0.0145)</w:t>
+              <w:t>0.0000 (0.0000 ± 0.0000)</w:t>
             </w:r>
           </w:p>
         </w:tc>
@@ -272,7 +272,7 @@
           </w:tcPr>
           <w:p>
             <w:r>
-              <w:t>0.0224 (0.0201 ± 0.0196)</w:t>
+              <w:t>1.3638 (1.2498 ± 1.9562)</w:t>
             </w:r>
           </w:p>
         </w:tc>
@@ -294,7 +294,7 @@
           </w:tcPr>
           <w:p>
             <w:r>
-              <w:t>0.0298 (0.0234 ± 0.0099)</w:t>
+              <w:t>0.0031 (0.0390 ± 0.0508)</w:t>
             </w:r>
           </w:p>
         </w:tc>
@@ -304,7 +304,7 @@
           </w:tcPr>
           <w:p>
             <w:r>
-              <w:t>0.0115 (0.0289 ± 0.0103)</w:t>
+              <w:t>0.0063 (0.0213 ± 0.0089)</w:t>
             </w:r>
           </w:p>
         </w:tc>
@@ -314,7 +314,7 @@
           </w:tcPr>
           <w:p>
             <w:r>
-              <w:t>0.0163 (0.0595 ± 0.0524)</w:t>
+              <w:t>0.0144 (0.0879 ± 0.1139)</w:t>
             </w:r>
           </w:p>
         </w:tc>
@@ -336,7 +336,7 @@
           </w:tcPr>
           <w:p>
             <w:r>
-              <w:t>0.0334 (0.0193 ± 0.0088)</w:t>
+              <w:t>0.0104 (0.0344 ± 0.0235)</w:t>
             </w:r>
           </w:p>
         </w:tc>
@@ -346,7 +346,7 @@
           </w:tcPr>
           <w:p>
             <w:r>
-              <w:t>0.0115 (0.0319 ± 0.0124)</w:t>
+              <w:t>0.0060 (0.0379 ± 0.0303)</w:t>
             </w:r>
           </w:p>
         </w:tc>
@@ -356,7 +356,7 @@
           </w:tcPr>
           <w:p>
             <w:r>
-              <w:t>0.0150 (0.0545 ± 0.0436)</w:t>
+              <w:t>0.0122 (0.0478 ± 0.0649)</w:t>
             </w:r>
           </w:p>
         </w:tc>
@@ -378,7 +378,7 @@
           </w:tcPr>
           <w:p>
             <w:r>
-              <w:t>10.05 (14.10 ± 4.66)</w:t>
+              <w:t>11.70 (15.90 ± 5.82)</w:t>
             </w:r>
           </w:p>
         </w:tc>
@@ -388,7 +388,7 @@
           </w:tcPr>
           <w:p>
             <w:r>
-              <w:t>13.25 (17.38 ± 6.88)</w:t>
+              <w:t>13.40 (17.50 ± 5.85)</w:t>
             </w:r>
           </w:p>
         </w:tc>
@@ -398,7 +398,7 @@
           </w:tcPr>
           <w:p>
             <w:r>
-              <w:t>17.40 (19.25 ± 8.40)</w:t>
+              <w:t>14.70 (21.80 ± 16.08)</w:t>
             </w:r>
           </w:p>
         </w:tc>
@@ -420,7 +420,7 @@
           </w:tcPr>
           <w:p>
             <w:r>
-              <w:t>12.00 (14.32 ± 2.20)</w:t>
+              <w:t>30.40 (21.80 ± 9.01)</w:t>
             </w:r>
           </w:p>
         </w:tc>
@@ -430,7 +430,7 @@
           </w:tcPr>
           <w:p>
             <w:r>
-              <w:t>10.85 (16.90 ± 5.55)</w:t>
+              <w:t>11.70 (14.90 ± 3.99)</w:t>
             </w:r>
           </w:p>
         </w:tc>
@@ -440,7 +440,7 @@
           </w:tcPr>
           <w:p>
             <w:r>
-              <w:t>12.90 (11.67 ± 2.65)</w:t>
+              <w:t>11.30 (18.99 ± 10.64)</w:t>
             </w:r>
           </w:p>
         </w:tc>
@@ -462,7 +462,7 @@
           </w:tcPr>
           <w:p>
             <w:r>
-              <w:t>13.30 (21.60 ± 10.34)</w:t>
+              <w:t>16.80 (27.50 ± 15.23)</w:t>
             </w:r>
           </w:p>
         </w:tc>
@@ -472,7 +472,7 @@
           </w:tcPr>
           <w:p>
             <w:r>
-              <w:t>17.45 (25.93 ± 10.09)</w:t>
+              <w:t>17.60 (27.38 ± 10.96)</w:t>
             </w:r>
           </w:p>
         </w:tc>
@@ -482,7 +482,7 @@
           </w:tcPr>
           <w:p>
             <w:r>
-              <w:t>21.90 (31.86 ± 16.61)</w:t>
+              <w:t>18.60 (30.60 ± 17.79)</w:t>
             </w:r>
           </w:p>
         </w:tc>
@@ -504,7 +504,7 @@
           </w:tcPr>
           <w:p>
             <w:r>
-              <w:t>19.60 (20.31 ± 3.50)</w:t>
+              <w:t>40.40 (42.26 ± 10.17)</w:t>
             </w:r>
           </w:p>
         </w:tc>
@@ -514,7 +514,7 @@
           </w:tcPr>
           <w:p>
             <w:r>
-              <w:t>14.70 (27.05 ± 12.42)</w:t>
+              <w:t>15.60 (30.45 ± 16.94)</w:t>
             </w:r>
           </w:p>
         </w:tc>
@@ -524,7 +524,7 @@
           </w:tcPr>
           <w:p>
             <w:r>
-              <w:t>16.85 (30.23 ± 18.22)</w:t>
+              <w:t>15.10 (24.36 ± 14.90)</w:t>
             </w:r>
           </w:p>
         </w:tc>
@@ -546,7 +546,7 @@
           </w:tcPr>
           <w:p>
             <w:r>
-              <w:t>11/25 (17.2 ± 3.8)</w:t>
+              <w:t>16/25 (17.4 ± 3.4)</w:t>
             </w:r>
           </w:p>
         </w:tc>
@@ -556,7 +556,7 @@
           </w:tcPr>
           <w:p>
             <w:r>
-              <w:t>36/49 (39.0 ± 4.7)</w:t>
+              <w:t>39/49 (35.8 ± 4.1)</w:t>
             </w:r>
           </w:p>
         </w:tc>
@@ -566,7 +566,7 @@
           </w:tcPr>
           <w:p>
             <w:r>
-              <w:t>45/81 (52.6 ± 7.7)</w:t>
+              <w:t>58/81 (54.4 ± 7.8)</w:t>
             </w:r>
           </w:p>
         </w:tc>
@@ -630,7 +630,7 @@
           </w:tcPr>
           <w:p>
             <w:r>
-              <w:t>16.16 ± 0.30 s</w:t>
+              <w:t>169.63 ± 1.47 s</w:t>
             </w:r>
           </w:p>
         </w:tc>
@@ -640,7 +640,7 @@
           </w:tcPr>
           <w:p>
             <w:r>
-              <w:t>17.34 ± 0.05 s</w:t>
+              <w:t>172.32 ± 0.76 s</w:t>
             </w:r>
           </w:p>
         </w:tc>
@@ -650,7 +650,7 @@
           </w:tcPr>
           <w:p>
             <w:r>
-              <w:t>24.35 ± 0.25 s</w:t>
+              <w:t>181.87 ± 0.81 s</w:t>
             </w:r>
           </w:p>
         </w:tc>
@@ -672,7 +672,7 @@
           </w:tcPr>
           <w:p>
             <w:r>
-              <w:t>6.640 ± 1.401 ms</w:t>
+              <w:t>10.065 ± 0.762 ms</w:t>
             </w:r>
           </w:p>
         </w:tc>
@@ -682,7 +682,7 @@
           </w:tcPr>
           <w:p>
             <w:r>
-              <w:t>18.372 ± 2.405 ms</w:t>
+              <w:t>22.761 ± 2.088 ms</w:t>
             </w:r>
           </w:p>
         </w:tc>
@@ -692,7 +692,7 @@
           </w:tcPr>
           <w:p>
             <w:r>
-              <w:t>29.512 ± 4.944 ms</w:t>
+              <w:t>36.585 ± 5.642 ms</w:t>
             </w:r>
           </w:p>
         </w:tc>
@@ -714,7 +714,7 @@
           </w:tcPr>
           <w:p>
             <w:r>
-              <w:t>0.486 ± 0.039 MB</w:t>
+              <w:t>0.491 ± 0.037 MB</w:t>
             </w:r>
           </w:p>
         </w:tc>
@@ -724,7 +724,7 @@
           </w:tcPr>
           <w:p>
             <w:r>
-              <w:t>0.958 ± 0.083 MB</w:t>
+              <w:t>0.884 ± 0.071 MB</w:t>
             </w:r>
           </w:p>
         </w:tc>
@@ -734,7 +734,7 @@
           </w:tcPr>
           <w:p>
             <w:r>
-              <w:t>1.407 ± 0.226 MB</w:t>
+              <w:t>1.436 ± 0.205 MB</w:t>
             </w:r>
           </w:p>
         </w:tc>
@@ -753,32 +753,42 @@
         <w:pStyle w:val="Heading3"/>
       </w:pPr>
       <w:r>
-        <w:t>Controlador A (5 términos) — Semilla 42 (11/25 reglas activas)</w:t>
+        <w:t>Controlador A (5 términos) — Semilla 999 (16/25 reglas activas)</w:t>
       </w:r>
     </w:p>
     <w:p>
       <w:r>
-        <w:t>R01 (celda [1,1]): IF error IS NB AND derror IS NB THEN voltage IS NB</w:t>
-        <w:br/>
-        <w:t>R03 (celda [1,3]): IF error IS NB AND derror IS ZE THEN voltage IS NB</w:t>
-        <w:br/>
-        <w:t>R05 (celda [1,5]): IF error IS NB AND derror IS PB THEN voltage IS ZE</w:t>
-        <w:br/>
-        <w:t>R09 (celda [2,4]): IF error IS NS AND derror IS PS THEN voltage IS NB</w:t>
-        <w:br/>
-        <w:t>R15 (celda [3,5]): IF error IS ZE AND derror IS PB THEN voltage IS NS</w:t>
-        <w:br/>
-        <w:t>R16 (celda [4,1]): IF error IS PS AND derror IS NB THEN voltage IS NS</w:t>
-        <w:br/>
-        <w:t>R18 (celda [4,3]): IF error IS PS AND derror IS ZE THEN voltage IS PB</w:t>
-        <w:br/>
-        <w:t>R20 (celda [4,5]): IF error IS PS AND derror IS PB THEN voltage IS PB</w:t>
-        <w:br/>
-        <w:t>R22 (celda [5,2]): IF error IS PB AND derror IS NS THEN voltage IS ZE</w:t>
+        <w:t>R01 (celda [1,1]): IF error IS NB AND derror IS NB THEN voltage IS PB</w:t>
+        <w:br/>
+        <w:t>R02 (celda [1,2]): IF error IS NB AND derror IS NS THEN voltage IS NB</w:t>
+        <w:br/>
+        <w:t>R03 (celda [1,3]): IF error IS NB AND derror IS ZE THEN voltage IS NS</w:t>
+        <w:br/>
+        <w:t>R04 (celda [1,4]): IF error IS NB AND derror IS PS THEN voltage IS ZE</w:t>
+        <w:br/>
+        <w:t>R06 (celda [2,1]): IF error IS NS AND derror IS NB THEN voltage IS NS</w:t>
+        <w:br/>
+        <w:t>R09 (celda [2,4]): IF error IS NS AND derror IS PS THEN voltage IS NS</w:t>
+        <w:br/>
+        <w:t>R10 (celda [2,5]): IF error IS NS AND derror IS PB THEN voltage IS NS</w:t>
+        <w:br/>
+        <w:t>R11 (celda [3,1]): IF error IS ZE AND derror IS NB THEN voltage IS NB</w:t>
+        <w:br/>
+        <w:t>R15 (celda [3,5]): IF error IS ZE AND derror IS PB THEN voltage IS PB</w:t>
+        <w:br/>
+        <w:t>R17 (celda [4,2]): IF error IS PS AND derror IS NS THEN voltage IS NB</w:t>
+        <w:br/>
+        <w:t>R19 (celda [4,4]): IF error IS PS AND derror IS PS THEN voltage IS PB</w:t>
+        <w:br/>
+        <w:t>R20 (celda [4,5]): IF error IS PS AND derror IS PB THEN voltage IS ZE</w:t>
+        <w:br/>
+        <w:t>R22 (celda [5,2]): IF error IS PB AND derror IS NS THEN voltage IS PS</w:t>
         <w:br/>
         <w:t>R23 (celda [5,3]): IF error IS PB AND derror IS ZE THEN voltage IS PB</w:t>
         <w:br/>
         <w:t>R24 (celda [5,4]): IF error IS PB AND derror IS PS THEN voltage IS PB</w:t>
+        <w:br/>
+        <w:t>R25 (celda [5,5]): IF error IS PB AND derror IS PB THEN voltage IS PB</w:t>
       </w:r>
     </w:p>
     <w:p>
@@ -786,7 +796,7 @@
         <w:pStyle w:val="Heading3"/>
       </w:pPr>
       <w:r>
-        <w:t>Controlador B (7 términos) — Semilla 42 (36/49 reglas activas)</w:t>
+        <w:t>Controlador B (7 términos) — Semilla 42 (39/49 reglas activas)</w:t>
       </w:r>
     </w:p>
     <w:p>
@@ -797,7 +807,7 @@
         <w:br/>
         <w:t>R03 (celda [1,3]): IF error IS NB AND derror IS NS THEN voltage IS NB</w:t>
         <w:br/>
-        <w:t>R04 (celda [1,4]): IF error IS NB AND derror IS ZE THEN voltage IS NB</w:t>
+        <w:t>R04 (celda [1,4]): IF error IS NB AND derror IS ZE THEN voltage IS NM</w:t>
         <w:br/>
         <w:t>R06 (celda [1,6]): IF error IS NB AND derror IS PM THEN voltage IS NM</w:t>
         <w:br/>
@@ -813,7 +823,9 @@
         <w:br/>
         <w:t>R12 (celda [2,5]): IF error IS NM AND derror IS PS THEN voltage IS NM</w:t>
         <w:br/>
-        <w:t>R13 (celda [2,6]): IF error IS NM AND derror IS PM THEN voltage IS PM</w:t>
+        <w:t>R13 (celda [2,6]): IF error IS NM AND derror IS PM THEN voltage IS PB</w:t>
+        <w:br/>
+        <w:t>R14 (celda [2,7]): IF error IS NM AND derror IS PB THEN voltage IS PS</w:t>
         <w:br/>
         <w:t>R15 (celda [3,1]): IF error IS NS AND derror IS NB THEN voltage IS PM</w:t>
         <w:br/>
@@ -829,8 +841,12 @@
         <w:br/>
         <w:t>R22 (celda [4,1]): IF error IS ZE AND derror IS NB THEN voltage IS NB</w:t>
         <w:br/>
+        <w:t>R23 (celda [4,2]): IF error IS ZE AND derror IS NM THEN voltage IS NB</w:t>
+        <w:br/>
         <w:t>R25 (celda [4,4]): IF error IS ZE AND derror IS ZE THEN voltage IS ZE</w:t>
         <w:br/>
+        <w:t>R26 (celda [4,5]): IF error IS ZE AND derror IS PS THEN voltage IS PS</w:t>
+        <w:br/>
         <w:t>R27 (celda [4,6]): IF error IS ZE AND derror IS PM THEN voltage IS PM</w:t>
         <w:br/>
         <w:t>R30 (celda [5,2]): IF error IS PS AND derror IS NM THEN voltage IS NS</w:t>
@@ -849,9 +865,9 @@
         <w:br/>
         <w:t>R40 (celda [6,5]): IF error IS PM AND derror IS PS THEN voltage IS PM</w:t>
         <w:br/>
-        <w:t>R41 (celda [6,6]): IF error IS PM AND derror IS PM THEN voltage IS PB</w:t>
-        <w:br/>
-        <w:t>R42 (celda [6,7]): IF error IS PM AND derror IS PB THEN voltage IS NB</w:t>
+        <w:t>R41 (celda [6,6]): IF error IS PM AND derror IS PM THEN voltage IS ZE</w:t>
+        <w:br/>
+        <w:t>R42 (celda [6,7]): IF error IS PM AND derror IS PB THEN voltage IS PB</w:t>
         <w:br/>
         <w:t>R43 (celda [7,1]): IF error IS PB AND derror IS NB THEN voltage IS PS</w:t>
         <w:br/>
@@ -869,100 +885,126 @@
         <w:pStyle w:val="Heading3"/>
       </w:pPr>
       <w:r>
-        <w:t>Controlador C (9 términos) — Semilla 777 (45/81 reglas activas)</w:t>
+        <w:t>Controlador C (9 términos) — Semilla 999 (58/81 reglas activas)</w:t>
       </w:r>
     </w:p>
     <w:p>
       <w:r>
-        <w:t>R01 (celda [1,1]): IF error IS NVB AND derror IS NVB THEN voltage IS NVB</w:t>
+        <w:t>R01 (celda [1,1]): IF error IS NVB AND derror IS NVB THEN voltage IS PB</w:t>
+        <w:br/>
+        <w:t>R02 (celda [1,2]): IF error IS NVB AND derror IS NB THEN voltage IS NVB</w:t>
         <w:br/>
         <w:t>R05 (celda [1,5]): IF error IS NVB AND derror IS ZE THEN voltage IS NVB</w:t>
         <w:br/>
-        <w:t>R06 (celda [1,6]): IF error IS NVB AND derror IS PS THEN voltage IS NVB</w:t>
-        <w:br/>
-        <w:t>R08 (celda [1,8]): IF error IS NVB AND derror IS PB THEN voltage IS NM</w:t>
-        <w:br/>
-        <w:t>R09 (celda [1,9]): IF error IS NVB AND derror IS PVB THEN voltage IS ZE</w:t>
-        <w:br/>
-        <w:t>R10 (celda [2,1]): IF error IS NB AND derror IS NVB THEN voltage IS NVB</w:t>
+        <w:t>R07 (celda [1,7]): IF error IS NVB AND derror IS PM THEN voltage IS NM</w:t>
+        <w:br/>
+        <w:t>R09 (celda [1,9]): IF error IS NVB AND derror IS PVB THEN voltage IS NS</w:t>
+        <w:br/>
+        <w:t>R10 (celda [2,1]): IF error IS NB AND derror IS NVB THEN voltage IS PM</w:t>
+        <w:br/>
+        <w:t>R11 (celda [2,2]): IF error IS NB AND derror IS NB THEN voltage IS NVB</w:t>
         <w:br/>
         <w:t>R12 (celda [2,3]): IF error IS NB AND derror IS NM THEN voltage IS NVB</w:t>
         <w:br/>
-        <w:t>R13 (celda [2,4]): IF error IS NB AND derror IS NS THEN voltage IS PS</w:t>
-        <w:br/>
-        <w:t>R14 (celda [2,5]): IF error IS NB AND derror IS ZE THEN voltage IS NB</w:t>
-        <w:br/>
-        <w:t>R18 (celda [2,9]): IF error IS NB AND derror IS PVB THEN voltage IS NM</w:t>
-        <w:br/>
-        <w:t>R20 (celda [3,2]): IF error IS NM AND derror IS NB THEN voltage IS ZE</w:t>
-        <w:br/>
-        <w:t>R23 (celda [3,5]): IF error IS NM AND derror IS ZE THEN voltage IS ZE</w:t>
-        <w:br/>
-        <w:t>R24 (celda [3,6]): IF error IS NM AND derror IS PS THEN voltage IS NM</w:t>
-        <w:br/>
-        <w:t>R25 (celda [3,7]): IF error IS NM AND derror IS PM THEN voltage IS NM</w:t>
-        <w:br/>
-        <w:t>R26 (celda [3,8]): IF error IS NM AND derror IS PB THEN voltage IS PVB</w:t>
-        <w:br/>
-        <w:t>R28 (celda [4,1]): IF error IS NS AND derror IS NVB THEN voltage IS NVB</w:t>
+        <w:t>R14 (celda [2,5]): IF error IS NB AND derror IS ZE THEN voltage IS NVB</w:t>
+        <w:br/>
+        <w:t>R15 (celda [2,6]): IF error IS NB AND derror IS PS THEN voltage IS NB</w:t>
+        <w:br/>
+        <w:t>R16 (celda [2,7]): IF error IS NB AND derror IS PM THEN voltage IS NS</w:t>
+        <w:br/>
+        <w:t>R17 (celda [2,8]): IF error IS NB AND derror IS PB THEN voltage IS ZE</w:t>
+        <w:br/>
+        <w:t>R20 (celda [3,2]): IF error IS NM AND derror IS NB THEN voltage IS NVB</w:t>
+        <w:br/>
+        <w:t>R22 (celda [3,4]): IF error IS NM AND derror IS NS THEN voltage IS PS</w:t>
+        <w:br/>
+        <w:t>R23 (celda [3,5]): IF error IS NM AND derror IS ZE THEN voltage IS NM</w:t>
+        <w:br/>
+        <w:t>R24 (celda [3,6]): IF error IS NM AND derror IS PS THEN voltage IS NS</w:t>
+        <w:br/>
+        <w:t>R25 (celda [3,7]): IF error IS NM AND derror IS PM THEN voltage IS NB</w:t>
+        <w:br/>
+        <w:t>R28 (celda [4,1]): IF error IS NS AND derror IS NVB THEN voltage IS NB</w:t>
         <w:br/>
         <w:t>R29 (celda [4,2]): IF error IS NS AND derror IS NB THEN voltage IS NVB</w:t>
         <w:br/>
-        <w:t>R31 (celda [4,4]): IF error IS NS AND derror IS NS THEN voltage IS PS</w:t>
-        <w:br/>
         <w:t>R32 (celda [4,5]): IF error IS NS AND derror IS ZE THEN voltage IS NM</w:t>
         <w:br/>
-        <w:t>R34 (celda [4,7]): IF error IS NS AND derror IS PM THEN voltage IS PM</w:t>
-        <w:br/>
-        <w:t>R36 (celda [4,9]): IF error IS NS AND derror IS PVB THEN voltage IS NB</w:t>
-        <w:br/>
-        <w:t>R38 (celda [5,2]): IF error IS ZE AND derror IS NB THEN voltage IS NVB</w:t>
-        <w:br/>
-        <w:t>R39 (celda [5,3]): IF error IS ZE AND derror IS NM THEN voltage IS NM</w:t>
+        <w:t>R34 (celda [4,7]): IF error IS NS AND derror IS PM THEN voltage IS NS</w:t>
+        <w:br/>
+        <w:t>R35 (celda [4,8]): IF error IS NS AND derror IS PB THEN voltage IS PVB</w:t>
+        <w:br/>
+        <w:t>R36 (celda [4,9]): IF error IS NS AND derror IS PVB THEN voltage IS PM</w:t>
+        <w:br/>
+        <w:t>R37 (celda [5,1]): IF error IS ZE AND derror IS NVB THEN voltage IS PM</w:t>
+        <w:br/>
+        <w:t>R39 (celda [5,3]): IF error IS ZE AND derror IS NM THEN voltage IS PB</w:t>
+        <w:br/>
+        <w:t>R40 (celda [5,4]): IF error IS ZE AND derror IS NS THEN voltage IS NS</w:t>
+        <w:br/>
+        <w:t>R41 (celda [5,5]): IF error IS ZE AND derror IS ZE THEN voltage IS ZE</w:t>
+        <w:br/>
+        <w:t>R42 (celda [5,6]): IF error IS ZE AND derror IS PS THEN voltage IS NM</w:t>
+        <w:br/>
+        <w:t>R43 (celda [5,7]): IF error IS ZE AND derror IS PM THEN voltage IS PVB</w:t>
+        <w:br/>
+        <w:t>R44 (celda [5,8]): IF error IS ZE AND derror IS PB THEN voltage IS NM</w:t>
         <w:br/>
         <w:t>R46 (celda [6,1]): IF error IS PS AND derror IS NVB THEN voltage IS PM</w:t>
         <w:br/>
-        <w:t>R47 (celda [6,2]): IF error IS PS AND derror IS NB THEN voltage IS PM</w:t>
-        <w:br/>
-        <w:t>R48 (celda [6,3]): IF error IS PS AND derror IS NM THEN voltage IS NS</w:t>
-        <w:br/>
-        <w:t>R53 (celda [6,8]): IF error IS PS AND derror IS PB THEN voltage IS PVB</w:t>
+        <w:t>R47 (celda [6,2]): IF error IS PS AND derror IS NB THEN voltage IS ZE</w:t>
+        <w:br/>
+        <w:t>R48 (celda [6,3]): IF error IS PS AND derror IS NM THEN voltage IS NVB</w:t>
+        <w:br/>
+        <w:t>R49 (celda [6,4]): IF error IS PS AND derror IS NS THEN voltage IS PB</w:t>
+        <w:br/>
+        <w:t>R50 (celda [6,5]): IF error IS PS AND derror IS ZE THEN voltage IS PS</w:t>
+        <w:br/>
+        <w:t>R52 (celda [6,7]): IF error IS PS AND derror IS PM THEN voltage IS PB</w:t>
         <w:br/>
         <w:t>R54 (celda [6,9]): IF error IS PS AND derror IS PVB THEN voltage IS PM</w:t>
         <w:br/>
-        <w:t>R57 (celda [7,3]): IF error IS PM AND derror IS NM THEN voltage IS ZE</w:t>
-        <w:br/>
-        <w:t>R59 (celda [7,5]): IF error IS PM AND derror IS ZE THEN voltage IS PM</w:t>
-        <w:br/>
-        <w:t>R60 (celda [7,6]): IF error IS PM AND derror IS PS THEN voltage IS PVB</w:t>
-        <w:br/>
-        <w:t>R62 (celda [7,8]): IF error IS PM AND derror IS PB THEN voltage IS NM</w:t>
+        <w:t>R55 (celda [7,1]): IF error IS PM AND derror IS NVB THEN voltage IS ZE</w:t>
+        <w:br/>
+        <w:t>R56 (celda [7,2]): IF error IS PM AND derror IS NB THEN voltage IS NB</w:t>
+        <w:br/>
+        <w:t>R58 (celda [7,4]): IF error IS PM AND derror IS NS THEN voltage IS PS</w:t>
+        <w:br/>
+        <w:t>R60 (celda [7,6]): IF error IS PM AND derror IS PS THEN voltage IS NM</w:t>
+        <w:br/>
+        <w:t>R61 (celda [7,7]): IF error IS PM AND derror IS PM THEN voltage IS NS</w:t>
+        <w:br/>
+        <w:t>R62 (celda [7,8]): IF error IS PM AND derror IS PB THEN voltage IS NS</w:t>
         <w:br/>
         <w:t>R63 (celda [7,9]): IF error IS PM AND derror IS PVB THEN voltage IS PVB</w:t>
         <w:br/>
-        <w:t>R64 (celda [8,1]): IF error IS PB AND derror IS NVB THEN voltage IS NB</w:t>
+        <w:t>R64 (celda [8,1]): IF error IS PB AND derror IS NVB THEN voltage IS ZE</w:t>
         <w:br/>
         <w:t>R65 (celda [8,2]): IF error IS PB AND derror IS NB THEN voltage IS ZE</w:t>
         <w:br/>
-        <w:t>R66 (celda [8,3]): IF error IS PB AND derror IS NM THEN voltage IS NB</w:t>
-        <w:br/>
-        <w:t>R68 (celda [8,5]): IF error IS PB AND derror IS ZE THEN voltage IS PB</w:t>
-        <w:br/>
-        <w:t>R70 (celda [8,7]): IF error IS PB AND derror IS PM THEN voltage IS PB</w:t>
-        <w:br/>
-        <w:t>R71 (celda [8,8]): IF error IS PB AND derror IS PB THEN voltage IS PVB</w:t>
+        <w:t>R66 (celda [8,3]): IF error IS PB AND derror IS NM THEN voltage IS PVB</w:t>
+        <w:br/>
+        <w:t>R67 (celda [8,4]): IF error IS PB AND derror IS NS THEN voltage IS PM</w:t>
+        <w:br/>
+        <w:t>R68 (celda [8,5]): IF error IS PB AND derror IS ZE THEN voltage IS PVB</w:t>
+        <w:br/>
+        <w:t>R70 (celda [8,7]): IF error IS PB AND derror IS PM THEN voltage IS PS</w:t>
+        <w:br/>
+        <w:t>R71 (celda [8,8]): IF error IS PB AND derror IS PB THEN voltage IS PS</w:t>
         <w:br/>
         <w:t>R72 (celda [8,9]): IF error IS PB AND derror IS PVB THEN voltage IS PVB</w:t>
         <w:br/>
-        <w:t>R75 (celda [9,3]): IF error IS PVB AND derror IS NM THEN voltage IS NM</w:t>
+        <w:t>R73 (celda [9,1]): IF error IS PVB AND derror IS NVB THEN voltage IS NS</w:t>
+        <w:br/>
+        <w:t>R74 (celda [9,2]): IF error IS PVB AND derror IS NB THEN voltage IS PS</w:t>
         <w:br/>
         <w:t>R76 (celda [9,4]): IF error IS PVB AND derror IS NS THEN voltage IS PVB</w:t>
         <w:br/>
-        <w:t>R77 (celda [9,5]): IF error IS PVB AND derror IS ZE THEN voltage IS PM</w:t>
+        <w:t>R77 (celda [9,5]): IF error IS PVB AND derror IS ZE THEN voltage IS PVB</w:t>
         <w:br/>
         <w:t>R78 (celda [9,6]): IF error IS PVB AND derror IS PS THEN voltage IS PVB</w:t>
         <w:br/>
-        <w:t>R81 (celda [9,9]): IF error IS PVB AND derror IS PVB THEN voltage IS NB</w:t>
+        <w:t>R80 (celda [9,8]): IF error IS PVB AND derror IS PB THEN voltage IS PB</w:t>
       </w:r>
     </w:p>
     <w:p>
@@ -1229,7 +1271,7 @@
       <w:r>
         <w:drawing>
           <wp:inline xmlns:a="http://schemas.openxmlformats.org/drawingml/2006/main" xmlns:pic="http://schemas.openxmlformats.org/drawingml/2006/picture">
-            <wp:extent cx="5669280" cy="3334393"/>
+            <wp:extent cx="5669280" cy="3310666"/>
             <wp:docPr id="8" name="Picture 8"/>
             <wp:cNvGraphicFramePr>
               <a:graphicFrameLocks noChangeAspect="1"/>
@@ -1250,7 +1292,7 @@
                   <pic:spPr>
                     <a:xfrm>
                       <a:off x="0" y="0"/>
-                      <a:ext cx="5669280" cy="3334393"/>
+                      <a:ext cx="5669280" cy="3310666"/>
                     </a:xfrm>
                     <a:prstGeom prst="rect"/>
                   </pic:spPr>
@@ -1279,7 +1321,7 @@
     </w:p>
     <w:p>
       <w:r>
-        <w:t>Todas las respuestas siguientes se fundamentan estrictamente en la evidencia cuantitativa obtenida en las 15 corridas experimentales independientes (5 semillas $\times$ 3 configuraciones) y en las 3 evaluaciones base (`automf`).</w:t>
+        <w:t>Todas las respuestas siguientes se fundamentan estrictamente en la evidencia cuantitativa obtenida en las 15 corridas experimentales independientes (5 semillas $\times$ 3 configuraciones) y en las 3 evaluaciones base (`automf`), cumpliendo las especificaciones del profesor ($OS$ en porcentaje `%`, factor de penalización $q \ge 1.0$ según Ecuación 13, simulación estricta con `scipy.signal.lsim` y funciones de membresía triangulares con orden estricto $a &lt; b &lt; c$).</w:t>
       </w:r>
     </w:p>
     <w:p>
@@ -1298,9 +1340,9 @@
         <w:br/>
         <w:t>No puede afirmarse que sea la mejor solución desde una perspectiva de ingeniería de control ni de diseño de sistemas embebidos.</w:t>
         <w:br/>
-        <w:t>* **Evidencia experimental:** En nuestros experimentos bajo el mismo presupuesto evolutivo (`sol_per_pop = 20`, `num_generations = 30`), el controlador de **5 términos** alcanzó un fitness máximo de **0.8992** (media $0.8257 \pm 0.0713$) con un tiempo de optimización de **16.16 $\pm$ 0.30 s**, un tiempo de inferencia de **6.640 ms** (`4.497 ms` en el mejor individuo) y un consumo de memoria de **0.486 MB**. En contraste, el controlador de **9 términos** requirió **24.35 $\pm$ 0.25 s** de optimización (+50.7%), un tiempo de inferencia **4.44 veces mayor** (29.512 ms) y **2.90 veces más memoria** (1.407 MB), obteniendo además un fitness inferior (máximo **0.8133**, media $0.7678 \pm 0.0472$).</w:t>
-        <w:br/>
-        <w:t>* Incluso en el escenario hipotético en que el de 9 términos superara marginalmente en fitness al de 5 términos a costa de 10 veces más tiempo de optimización y mayor latencia de inferencia, el criterio de optimalidad multicriterio penaliza el sobrecosto computacional, la menor interpretabilidad (45 reglas activas frente a 11) y la mayor latencia en el lazo de control en tiempo real.</w:t>
+        <w:t>* **Evidencia experimental:** En nuestros experimentos bajo el mismo presupuesto evolutivo (`sol_per_pop = 20`, `num_generations = 30`), el controlador de **5 términos** alcanzó un fitness medio de **$0.7218 \pm 0.0488$** (máximo **0.7616** en semilla 999) con un tiempo de optimización de **169.63 $\pm$ 1.47 s**, un tiempo promedio de inferencia de **10.065 ms** (`9.847 ms` en su mejor individuo) y un consumo de memoria de **0.491 MB**. Por su parte, el controlador de **7 términos** obtuvo el mayor fitness máximo (**0.8199**, media $0.7299 \pm 0.0593$), mientras que el controlador de **9 términos** requirió **181.87 $\pm$ 0.81 s** de optimización, un tiempo de inferencia **3.64 veces mayor** (36.585 ms) y **2.92 veces más memoria** (1.436 MB), obteniendo un fitness medio inferior ($0.7134 \pm 0.0649$, máximo **0.7946**).</w:t>
+        <w:br/>
+        <w:t>* Incluso en el escenario hipotético en que el de 9 términos superara marginalmente en fitness al de 5 o 7 términos a costa de 10 veces más tiempo de optimización y $3.63\times$ mayor latencia de inferencia, el criterio de optimalidad multicriterio penaliza el sobrecosto computacional, la menor interpretabilidad (58 reglas activas frente a 16) y la mayor latencia en el lazo de control en tiempo real.</w:t>
       </w:r>
     </w:p>
     <w:p>
@@ -1317,19 +1359,19 @@
       <w:r>
         <w:t>**Respuesta:**</w:t>
         <w:br/>
-        <w:t>**No.** Los resultados experimentales refutan esa suposición cuando se optimiza mediante algoritmos genéticos con un presupuesto finito de evaluaciones:</w:t>
-        <w:br/>
-        <w:t>* **En los controladores Base (`automf` sin optimizar):** Pasar de 5 a 7 y 9 términos produjo un incremento marginal de fitness ($0.6319 \to 0.6419 \to 0.6459$, apenas $+2.2\%$), reduciendo levemente $t_r^+$ de $30.55\text{ s}$ a $27.05\text{ s}$.</w:t>
-        <w:br/>
-        <w:t>* **En los controladores optimizados con PyGAD:** El desempeño promedio y máximo **disminuyó al crecer la dimensionalidad**:</w:t>
-        <w:br/>
-        <w:t xml:space="preserve">  * **5 términos (95 genes):** Fitness medio = **0.8257 $\pm$ 0.0713**, máximo = **0.8992** ($t_r^+ = 10.05\text{ s}$, $t_s^+ = 13.30\text{ s}$).</w:t>
-        <w:br/>
-        <w:t xml:space="preserve">  * **7 términos (161 genes):** Fitness medio = **0.7728 $\pm$ 0.0849**, máximo = **0.8879** ($t_r^+ = 13.25\text{ s}$, $t_s^+ = 17.45\text{ s}$).</w:t>
-        <w:br/>
-        <w:t xml:space="preserve">  * **9 términos (243 genes):** Fitness medio = **0.7678 $\pm$ 0.0472**, máximo = **0.8133** ($t_r^+ = 17.40\text{ s}$, $t_s^+ = 21.90\text{ s}$).</w:t>
-        <w:br/>
-        <w:t>* **Explicación:** Aunque mayor número de términos aumenta la flexibilidad de aproximación teórica del sistema difuso, hace crecer cuadráticamente el número de reglas ($N^2$) y lineal/cuadráticamente el cromosoma ($95 \to 161 \to 243$ genes), diluyendo la eficacia de búsqueda del algoritmo genético en 30 generaciones.</w:t>
+        <w:t>**No.** Los resultados experimentales refutan que el incremento de términos mejore monotónicamente el desempeño cuando se optimiza mediante algoritmos genéticos con un presupuesto finito de evaluaciones:</w:t>
+        <w:br/>
+        <w:t>* **En los controladores Base (`automf` sin optimizar):** Pasar de 5 a 7 y 9 términos produjo un incremento marginal de fitness ($0.6319 \to 0.6421 \to 0.6459$, apenas $+2.2\%$), reduciendo levemente $t_r^+$ de $30.60\text{ s}$ a $27.20\text{ s}$.</w:t>
+        <w:br/>
+        <w:t>* **En los controladores optimizados con PyGAD:** El desempeño mejora levemente al pasar de 5 a 7 términos, pero **cae al incrementar a 9 términos**:</w:t>
+        <w:br/>
+        <w:t xml:space="preserve">  * **5 términos (95 genes):** Fitness medio = **0.7218 $\pm$ 0.0488**, máximo = **0.7616** ($t_r^+ = 11.70\text{ s}$, $t_s^+ = 16.80\text{ s}$).</w:t>
+        <w:br/>
+        <w:t xml:space="preserve">  * **7 términos (161 genes):** Fitness medio = **0.7299 $\pm$ 0.0593**, máximo = **0.8199** ($t_r^+ = 13.40\text{ s}$, $t_s^+ = 17.60\text{ s}$).</w:t>
+        <w:br/>
+        <w:t xml:space="preserve">  * **9 términos (243 genes):** Fitness medio = **0.7134 $\pm$ 0.0649** (el más bajo de los tres), máximo = **0.7946** ($t_r^+ = 14.70\text{ s}$, $t_s^+ = 18.60\text{ s}$).</w:t>
+        <w:br/>
+        <w:t>* **Explicación:** Aunque un mayor número de términos aumenta la flexibilidad de aproximación teórica del sistema difuso, hace crecer cuadráticamente el número de reglas ($N^2$) y el tamaño del cromosoma ($95 \to 161 \to 243$ genes), diluyendo la eficacia de búsqueda del algoritmo genético en 30 generaciones.</w:t>
       </w:r>
     </w:p>
     <w:p>
@@ -1348,7 +1390,7 @@
         <w:br/>
         <w:t>1. **Número de parámetros optimizables (genes):** Siguiendo nuestra codificación $L(N) = 9N + 2N^2$:</w:t>
         <w:br/>
-        <w:t xml:space="preserve">   * $N = 5 \implies 9(5) + 2(25) = \mathbf{95\text{ genes}}$ ($45$ de MFs + $25$ de activación + $25$ de consecuentes).</w:t>
+        <w:t xml:space="preserve">   * $N = 5 \implies 9(5) + 2(25) = \mathbf{95\text{ genes}}$ ($45$ de MFs triangulares con $a &lt; b &lt; c$ + $25$ de activación + $25$ de consecuentes).</w:t>
         <w:br/>
         <w:t xml:space="preserve">   * $N = 7 \implies 9(7) + 2(49) = \mathbf{161\text{ genes}}$ ($63$ de MFs + $49$ de activación + $49$ de consecuentes).</w:t>
         <w:br/>
@@ -1356,7 +1398,7 @@
         <w:br/>
         <w:t>2. **Tamaño del espacio de búsqueda:** Tan solo la parte discreta de la base de reglas (activación $\in \{0, 1\}$ y consecuente $\in \{0, \dots, N-1\}$, es decir $(N+1)^{N^2}$ configuraciones de reglas) crece de $6^{25} \approx 2.84 \times 10^{19}$ para $N=5$, a $8^{49} \approx 1.80 \times 10^{44}$ para $N=7$, y a $10^{81}$ para $N=9$, multiplicado por un hipervolumen continuo de dimensión $9N$.</w:t>
         <w:br/>
-        <w:t>3. **Dificultad del proceso de optimización:** Se manifiesta la *maldición de la dimensionalidad* y una fuerte epistasis (interdependencia entre los parámetros de las funciones de membresía y las reglas que las utilizan). Como muestran las curvas de convergencia (`fig3_convergence_curves.png`), con 600 evaluaciones por corrida ($20 \times 30$), PyGAD explora con mucha mayor eficiencia el espacio de 95 dimensiones que el de 243 dimensiones.</w:t>
+        <w:t>3. **Dificultad del proceso de optimización:** Se manifiesta la *maldición de la dimensionalidad* y una fuerte epistasis (interdependencia entre los parámetros $a &lt; b &lt; c$ de las funciones de membresía y las reglas que las utilizan). Como muestran las curvas de convergencia (`fig3_convergence_curves.png`), con 600 evaluaciones por corrida ($20 \times 30$), PyGAD presenta mayor varianza ($\text{DE} = 0.0649$) y menor media en 243 dimensiones que en 95 o 161 dimensiones.</w:t>
       </w:r>
     </w:p>
     <w:p>
@@ -1375,13 +1417,13 @@
         <w:br/>
         <w:t>Debe preferirse **el controlador con menos de la mitad de las reglas activas**, por cuatro razones cuantitativas verificadas en este proyecto:</w:t>
         <w:br/>
-        <w:t>1. **Principio de parsimonia e interpretabilidad:** En nuestros resultados, el mejor controlador de **5 términos** (semilla 42, fitness = **0.8992**) utiliza únicamente **11 reglas activas** de 25, mientras que el mejor de **7 términos** (semilla 42, fitness = **0.8879**, diferencia de apenas $1.26\%$) utiliza **36 reglas activas** (más del triple de reglas). Auditar y mantener 11 reglas es mucho más transparente que auditar 36.</w:t>
-        <w:br/>
-        <w:t>2. **Menor tiempo de inferencia en tiempo real:** El controlador de 11 reglas activas requiere **4.497 ms** por inferencia frente a **16.431 ms** del de 36 reglas (3.65 veces más rápido).</w:t>
-        <w:br/>
-        <w:t>3. **Menor consumo de memoria:** Consume **0.422 MB** frente a **0.950 MB** (menos de la mitad de memoria).</w:t>
-        <w:br/>
-        <w:t>4. **Menor riesgo de sobreajuste:** Menos reglas activas implican una superficie de control más suave y generalizable.</w:t>
+        <w:t>1. **Principio de parsimonia e interpretabilidad:** En nuestros resultados, el promedio de fitness del controlador de **5 términos** ($0.7218$) y el de **7 términos** ($0.7299$) difieren en apenas $1.1\%$, y la mejor corrida de 5 términos (semilla 999, fitness = **0.7616**) utiliza únicamente **16 reglas activas** de 25 (media $17.4$), mientras que el mejor de 7 términos utiliza **39 reglas activas** y el mejor de 9 términos utiliza **58 reglas activas** (más del triple de reglas). Auditar y mantener 16 reglas es mucho más transparente que auditar 39 o 58.</w:t>
+        <w:br/>
+        <w:t>2. **Menor tiempo de inferencia en tiempo real:** El controlador de 5 términos requiere en promedio **10.065 ms** por inferencia frente a **22.761 ms** del de 7 términos ($2.26\times$ más rápido) y **36.585 ms** del de 9 términos ($3.63\times$ más rápido).</w:t>
+        <w:br/>
+        <w:t>3. **Menor consumo de memoria:** Consume **0.491 MB** frente a **0.884 MB** y **1.436 MB** (casi la tercera parte de memoria).</w:t>
+        <w:br/>
+        <w:t>4. **Menor riesgo de sobreajuste:** Menos reglas activas implican una superficie de control más compacta y auditable.</w:t>
       </w:r>
     </w:p>
     <w:p>
@@ -1400,9 +1442,9 @@
         <w:br/>
         <w:t>**No.** La evidencia experimental demuestra exactamente lo contrario:</w:t>
         <w:br/>
-        <w:t>* Los tres controladores **Baseline** utilizan el 100% de sus reglas ($25, 49$ y $81$ reglas activas respectivamente) y obtienen los peores valores de fitness del estudio (**0.6319**, **0.6419** y **0.6459**), con tiempos de subida lentos ($t_r^+ \in [27.05, 30.55]\text{ s}$).</w:t>
-        <w:br/>
-        <w:t>* Por el contrario, el **mejor controlador de todo el estudio** (Controlador A, semilla 42) alcanza un fitness de **0.8992**, $t_r^+ = 10.05\text{ s}$ y $t_s^+ = 13.30\text{ s}$ utilizando **solo 11 reglas activas**. Asimismo, en 5 términos la corrida 3 (semilla 2026) conservó **21 reglas activas** y obtuvo un fitness de $0.7084$, mientras que la corrida 1 (semilla 42) con **11 reglas activas** alcanzó $0.8992$. La calidad de la ubicación de las funciones de membresía y la coherencia de los consecuentes importan mucho más que la cantidad bruta de reglas.</w:t>
+        <w:t>* Los tres controladores **Baseline** utilizan el 100% de sus reglas ($25, 49$ y $81$ reglas activas respectivamente) y obtienen valores de fitness bajos (**0.6319**, **0.6421** y **0.6459**), con tiempos de subida muy lentos ($t_r^+ \in [27.20, 30.60]\text{ s}$).</w:t>
+        <w:br/>
+        <w:t>* Por el contrario, los controladores optimizados alcanzan valores de fitness muy superiores (**0.8199** con 39/49 reglas en 7 términos semilla 42; **0.7946** con 58/81 reglas en 9 términos semilla 999; **0.7616** con 16/25 reglas en 5 términos semilla 999). Asimismo, dentro de 5 términos, la corrida 4 (semilla 777) conservó **22 reglas activas** y obtuvo un fitness de $0.6499$, mientras que la corrida 5 (semilla 999) con **16 reglas activas** alcanzó $0.7616$ y la corrida 1 (semilla 42) con **15 reglas activas** alcanzó $0.7499$. La ubicación de las funciones de membresía $a &lt; b &lt; c$ y la coherencia de los consecuentes importan mucho más que la cantidad bruta de reglas.</w:t>
       </w:r>
     </w:p>
     <w:p>
@@ -1421,9 +1463,9 @@
         <w:br/>
         <w:t>Se puede concluir que las reglas eliminadas eran **redundantes, no visitadas o contraproducentes (conflictivas)** para la ley de control:</w:t>
         <w:br/>
-        <w:t>1. **Reglas conflictivas en el centroide:** En inferencia Mamdani con defuzzificación por centroide, una regla activa con un consecuente de baja magnitud (ej. `ZE` o `NS`) que se solapa parcialmente durante el ascenso resta peso al consecuente extremo (`PB`), reduciendo el voltaje neto aplicado al servomotor y ralentizando el tiempo de subida $t_r$. Al desactivar esa regla intermedia, el centroide se desplaza hacia voltajes más altos cuando el error es grande, reduciendo $t_r^+$ de $30.55\text{ s}$ a $10.05\text{ s}$.</w:t>
-        <w:br/>
-        <w:t>2. **Reglas redundantes:** El solapamiento de las funciones de membresía adyacentes permite interpolar suavemente la acción de control sin necesidad de activar todas las celdas de la matriz $N \times N$.</w:t>
+        <w:t>1. **Reglas conflictivas en el centroide:** En inferencia Mamdani con defuzzificación por centroide, una regla activa con un consecuente de baja magnitud (ej. `ZE` o `NS`) que se solapa parcialmente durante el ascenso resta peso al consecuente extremo (`PB`), reduciendo el voltaje neto aplicado al servomotor y ralentizando el tiempo de subida $t_r$. Al desactivar esa regla intermedia, el centroide se desplaza hacia voltajes más altos cuando el error es grande, reduciendo $t_r^+$ de $30.60\text{ s}$ a $11.70\text{ s}$ (5 términos) y de $28.20\text{ s}$ a $13.40\text{ s}$ (7 términos).</w:t>
+        <w:br/>
+        <w:t>2. **Reglas redundantes:** El traslape de las funciones de membresía triangulares adyacentes permite interpolar suavemente la acción de control sin necesidad de activar todas las celdas de la matriz $N \times N$.</w:t>
       </w:r>
     </w:p>
     <w:p>
@@ -1440,11 +1482,11 @@
       <w:r>
         <w:t>**Respuesta:**</w:t>
         <w:br/>
-        <w:t>**Sí, es completamente posible y ocurre en nuestros experimentos** (como se observa en la `fig7_active_rules_heatmaps.png`, donde en el mejor controlador de 5 términos la celda central `(ZE, ZE)` fue desactivada `'OFF'` y aun así el controlador alcanzó $SSE^+ = 0.0298\text{ rad}$ y fitness $= 0.8992$). Esto ocurre por dos razones físicas y matemáticas:</w:t>
+        <w:t>**Sí, es completamente posible y ocurre en nuestros experimentos** (como se observa en la `fig7_active_rules_heatmaps.png`, donde varias celdas diagonales e intermedias fueron desactivadas `'OFF'` por el algoritmo genético y aun así los mejores controladores alcanzaron $SSE^+ \in [0.0031, 0.0144]\text{ rad}$). Esto ocurre por dos razones físicas y matemáticas:</w:t>
         <w:br/>
         <w:t>1. **Trayectoria en el plano de fase $(e, \Delta e)$:** Un sistema dinámico de tercer orden sigue una curva específica en el plano $(e, \Delta e)$; muchas combinaciones extremas (como error cercano a cero con derivada positiva extrema cuando la referencia es constante) nunca son visitadas por la trayectoria real o solo se cruzan durante una fracción de segundo.</w:t>
         <w:br/>
-        <w:t>2. **Compensación por solapamiento e interpolación:** En el controlador de 5 términos (semilla 42), las funciones `NS` y `PS` de error y derivada se solapan alrededor de $0$ (`fig4_mfs_before_after_5terms.png`). Cuando $e \approx 0$ y $\Delta e \approx 0$, el equilibrio dinámico se logra por la activación simultánea y balanceada de las reglas vecinas sin requerir explícitamente la regla `(ZE, ZE) -&gt; ZE`.</w:t>
+        <w:t>2. **Compensación por traslape e interpolación:** Dado que el algoritmo genético ajusta los parámetros $a &lt; b &lt; c$ generando traslapes amplios entre conjuntos vecinos (`fig4` a `fig6`), cuando una celda $(i, j)$ está apagada, las reglas vecinas $(i\pm 1, j)$ o $(i, j\pm 1)$ siguen activándose simultáneamente, manteniendo el equilibrio dinámico sin requerir cada regla individual.</w:t>
       </w:r>
     </w:p>
     <w:p>
@@ -1463,9 +1505,9 @@
         <w:br/>
         <w:t>**No puede considerarse superior.** En teoría de control, este caso corresponde a una respuesta **sobreamortiguada o excesivamente conservadora (lenta)**:</w:t>
         <w:br/>
-        <w:t>* **Evidencia experimental:** Los tres controladores **Baseline (`automf`)** y la corrida 3 de 7 términos (semilla 2026) obtuvieron exactamente **$OS^+ = 0.0000$ y $OS^- = 0.0000$** (el menor sobreimpulso posible), pero presentaron tiempos de establecimiento muy altos ($t_s^+ = 46.75\text{ s}$ en el Baseline de 5 términos y $t_s^+ = 38.10\text{ s}, t_s^- = 46.58\text{ s}$ en 7 términos semilla 2026), resultando en valores de fitness bajos ($0.6319$ y $0.6833$).</w:t>
-        <w:br/>
-        <w:t>* Un controlador con $OS = 0$ pero $t_s$ muy grande tarda casi todo el semiperíodo de $50\text{ s}$ en llegar a la banda del $\pm 5\%$ de la referencia, por lo que su desempeño dinámico es deficiente frente a un controlador como el de 7 términos semilla 42 ($OS^+ = 0.0124$, $OS^- = 0.0000$, $t_s^+ = 17.45\text{ s}$, $t_s^- = 14.70\text{ s}$, fitness $= 0.8879$).</w:t>
+        <w:t>* **Evidencia experimental:** Los tres controladores **Baseline (`automf`)** y corridas como la semilla 777 de 5 términos o la semilla 100 de 7 términos obtuvieron exactamente **$OS^+ = 0.0000\%$ y $OS^- = 0.0000\%$** (el menor sobreimpulso posible), pero presentaron tiempos de establecimiento muy altos ($t_s^+ = 47.20\text{ s}$ en el Baseline de 5 términos y $t_s^+ = 42.80\text{ s}, t_s^- = 46.75\text{ s}$ en 7 términos semilla 100), resultando en valores de fitness bajos ($0.6319$ y $0.6789$).</w:t>
+        <w:br/>
+        <w:t>* Un controlador con $OS = 0\%$ pero $t_s$ muy grande tarda casi todo el semiperíodo de $50\text{ s}$ en llegar a la banda del $\pm 5\%$ de la referencia, por lo que su desempeño dinámico es muy inferior frente al mejor controlador de 7 términos semilla 42 ($OS^+ = 0.7896\%$, $OS^- = 0.0000\%$, $t_s^+ = 17.60\text{ s}$, $t_s^- = 15.60\text{ s}$, fitness $= 0.8199$).</w:t>
       </w:r>
     </w:p>
     <w:p>
@@ -1484,13 +1526,13 @@
         <w:br/>
         <w:t>Porque el control de posición de un servomotor es un problema intrínsecamente **multiobjetivo con metas en conflicto** (Téllez-Velázquez et al., 2017, Sección 5.1, Ec. 12):</w:t>
         <w:br/>
-        <w:t>* **Tiempo de crecimiento ($t_r$):** Exige rapidez de respuesta inicial (alta ganancia / voltajes cercanos a $\pm 8.18\text{ V}$).</w:t>
-        <w:br/>
-        <w:t>* **Sobreimpulso ($OS$):** Exige amortiguamiento para evitar que la inercia del rotor ($G(s)$ tiene tres polos, incluyendo un integrador en $s=0$) rebase peligrosamente la posición deseada.</w:t>
-        <w:br/>
-        <w:t>* **Tiempo de establecimiento ($t_s$):** Exige que las oscilaciones transitorias se extingan rápidamente dentro de la banda del $\pm 5\%$.</w:t>
-        <w:br/>
-        <w:t>* **Error en estado estable ($SSE$):** Exige precisión asintótica una vez concluido el transitorio.</w:t>
+        <w:t>* **Tiempo de crecimiento ($t_r$, en segundos):** Exige rapidez de respuesta inicial (alta ganancia / voltajes cercanos a $\pm 8.18\text{ V}$).</w:t>
+        <w:br/>
+        <w:t>* **Sobreimpulso ($OS$, en porcentaje `%`):** Exige amortiguamiento para evitar que la inercia del rotor ($G(s)$ tiene tres polos, incluyendo un integrador en $s=0$) rebase la posición deseada. Además, al expresarse $OS$ en porcentaje como en la Tabla 10 del artículo, cualquier sobreimpulso mayor a $1\%$ reduce fuertemente el término $\frac{1}{1 + |OS|}$.</w:t>
+        <w:br/>
+        <w:t>* **Tiempo de establecimiento ($t_s$, en segundos):** Exige que las oscilaciones transitorias se extingan rápidamente dentro de la banda del $\pm 5\%$.</w:t>
+        <w:br/>
+        <w:t>* **Error en estado estable ($SSE$, en radianes):** Exige precisión asintótica una vez concluido el transitorio.</w:t>
         <w:br/>
         <w:t>Al combinar los cuatro criterios en ambas direcciones ($J=8$ términos con pesos $w_k = 0.125$), el algoritmo genético se ve forzado a encontrar un compromiso equilibrado en el frente de Pareto.</w:t>
       </w:r>
@@ -1511,9 +1553,9 @@
         <w:br/>
         <w:t>Si la función de aptitud solo evaluara $f = \frac{1}{1 + |SSE|}$:</w:t>
         <w:br/>
-        <w:t>1. **Indiferencia ante tiempos de subida y establecimiento lentos:** Un controlador extremadamente lento que alcance la referencia apenas en el segundo $48$ de cada semiperíodo de $50\text{ s}$ tendría $SSE \approx 0$ en los últimos segundos y recibiría un fitness cercano a $1.0$, a pesar de ser inútil durante el $95\%$ del ciclo.</w:t>
-        <w:br/>
-        <w:t>2. **Sobreimpulsos y oscilaciones transitorias severas no penalizadas:** Un controlador subamortiguado que presente picos de $+50\%$ de sobreimpulso al inicio del escalón pero amortigüe antes del final de la ventana tendría $SSE \approx 0$, poniendo en riesgo mecánico al servomotor y la carga acoplada.</w:t>
+        <w:t>1. **Indiferencia ante tiempos de subida y establecimiento lentos:** Un controlador extremadamente lento que alcance la referencia apenas en el segundo $48$ de cada semiperíodo de $50\text{ s}$ tendría $SSE \approx 0\text{ rad}$ en el instante final y recibiría un fitness cercano a $1.0$, a pesar de ser inútil durante el $95\%$ del ciclo.</w:t>
+        <w:br/>
+        <w:t>2. **Sobreimpulsos y oscilaciones transitorias severas no penalizadas:** Un controlador subamortiguado que presente picos de $+50\%$ de sobreimpulso al inicio del escalón pero amortigüe antes del final de la ventana tendría $SSE \approx 0\text{ rad}$, poniendo en riesgo mecánico al servomotor y la carga acoplada.</w:t>
       </w:r>
     </w:p>
     <w:p>
@@ -1551,11 +1593,11 @@
       <w:r>
         <w:t>**Respuesta:**</w:t>
         <w:br/>
-        <w:t>El factor de penalización $q = \frac{\max(h^0) - \min(h_i)}{\max(h) - \min(h)}$ (Ecuación 13) evita el fenómeno del **"falso tiempo de crecimiento" (*fake rise time*)** ilustrado en la Figura 5 (pág. 9) del artículo de referencia:</w:t>
-        <w:br/>
-        <w:t>* **Mecanismo matemático:** Si un individuo defectuoso genera un voltaje muy débil o asimétrico tal que el rotor solo se mueve una fracción del escalón (por ejemplo, de $-1.0\text{ rad}$ a $-0.5\text{ rad}$, una excursión de $0.5\text{ rad}$ en lugar de $2.0\text{ rad}$), un medidor ingenuo que mida el tiempo del 10% al 90% de la propia excursión del individuo mediría un $t_r$ engañosamente corto ($t_r \ll 9\text{ s}$), otorgándole una puntuación máxima en $f_3$.</w:t>
-        <w:br/>
-        <w:t>* **Efecto observado con $q$:** Con la Ecuación (13), para esa respuesta parcial se obtiene $q = \frac{1.0 - (-1.0)}{-0.5 - (-1.0)} = \frac{2.0}{0.5} = 4.0$, multiplicando el denominador $q \cdot t_r$ por $4$ y penalizando severamente el término $f_3 = \frac{t_r^0}{q \cdot t_r}$. Gracias a $q$, todos los mejores individuos seleccionados en nuestras 15 corridas alcanzaron excursiones completas con $q^+ \in [1.000, 1.031]$ y $q^- \in [1.000, 1.037]$.</w:t>
+        <w:t>Tal como se establece en la página 10, columna 2, párrafo 1 del artículo de referencia, el factor de penalización $q = \frac{\max(h^0) - \min(h_i)}{\max(h) - \min(h)}$ (donde $q$ corresponde a la letra griega $\rho$ en el texto cuando $[\min(\theta), \max(\theta)] \subseteq [\min(\theta_0), \max(\theta_0)]$) evita calificar con un buen puntaje a los tiempos de subida muy cortos e incorrectos cuando el estado estacionario se alcanza por debajo del valor de referencia (*fake rise time*, Figura 5, pág. 9):</w:t>
+        <w:br/>
+        <w:t>* **Mecanismo matemático ($q \ge 1.0$):** Al ser una penalización en la Ecuación (13), $q$ puede ser mayor que $1.0$ cuando el rango alcanzado por el rotor $\max(\theta) - \min(\theta)$ es menor que la excursión de la referencia libre de ruido ($2.0\text{ rad}$). Esto incrementa el denominador $q \cdot t_r$ del término $\frac{t_r^0}{q \cdot t_r}$, generando un número alejado de $1.0$.</w:t>
+        <w:br/>
+        <w:t>* **Efecto observado en la optimización:** Si un individuo defectuoso solo mueve el rotor de $-1.0\text{ rad}$ a $-0.5\text{ rad}$ (excursión de $0.5\text{ rad}$), $q = \frac{2.0}{0.5} = 4.0$, multiplicando por $4$ el denominador del tiempo de subida. Gracias a esta penalización, los mejores individuos seleccionados en nuestras configuraciones alcanzaron excursiones completas con $q^+ \approx 1.000 - 1.007$ y $q^- \approx 1.000 - 1.006$.</w:t>
       </w:r>
     </w:p>
     <w:p>
@@ -1574,15 +1616,15 @@
         <w:br/>
         <w:t>Deben realizarse cinco verificaciones cuantitativas obligatorias:</w:t>
         <w:br/>
-        <w:t>1. **Verificar el factor de penalización $q^+$ y $q^-$ (Ec. 13):** Confirmar que $q \approx 1.0$ (es decir, que $\max(\theta) - \min(\theta) \approx 2.0\text{ rad}$) y que el tiempo pequeño no provenga de una respuesta truncada que nunca cruzó de $-0.8\text{ rad}$ (10%) a $+0.8\text{ rad}$ (90%).</w:t>
-        <w:br/>
-        <w:t>2. **Verificar el punto de partida antes de la transición:** Como ocurrió en la corrida 2 de 9 términos (semilla 100), donde se observó $t_r^- = 8.70\text{ s} &lt; t_r^0 = 9.0\text{ s}$, al inspeccionar sus demás métricas se detecta que tenía un error estacionario previo alto ($SSE^+ = 0.0804\text{ rad}$, $OS^+ = 0.0804$) y no logró establecerse dentro del $\pm 5\%$ ($t_s^+ = 50.0\text{ s}, t_s^- = 50.0\text{ s}$), por lo que su fitness global fue bajo ($0.6937$).</w:t>
-        <w:br/>
-        <w:t>3. **Verificar el sobreimpulso ($OS^+, OS^-$):** Un ascenso demasiado agresivo suele provocar un exceso de inercia y alto sobreimpulso.</w:t>
+        <w:t>1. **Verificar el factor de penalización $q^+$ y $q^-$ (Ec. 13):** Confirmar que $q \approx 1.0$ (es decir, que $\max(\theta) - \min(\theta) \approx 2.0\text{ rad}$) y que el tiempo pequeño no provenga de una respuesta incompleta bajo la referencia.</w:t>
+        <w:br/>
+        <w:t>2. **Verificar que la transición haya partido realmente del nivel inicial ($\mp 1.0\text{ rad}$):** Si en el semiperíodo previo el controlador falló y dejó el rotor cerca de $+1.0\text{ rad}$ en vez de bajar a $-1.0\text{ rad}$, al iniciar el escalón positivo ya estaría arriba sin haber subido realmente.</w:t>
+        <w:br/>
+        <w:t>3. **Verificar el sobreimpulso en porcentaje ($OS^+, OS^-$ [%]):** Un ascenso demasiado agresivo provoca exceso de inercia y sobreimpulso porcentual que degrada $f_1$ y $f_5$.</w:t>
         <w:br/>
         <w:t>4. **Verificar el tiempo de establecimiento ($t_s^+, t_s^-$) y $SSE^{\pm}$:** Confirmar que el sistema realmente entre y permanezca en la banda de $\pm 0.05\text{ rad}$.</w:t>
         <w:br/>
-        <w:t>5. **Verificar que el voltaje $v(t)$ respete $[-8.18, 8.18]\text{ V}$:** Para la planta $G(s)$ dada y partiendo de $\pm 1\text{ rad}$ en reposo, el límite físico de tiempo de subida con $\pm 8.18\text{ V}$ ronda los $\sim 6.5 - 9.0\text{ s}$.</w:t>
+        <w:t>5. **Verificar que el voltaje $v(t)$ respete $[-8.18, 8.18]\text{ V}$** durante toda la simulación con `scipy.signal.lsim`.</w:t>
       </w:r>
     </w:p>
     <w:p>
@@ -1599,11 +1641,11 @@
       <w:r>
         <w:t>**Respuesta:**</w:t>
         <w:br/>
-        <w:t>Porque en la optimización evolutiva sin restricción de simetría forzada en el cromosoma, las funciones de membresía de entrada/salida y la matriz de reglas pueden evolucionar de forma **asimétrica** entre el semiespacio positivo y el negativo:</w:t>
-        <w:br/>
-        <w:t>* **Evidencia experimental:** En nuestras corridas se observa claramente esta asimetría. Por ejemplo, en el controlador de **9 términos (corrida 3, semilla 2026)**, la transición negativa es excelente ($t_r^- = 10.65\text{ s}$, $t_s^- = 13.60\text{ s}$, $SSE^- = 0.0289\text{ rad}$), pero la transición positiva es muy lenta ($t_r^+ = 34.10\text{ s}$, $t_s^+ = 50.00\text{ s}$, $SSE^+ = 0.1417\text{ rad}$). A la inversa, en **7 términos (corrida 2, semilla 100)**, la transición positiva es rápida ($t_r^+ = 13.50\text{ s}$, $t_s^+ = 18.50\text{ s}$) mientras que la negativa es lenta ($t_r^- = 24.40\text{ s}$, $t_s^- = 31.15\text{ s}$).</w:t>
-        <w:br/>
-        <w:t>* Evaluar ambas transiciones con igual peso ($\sum_{k=1}^4 w_k = 0.5$ para $+$ y $\sum_{k=5}^8 w_k = 0.5$ para $-$) garantiza que el controlador seleccionado sea capaz de posicionar el servomotor bidireccionalmente.</w:t>
+        <w:t>Porque en la optimización evolutiva donde el algoritmo genético establece libremente los parámetros $a &lt; b &lt; c$ y la matriz de reglas sin forzar simetría impar, el controlador puede evolucionar de forma **asimétrica** entre el semiespacio positivo y el negativo:</w:t>
+        <w:br/>
+        <w:t>* **Evidencia experimental:** En nuestras corridas se observa claramente esta asimetría. Por ejemplo, en el controlador de **9 términos (corrida 4, semilla 777)**, la transición negativa es sumamente rápida ($t_r^- = 11.30\text{ s}$, $t_s^- = 13.10\text{ s}$, $SSE^- = 0.0157\text{ rad}$), pero la transición positiva es lenta e incompleta ($t_r^+ = 50.00\text{ s}$, $t_s^+ = 50.00\text{ s}$, $SSE^+ = 0.2839\text{ rad}$). A la inversa, en **5 términos (corrida 5, semilla 999)**, la transición positiva es rápida ($t_r^+ = 11.70\text{ s}$, $t_s^+ = 16.80\text{ s}$, $SSE^+ = 0.0031\text{ rad}$) mientras que la negativa es más lenta ($t_r^- = 30.40\text{ s}$, $t_s^- = 40.40\text{ s}$).</w:t>
+        <w:br/>
+        <w:t>* En cambio, el mejor controlador global (**7 términos, semilla 42, fitness = 0.8199**) logró excelente simetría bidireccional ($t_r^+ = 13.40\text{ s}, t_r^- = 11.70\text{ s}$; $t_s^+ = 17.60\text{ s}, t_s^- = 15.60\text{ s}$; $SSE^+ = 0.0063\text{ rad}, SSE^- = 0.0060\text{ rad}$) precisamente porque la función fitness evalúa ambas transiciones con igual peso ($0.5$ para $+$ y $0.5$ para $-$).</w:t>
       </w:r>
     </w:p>
     <w:p>
@@ -1622,13 +1664,13 @@
         <w:br/>
         <w:t>Pasarían desapercibidos al menos cuatro comportamientos críticos:</w:t>
         <w:br/>
-        <w:t>1. **Incapacidad de retorno / giro inverso:** El algoritmo genético podría desactivar todas las reglas con consecuentes de voltaje negativo (`NB`, `NM`, `NS`) o desplazar todos los centros de `voltage` hacia valores positivos $[0, 8.18]\text{ V}$, logrando subir de $0 \to +1$, pero siendo incapaz de bajar cuando la referencia cambia a $-1\text{ rad}$ (salvo para frenar mínimamente un sobreimpulso).</w:t>
-        <w:br/>
-        <w:t>2. **Inestabilidad o ciclo límite en el cuadrante negativo:** Reglas mal asignadas para $e &lt; 0$ y $\Delta e &lt; 0$ no se activarían significativamente durante una subida monótona, ocultando oscilaciones severas al invertir el sentido de giro.</w:t>
-        <w:br/>
-        <w:t>3. **Asimetría de error en estado estacionario ($SSE^- \gg SSE^+$):** Como se observó en la corrida 5 de 9 términos (semilla 999), donde $SSE^+ = 0.0218\text{ rad}$ y $t_s^+ = 18.65\text{ s}$ son muy buenos, pero en el semiciclo negativo $SSE^- = 0.1222\text{ rad}$ y $t_s^- = 50.00\text{ s}$ (no logra establecerse en $-1\text{ rad}$).</w:t>
-        <w:br/>
-        <w:t>4. **Dependencia del estado inicial $x_0 = [0, 0, 0]$:** Un escalón único de $0 \to +1$ tiene amplitud $\Delta R = 1\text{ rad}$, mientras que la operación real entre $-1 \leftrightarrow +1$ exige cubrir una excursión doble $\Delta R = 2\text{ rad}$ donde los errores iniciales alcanzan $\pm 2\text{ rad}$ (saturando el borde de $[-\pi/2, \pi/2] = [-1.5708, 1.5708]\text{ rad}$).</w:t>
+        <w:t>1. **Incapacidad de retorno / giro inverso:** El algoritmo genético podría desactivar todas las reglas con consecuentes de voltaje negativo (`NB`, `NM`, `NS`) o desplazar los conjuntos de `voltage` hacia valores positivos, logrando subir de $0 \to +1$, pero siendo incapaz de bajar cuando la referencia cambia a $-1\text{ rad}$.</w:t>
+        <w:br/>
+        <w:t>2. **Inestabilidad o sobreimpulso severo en el cuadrante negativo:** Como se observó en la corrida 1 de 9 términos (semilla 42), donde $OS^+ = 0.0000\%$ es perfecto, pero en el sentido negativo aparece un sobreimpulso de $OS^- = 4.6017\%$.</w:t>
+        <w:br/>
+        <w:t>3. **Asimetría de error en estado estacionario ($SSE^- \gg SSE^+$):** Como se observó en la corrida 1 de 5 términos (semilla 42), donde $SSE^+ = 0.0211\text{ rad}$ y $t_s^+ = 17.90\text{ s}$ cumplen la banda del $5\%$, pero en el semiciclo negativo $SSE^- = 0.0604\text{ rad} &gt; 0.05\text{ rad}$ y $t_s^- = 50.00\text{ s}$.</w:t>
+        <w:br/>
+        <w:t>4. **Excursión real de $\Delta R = 2\text{ rad}$:** Un escalón único de $0 \to +1$ tiene amplitud $1\text{ rad}$, mientras que la operación entre $-1 \leftrightarrow +1$ exige cubrir una excursión doble $\Delta R = 2\text{ rad}$ donde los errores iniciales alcanzan $\pm 2\text{ rad}$ (saturando los extremos de $[-\pi/2, \pi/2]$).</w:t>
       </w:r>
     </w:p>
     <w:p>
@@ -1647,9 +1689,9 @@
         <w:br/>
         <w:t>**Sí, puede existir sobreajuste (*overfitting*) estructural y paramétrico.** En este problema específico se manifiesta cuando:</w:t>
         <w:br/>
-        <w:t>1. **Especialización excesiva en la trayectoria de amplitud $\pm 1\text{ rad}$:** Al evaluar únicamente cambios escalón de $\pm 2\text{ rad}$ cada $50\text{ s}$, la trayectoria $(e(t), \Delta e(t))$ recorre un subconjunto específico del universo $[-\pi/2, \pi/2] \times [-\pi/6, \pi/6]$. El GA puede desactivar reglas fuera de ese corredor (como se ve en `fig7_active_rules_heatmaps.png`) o colocar triángulos ultra-estrechos justo en los valores de error finales de $\pm 1\text{ rad}$.</w:t>
-        <w:br/>
-        <w:t>2. **Sensibilidad ante referencias de distinta amplitud o perturbaciones:** Si a un controlador excesivamente podado se le aplica una referencia de $\pm 0.3\text{ rad}$ o una rampa, la trayectoria cruzará celdas `'OFF'` de la matriz de reglas, pudiendo encontrar zonas muertas (*dead zones*) donde ninguna regla se active y el voltaje caiga a $0\text{ V}$ prematuramente.</w:t>
+        <w:t>1. **Especialización excesiva en la trayectoria de amplitud $\pm 1\text{ rad}$:** Al evaluar únicamente cambios escalón de $\pm 2\text{ rad}$ cada $50\text{ s}$, la trayectoria $(e(t), \Delta e(t))$ recorre un corredor específico del universo $[-\pi/2, \pi/2] \times [-\pi/6, \pi/6]$. El GA puede desactivar reglas fuera de ese corredor (como se ve en `fig7_active_rules_heatmaps.png`) o ajustar triángulos $a &lt; b &lt; c$ muy estrechos adaptados únicamente a esa trayectoria.</w:t>
+        <w:br/>
+        <w:t>2. **Sensibilidad ante referencias de distinta amplitud o perturbaciones:** Si a un controlador excesivamente podado se le aplica una referencia de $\pm 0.3\text{ rad}$ o una rampa, la trayectoria cruzará celdas `'OFF'` de la matriz de reglas, pudiendo encontrar regiones de baja ganancia donde la respuesta sea más lenta.</w:t>
       </w:r>
     </w:p>
     <w:p>
@@ -1668,13 +1710,13 @@
         <w:br/>
         <w:t>Con base en las curvas de convergencia obtenidas (`fig3_convergence_curves.png`), existen cuatro explicaciones fundamentales:</w:t>
         <w:br/>
-        <w:t>1. **Convergencia prematura a un óptimo local por pérdida de diversidad genética:** Con una población de `sol_per_pop = 20` individuos y selección por torneo + elitismo, tras 20–25 generaciones los individuos tienden a agruparse alrededor del mejor genotipo encontrado; si la mutación aleatoria (`mutation_probability = 0.15`) no logra saltar simultáneamente la combinación de centros y reglas necesarias, el fitness se estanca en una meseta (como se aprecia en varias semillas de 7 y 9 términos entre las generaciones 15 y 25).</w:t>
-        <w:br/>
-        <w:t>2. **Cercanía al límite físico de desempeño de la planta bajo saturación de actuador:** La planta $G(s) = \frac{0.5}{s^3 + 13.6667s^2 + 23.3487s}$ con voltaje acotado a $[-8.18, 8.18]\text{ V}$ tiene una velocidad máxima física de respuesta; cuando un controlador ya alcanza $t_r^+ \approx 10.05\text{ s}$, $t_s^+ \approx 13.30\text{ s}$ y $SSE \approx 0.01 - 0.03\text{ rad}$ (fitness $\approx 0.90$), el margen físico de mejora residual es muy estrecho.</w:t>
-        <w:br/>
-        <w:t>3. **Epistasis entre genes continuos (MFs) y discretos (reglas):** En etapas avanzadas, mutar un centro de membresía sin reajustar simultáneamente los consecuentes de las reglas asociadas suele degradar el desempeño del hijo, siendo descartado por elitismo.</w:t>
-        <w:br/>
-        <w:t>4. **Resolución de las constantes de referencia ($t_r^0 = 9\text{ s}$, $t_s^0 = 13\text{ s}$):** Una vez que $t_s$ se acerca a $13\text{ s}$ y $OS, SSE \to 0$, las derivadas parciales de $\frac{1}{1+|SSE|}$ y $\frac{1}{1+|OS|}$ tienen pendiente suave cerca de $0$.</w:t>
+        <w:t>1. **Convergencia prematura a un óptimo local por pérdida de diversidad genética:** Con una población de `sol_per_pop = 20` individuos y selección por torneo + elitismo, tras 20–25 generaciones los individuos tienden a agruparse alrededor del mejor genotipo encontrado; si la mutación aleatoria (`mutation_probability = 0.15`) no logra saltar simultáneamente la combinación de parámetros $a &lt; b &lt; c$ y reglas necesarias, el fitness se estanca en una meseta.</w:t>
+        <w:br/>
+        <w:t>2. **Fuerte penalización de cualquier sobreimpulso porcentual ($OS$ en `%`):** Dado que en la Ecuación (12) el término $\frac{1}{1 + |OS|}$ evalúa $OS$ en porcentaje, un controlador que intente subir más rápido que $t_r \approx 11.5\text{ s}$ tiende a generar $1\% - 3\%$ de sobreimpulso, lo cual le resta más aptitud en $f_1$ o $f_5$ de la que gana en $f_3$ o $f_7$, creando una barrera natural de compromiso Pareto alrededor de $f \approx 0.80 - 0.82$.</w:t>
+        <w:br/>
+        <w:t>3. **Epistasis entre genes continuos (MFs) y discretos (reglas):** En etapas avanzadas, mutar un vértice de función de membresía sin reajustar simultáneamente los consecuentes de las reglas asociadas suele degradar el desempeño del hijo, siendo descartado por elitismo.</w:t>
+        <w:br/>
+        <w:t>4. **Límite físico del actuador ($v \in [-8.18, 8.18]\text{ V}$) y dinámica de tercer orden de $G(s)$.**</w:t>
       </w:r>
     </w:p>
     <w:p>
@@ -1693,9 +1735,9 @@
         <w:br/>
         <w:t>**No estaría garantizado.**</w:t>
         <w:br/>
-        <w:t>* Los algoritmos genéticos son **metaheurísticas estocásticas**, no métodos exactos ni deterministas de optimización global. Duplicar la población de $20$ a $40$ individuos incrementa la diversidad genética inicial y la capacidad de **exploración** del espacio de búsqueda (aumentando la *probabilidad estadística* de descubrir mejores cuencas de atracción), pero no ofrece garantía matemática de superar el mejor valor previo en una corrida dada, y a cambio **duplica exactamente el tiempo de cómputo por generación**.</w:t>
-        <w:br/>
-        <w:t>* Evidencia de ello en nuestros datos es que en 5 términos, con solo 20 individuos, la semilla 42 alcanzó un fitness de **0.8992**, mientras que otras 4 semillas independientes (que equivalen en conjunto a muestrear 80 individuos iniciales adicionales) obtuvieron valores entre $0.7084$ y $0.8504$.</w:t>
+        <w:t>* Los algoritmos genéticos son **metaheurísticas estocásticas**, no métodos exactos ni deterministas de optimización global. Duplicar la población de $20$ a $40$ individuos incrementa la diversidad genética inicial y la capacidad de **exploración** del espacio de búsqueda (aumentando la *probabilidad estadística* de descubrir mejores cuencas de atracción), pero no ofrece garantía matemática de superar el mejor valor previo en una corrida dada, y a cambio **duplica exactamente el tiempo de cómputo por generación** (pasando de $\sim 172\text{ s}$ a $\sim 345\text{ s}$ por corrida).</w:t>
+        <w:br/>
+        <w:t>* Evidencia de ello en nuestros datos es que en 7 términos, con solo 20 individuos, la semilla 42 alcanzó un fitness de **0.8199**, mientras que otras 4 semillas independientes (que equivalen en conjunto a muestrear 80 individuos iniciales adicionales) obtuvieron valores entre $0.6789$ y $0.7550$.</w:t>
       </w:r>
     </w:p>
     <w:p>
@@ -1716,7 +1758,7 @@
         <w:br/>
         <w:t>* Gracias al **elitismo** (`keep_elitism = 2`), está garantizado que el fitness del mejor individuo **no empeorará** ($f_{60} \ge f_{30}$). Sin embargo, si en la generación 30 la población ya convergió a un óptimo local profundo cuya cuenca de atracción es más ancha que el radio de mutación, el algoritmo puede permanecer exactamente con el mismo fitness desde la generación 30 hasta la 60 ($f_{60} = f_{30}$).</w:t>
         <w:br/>
-        <w:t>* Esto se observa empíricamente en la `fig3_convergence_curves.png` (por ejemplo, en 7 términos semilla 42 entre las generaciones 1 y 27, donde el mejor fitness permaneció constante durante 26 generaciones consecutivas hasta que una combinación de cruza y mutación en la generación 28 produjo un salto a $0.8879$).</w:t>
+        <w:t>* Esto se observa empíricamente en la `fig3_convergence_curves.png`, donde varias semillas presentan mesetas horizontales prolongadas de más de 15 generaciones consecutivas sin cambio en el mejor fitness.</w:t>
       </w:r>
     </w:p>
     <w:p>
@@ -1737,7 +1779,7 @@
         <w:br/>
         <w:t>1. **Prevención del estancamiento prematuro:** Cuando todos los individuos de la población comparten el mismo valor en un locus determinado (por ejemplo, si una regla útil quedó en `0` en todos los padres o un centro de membresía quedó fijo), la cruza por dos puntos jamás podrá generar un valor nuevo en ese gen.</w:t>
         <w:br/>
-        <w:t>2. **Capacidad de escapar de óptimos locales (exploración):** La mutación introduce perturbaciones estocásticas que permiten saltar barreras de baja aptitud hacia nuevas regiones del espacio de búsqueda. Aunque la mayoría de las mutaciones en un individuo ya afinado produzcan hijos peores, el **elitismo** protege a los mejores individuos actuales mientras que una sola mutación benéfica (como el salto observado en la generación 28 de 7 términos semilla 42 o en la generación 26 de 9 términos semilla 777 en `fig3_convergence_curves.png`) impulsa a toda la población hacia un nuevo máximo.</w:t>
+        <w:t>2. **Capacidad de escapar de óptimos locales (exploración):** La mutación introduce perturbaciones estocásticas en los parámetros $a &lt; b &lt; c$ y en las reglas que permiten saltar barreras de baja aptitud hacia nuevas regiones del espacio de búsqueda. Aunque la mayoría de las mutaciones en un individuo ya afinado produzcan hijos peores, el **elitismo** protege a los mejores individuos actuales mientras que una sola mutación benéfica (como los escalones ascendentes observados en `fig3_convergence_curves.png` para 7 términos semilla 42 o 9 términos semilla 999) impulsa a toda la población hacia un nuevo máximo.</w:t>
       </w:r>
     </w:p>
     <w:p>
@@ -1758,7 +1800,7 @@
         <w:br/>
         <w:t>* El **tiempo de establecimiento ($t_s$)** proporciona información sobre la **estabilidad, el grado de amortiguamiento y la extinción de las oscilaciones pos-transitorias**, midiendo cuánto tarda el sistema en entrar y **permanecer definitivamente** dentro de la banda de tolerancia del $\pm 5\%$ alrededor de la referencia.</w:t>
         <w:br/>
-        <w:t>* **Evidencia experimental clara:** En el controlador de **9 términos, corrida 2 (semilla 100)**, el tiempo de crecimiento negativo fue muy rápido ($t_r^- = 8.70\text{ s}$), pero el sistema nunca logró estabilizarse dentro de la banda del $\pm 5\%$ ($SSE^- = 0.0731\text{ rad} &gt; 0.05\text{ rad}$), arrojando $t_s^- = 50.00\text{ s}$. Sin $t_s$, ese controlador parecería falsamente rápido y estable.</w:t>
+        <w:t>* **Evidencia experimental clara:** En el controlador de **5 términos, corrida 3 (semilla 2026)**, los tiempos de crecimiento fueron rápidos ($t_r^+ = 15.80\text{ s}, t_r^- = 12.20\text{ s}$), pero el sistema quedó con un error estacionario fuera de la banda del $\pm 5\%$ ($SSE^+ = 0.1286\text{ rad}, SSE^- = 0.0562\text{ rad} &gt; 0.05\text{ rad}$), arrojando $t_s^+ = 50.00\text{ s}$ y $t_s^- = 50.00\text{ s}$. Sin $t_s$, ese controlador parecería falsamente rápido y preciso.</w:t>
       </w:r>
     </w:p>
     <w:p>
@@ -1777,13 +1819,13 @@
         <w:br/>
         <w:t>Utilizaría sin duda **el controlador que requiere tres veces menos tiempo de inferencia**, por cuatro razones de ingeniería industrial:</w:t>
         <w:br/>
-        <w:t>1. **Frecuencia de muestreo y margen de fase en tiempo real:** En nuestros experimentos, el controlador de 5 términos requiere en promedio **6.640 ms** (`4.497 ms` en el mejor caso), mientras que el de 7 términos requiere **18.372 ms** ($2.77\times$ más) y el de 9 términos **29.512 ms** ($4.44\times$ más). En un lazo de control digital, una mayor latencia de cómputo introduce un retardo de transporte $e^{-s \tau_d}$ que reduce el margen de fase y puede desestabilizar plantas rápidas.</w:t>
+        <w:t>1. **Frecuencia de muestreo y margen de fase en tiempo real:** En nuestros experimentos, el controlador de 5 términos requiere en promedio **10.065 ms** (`9.847 ms` en el mejor caso), mientras que el de 7 términos requiere **22.761 ms** ($2.26\times$ más) y el de 9 términos **36.585 ms** ($3.63\times$ más). En un lazo de control digital, una mayor latencia de cómputo introduce un retardo de transporte $e^{-s \tau_d}$ que reduce el margen de fase y limita la frecuencia máxima de muestreo.</w:t>
         <w:br/>
         <w:t>2. **Menor costo de hardware embebido (MCU/FPGA/PLC):** Un tiempo de inferencia tres veces menor permite implementar el controlador en microcontroladores de menor frecuencia de reloj y menor costo unitario.</w:t>
         <w:br/>
         <w:t>3. **Menor consumo energético y térmico** del procesador de control.</w:t>
         <w:br/>
-        <w:t>4. **Capacidad multitarea:** Deja tiempo de CPU libre en cada período de muestreo para diagnóstico de fallas, telemetría y seguridad funcional.</w:t>
+        <w:t>4. **Capacidad multitarea:** Deja tiempo de CPU libre en cada período de muestreo ($\Delta t = 100\text{ ms}$) para diagnóstico de fallas, telemetría y seguridad funcional.</w:t>
       </w:r>
     </w:p>
     <w:p>
@@ -1802,9 +1844,9 @@
         <w:br/>
         <w:t>**No es significativa ni estadística ni prácticamente:**</w:t>
         <w:br/>
-        <w:t>1. **Desde el punto de vista estadístico:** En nuestros experimentos de 5 corridas independientes, la desviación estándar del fitness entre semillas es de **$\pm 0.0713$ ($\pm 8.6\%$)** para 5 términos y **$\pm 0.0472$ ($\pm 6.1\%$)** para 9 términos. Una diferencia de apenas $1\%$ ($\approx 0.008$ unidades de fitness) es un orden de magnitud menor que la varianza estocástica natural del algoritmo genético entre semillas (no supera ninguna prueba $t$ de Student ni de Mann-Whitney).</w:t>
-        <w:br/>
-        <w:t>2. **Desde el punto de vista práctico/ingenieril:** Pagar un factor de $3\times$ en latencia de inferencia, $4\times$ en memoria y $8\times$ en tiempo de diseño por una diferencia del $1\%$ que es indistinguible del ruido numérico carece de toda justificación costo-beneficio. (De hecho, en nuestros resultados reales, 9 términos ni siquiera mejoró el $1\%$, sino que obtuvo un fitness promedio **$7.0\%$ menor** que el de 5 términos: $0.7678$ vs $0.8257$).</w:t>
+        <w:t>1. **Desde el punto de vista estadístico:** En nuestros experimentos de 5 corridas independientes, la desviación estándar del fitness entre semillas es de **$\pm 0.0488$ ($\pm 6.8\%$)** para 5 términos, **$\pm 0.0593$ ($\pm 8.1\%$)** para 7 términos y **$\pm 0.0649$ ($\pm 9.1\%$)** para 9 términos. Una diferencia de apenas $\sim 1\%$ ($\approx 0.008$ unidades de fitness, exactamente como la diferencia observada entre la media de 7 términos `$0.7299` y la de 5 términos `$0.7218`, que es del $+1.12\%$) es mucho menor que la desviación estándar estocástica entre semillas ($\pm 0.0488$ a $\pm 0.0649$), por lo que no es estadísticamente significativa.</w:t>
+        <w:br/>
+        <w:t>2. **Desde el punto de vista práctico/ingenieril:** Pagar factores de $3\times$ a $4\times$ en latencia de inferencia y memoria por una diferencia del $1\%$ que es indistinguible del ruido estocástico carece de justificación costo-beneficio cuando se opera con recursos embebidos restringidos. (De hecho, en nuestros resultados reales, 9 términos ni siquiera superó en promedio a 5 términos: obtuvo $0.7134$ vs $0.7218$).</w:t>
       </w:r>
     </w:p>
     <w:p>
@@ -1823,13 +1865,13 @@
         <w:br/>
         <w:t>**No puede considerarse necesariamente un óptimo global.**</w:t>
         <w:br/>
-        <w:t>* **Exploración:** Es la capacidad del algoritmo genético para muestrear regiones diversas y desconocidas del espacio de búsqueda $\mathbb{R}^{9N + 2N^2}$ (mediante la población inicial aleatoria, la cruza de individuos distantes y la mutación).</w:t>
+        <w:t>* **Exploración:** Es la capacidad del algoritmo genético para muestrear regiones diversas y desconocidas del espacio de búsqueda $\mathbb{R}^{9N + 2N^2}$ (mediante la población inicial diversa, la cruza de individuos distantes y la mutación).</w:t>
         <w:br/>
         <w:t>* **Explotación:** Es la capacidad de refinar intensivamente las mejores soluciones actuales (mediante la selección por torneo y el elitismo `keep_elitism = 2`).</w:t>
         <w:br/>
-        <w:t>* **Óptimo local vs. Óptimo global:** La función de aptitud (Ec. 12) evaluada sobre la dinámica no lineal del controlador Mamdani acoplado a $G(s)$ define un paisaje altamente multimodal y discontinuo (debido a los umbrales de activación de reglas y los cruces de las bandas del 10%, 90% y 5%). Un **óptimo local** es un cromosoma que supera a todos sus vecinos inmediatos pero no es el máximo absoluto de todo el espacio admisible (**óptimo global**).</w:t>
-        <w:br/>
-        <w:t>* **Evidencia experimental:** El hecho de que las 5 semillas independientes del Controlador A hayan convergido a 5 valores finales distintos ($0.8992, 0.8504, 0.8493, 0.8212$ y $0.7084$) demuestra empíricamente que PyGAD converge a distintos óptimos locales dependiendo de la trayectoria estocástica de cada semilla.</w:t>
+        <w:t>* **Óptimo local vs. Óptimo global:** La función de aptitud (Ec. 12) evaluada sobre la dinámica no lineal del controlador Mamdani acoplado a $G(s)$ mediante `lsim` define un paisaje altamente multimodal y no convexo (debido a los umbrales de activación de reglas y los cruces de las bandas del 10%, 90% y 5%). Un **óptimo local** es un cromosoma que supera a todos sus vecinos inmediatos pero no es el máximo absoluto de todo el espacio admisible (**óptimo global**).</w:t>
+        <w:br/>
+        <w:t>* **Evidencia experimental:** El hecho de que las 5 semillas independientes del Controlador B (7 términos) hayan convergido a 5 valores finales distintos ($0.8199, 0.7550, 0.7159, 0.6796$ y $0.6789$) y las 5 semillas del Controlador A (5 términos) a ($0.7616, 0.7554, 0.7499, 0.6924$ y $0.6499$) demuestra empíricamente que PyGAD converge a distintos óptimos locales dependiendo de la trayectoria estocástica de cada semilla.</w:t>
       </w:r>
     </w:p>
     <w:p>
@@ -1848,9 +1890,9 @@
         <w:br/>
         <w:t>Porque los algoritmos genéticos son **procesos estocásticos** cuyos resultados dependen de la secuencia pseudoaleatoria utilizada en la inicialización de la población, la selección de padres, los puntos de cruza y los genes mutados.</w:t>
         <w:br/>
-        <w:t>* **Problema metodológico que se evita:** Se evita la **falacia de instancia única** y el **sesgo de selección (*cherry-picking*)**, que ocurrirían si se evaluara cada arquitectura con una sola corrida (donde una configuración inferior podría verse favorecida por una semilla afortunada o una configuración superior podría quedar descartada por una mala inicialización).</w:t>
-        <w:br/>
-        <w:t>* **Evidencia en nuestros resultados:** Si solo hubiéramos ejecutado la **semilla 2026** (Corrida 3), habríamos obtenido un fitness de $0.7084$ para 5 términos y $0.7570$ para 9 términos, concluyendo erróneamente que 9 términos es mejor que 5 términos. Al ejecutar las 5 semillas independientes (`[42, 100, 2026, 777, 999]`), la estadística completa revela que 5 términos tiene una media superior ($0.8257 \pm 0.0713$ vs $0.7678 \pm 0.0472$) y un máximo superior ($0.8992$ vs $0.8133$).</w:t>
+        <w:t>* **Problema metodológico que se evita:** Se evita la **falacia de instancia única** y el **sesgo de selección (*cherry-picking*)**, que ocurrirían si se evaluara cada arquitectura con una sola corrida (donde una configuración podría verse favorecida por una semilla afortunada o descartada por una mala inicialización).</w:t>
+        <w:br/>
+        <w:t>* **Evidencia en nuestros resultados:** Si solo hubiéramos ejecutado la **semilla 100** (Corrida 2), habríamos obtenido un fitness de $0.7554$ para 5 términos, $0.6789$ para 7 términos y $0.6155$ para 9 términos; en cambio, si solo hubiéramos ejecutado la **semilla 777** (Corrida 4), habríamos obtenido $0.6499$ para 5 términos, $0.7159$ para 7 términos y $0.7327$ para 9 términos (¡un ordenamiento completamente opuesto!). Al ejecutar las 5 semillas independientes (`[42, 100, 2026, 777, 999]`), la estadística completa ($0.7218 \pm 0.0488$, $0.7299 \pm 0.0593$ y $0.7134 \pm 0.0649$) permite caracterizar objetivamente la tendencia central y la dispersión de cada arquitectura.</w:t>
       </w:r>
     </w:p>
     <w:p>
@@ -1867,11 +1909,11 @@
       <w:r>
         <w:t>**Respuesta:**</w:t>
         <w:br/>
-        <w:t>Porque el valor máximo aislado es un estadístico de extremo que **oculta la varianza, la sensibilidad a la inicialización y la tasa de fallo del método de optimización**:</w:t>
-        <w:br/>
-        <w:t>* **Evidencia experimental:** En el controlador de **7 términos**, la mejor corrida (semilla 42) alcanzó un excelente fitness de **0.8879**, muy cercano al máximo de 5 términos (**0.8992**). Si solo se reportara ese máximo, parecería que optimizar 7 términos es igual de eficaz y confiable que optimizar 5 términos.</w:t>
-        <w:br/>
-        <w:t>* Sin embargo, al observar las 5 corridas de 7 términos ($0.8879, 0.8288, 0.7558, 0.7082, 0.6833$), su promedio cae a **$0.7728 \pm 0.0849$**, mostrando una dispersión mayor y menor repetibilidad que 5 términos ($0.8257 \pm 0.0713$, donde 4 de las 5 semillas superaron $0.82$). Reportar media y desviación estándar es indispensable para evaluar la robustez del diseño evolutivo.</w:t>
+        <w:t>Porque el valor máximo aislado es un estadístico de extremo que **oculta la varianza, la sensibilidad a la inicialización y la consistencia del método de optimización**:</w:t>
+        <w:br/>
+        <w:t>* **Evidencia experimental:** En el controlador de **9 términos**, la mejor corrida (semilla 999) alcanzó un fitness alto de **0.7946** (superando al máximo de 5 términos, **0.7616**). Si solo se reportara ese máximo, se concluiría que el controlador de 9 términos es superior al de 5 términos.</w:t>
+        <w:br/>
+        <w:t>* Sin embargo, al observar las 5 corridas de 9 términos ($0.7946, 0.7327, 0.7247, 0.6998, 0.6155$), su promedio cae a **$0.7134 \pm 0.0649$** (inferior al promedio de 5 términos, **$0.7218 \pm 0.0488$**, y al de 7 términos, **$0.7299 \pm 0.0593$**), mostrando además la mayor desviación estándar del estudio. Reportar media y desviación estándar es indispensable para evaluar la robustez real del diseño evolutivo.</w:t>
       </w:r>
     </w:p>
     <w:p>
@@ -1888,15 +1930,15 @@
       <w:r>
         <w:t>**Respuesta:**</w:t>
         <w:br/>
-        <w:t>En nuestros experimentos esto se observa de manera notable en el controlador de **5 términos** entre la **Corrida 4 (semilla 777)** y la **Corrida 5 (semilla 999)**, que alcanzaron valores de fitness prácticamente idénticos (**0.8504** y **0.8493**, diferencia de $0.0011$), o en **9 términos** entre la **Corrida 1 (semilla 42, 63 reglas activas, fitness = 0.8027)** y la **Corrida 4 (semilla 777, 45 reglas activas, fitness = 0.8133)**.</w:t>
+        <w:t>En nuestros experimentos esto se observa de manera notable en el controlador de **5 términos** entre la **Corrida 1 (semilla 42, 15 reglas activas, fitness = 0.7499)**, la **Corrida 2 (semilla 100, 20 reglas activas, fitness = 0.7554)** y la **Corrida 5 (semilla 999, 16 reglas activas, fitness = 0.7616)**, o en **7 términos** entre la **Corrida 2 (semilla 100, 29 reglas activas, fitness = 0.6789)** y la **Corrida 3 (semilla 2026, 37 reglas activas, fitness = 0.6796)**.</w:t>
         <w:br/>
         <w:t>Esto indica tres propiedades estructurales del espacio de búsqueda:</w:t>
         <w:br/>
         <w:t>1. **Alta multimodalidad:** Existen múltiples cuencas de atracción con alturas de aptitud casi idénticas distribuidas en regiones distantes del espacio de parámetros.</w:t>
         <w:br/>
-        <w:t>2. **Equifinalidad y redundancia funcional (sobreparametrización):** Diferentes combinaciones de centros de funciones de membresía, solapamientos y subconjuntos de reglas activas producen leyes de control $v(e, \Delta e)$ equivalentes sobre la trayectoria visitada por el servomotor.</w:t>
-        <w:br/>
-        <w:t>3. **Compensación entre métricas en la suma ponderada (Ec. 12):** Un individuo puede lograr el mismo fitness total compensando un menor $t_r^+$ con un menor $SSE^-$ o menor $OS^+$.</w:t>
+        <w:t>2. **Equifinalidad y redundancia funcional (sobreparametrización):** Diferentes combinaciones de parámetros triangulares $a &lt; b &lt; c$, traslapes y subconjuntos de reglas activas producen leyes de control $v(e, \Delta e)$ con aptitud global similar sobre la trayectoria visitada por el servomotor.</w:t>
+        <w:br/>
+        <w:t>3. **Compensación entre métricas en la suma ponderada (Ec. 12):** Por ejemplo, en 5 términos, la semilla 100 logra tiempos más rápidos y simétricos ($t_r^+ = 11.70\text{ s}, t_r^- = 16.60\text{ s}, t_s^+ = 16.10\text{ s}, t_s^- = 25.50\text{ s}$) con un pequeño sobreimpulso $OS^- = 1.2194\%$, mientras que la semilla 999 logra $OS^- = 0.0000\%$ y menor $SSE$ a costa de un mayor $t_r^- = 30.40\text{ s}$, sumando casi exactamente el mismo fitness total ($0.7554$ vs $0.7616$).</w:t>
       </w:r>
     </w:p>
     <w:p>
@@ -1913,13 +1955,13 @@
       <w:r>
         <w:t>**Respuesta:**</w:t>
         <w:br/>
-        <w:t>**Sí.** Para el problema de control del servomotor $G(s)$ optimizado evolutivamente bajo las condiciones del protocolo experimental ($T_{\text{sim}}=200\text{ s}$, presupuesto de 30 generaciones $\times$ 20 individuos), **el número óptimo dentro del conjunto evaluado es $N = 5$ términos lingüísticos por variable (Controlador A)**:</w:t>
-        <w:br/>
-        <w:t>* **Evidencia en desempeño:** Obtiene el mayor fitness promedio (**0.8257 $\pm$ 0.0713**) y el mayor fitness máximo (**0.8992**), con el menor tiempo de subida promedio ($t_r^+ = 14.10\text{ s}$, $10.05\text{ s}$ en el mejor caso) y el menor tiempo de establecimiento promedio ($t_s^+ = 21.60\text{ s}$, $13.30\text{ s}$ en el mejor caso).</w:t>
-        <w:br/>
-        <w:t>* **Evidencia en parsimonia y cómputo:** Requiere el menor número de genes (**95** vs 161 y 243), el menor número de reglas activas (**11** en el mejor caso, media **17.2**), el menor tiempo de optimización (**16.16 s**), el menor tiempo de inferencia (**6.640 ms** de media, **4.497 ms** en el mejor) y el menor uso de memoria (**0.486 MB**).</w:t>
-        <w:br/>
-        <w:t>* Aumentar a 7 o 9 términos sobrepasa el punto de rendimientos decrecientes: el espacio de búsqueda crece más rápido de lo que el algoritmo genético puede explotar, degradando la convergencia media y encareciendo la inferencia hasta $4.4\times$.</w:t>
+        <w:t>**Sí.** A partir de los resultados obtenidos, el número óptimo depende de si se prioriza el **desempeño dinámico absoluto** o la **eficiencia computacional y parsimonia**, pero en ambos casos se encuentra entre **$N = 5$ y $N = 7$ términos lingüísticos** (descartando $N = 9$):</w:t>
+        <w:br/>
+        <w:t>* **Si se prioriza la precisión y simetría dinámica máxima ($N = 7$, Controlador B):** Obtiene el **mayor fitness promedio ($0.7299 \pm 0.0593$)** y el **mayor fitness máximo absoluto ($0.8199$**, semilla 42), siendo capaz de alcanzar tiempos rápidos y simétricos en ambas transiciones ($t_r^+ = 13.40\text{ s}, t_r^- = 11.70\text{ s}, t_s^+ = 17.60\text{ s}, t_s^- = 15.60\text{ s}$) con errores estacionarios mínimos ($SSE^+ = 0.0063\text{ rad}, SSE^- = 0.0060\text{ rad}$) y bajo sobreimpulso ($OS^+ = 0.7896\%, OS^- = 0.0000\%$).</w:t>
+        <w:br/>
+        <w:t>* **Si se prioriza el compromiso desempeño/complejidad en hardware restringido ($N = 5$, Controlador A):** Alcanza un fitness promedio prácticamente idéntico (**$0.7218 \pm 0.0488$**, apenas $1.1\%$ menor que 7 términos y con la menor desviación estándar del estudio), pero utilizando **menos de la mitad de reglas activas** ($16/25$, media $17.4$), **$2.26\times$ menos tiempo de inferencia** ($10.065 ms vs $22.761 ms) y **$1.80\times$ menos memoria** ($0.491 MB vs $0.884 MB).</w:t>
+        <w:br/>
+        <w:t>* Pasar a **$N = 9$ términos** supera el punto de rendimientos decrecientes: reduce el fitness promedio a **$0.7134$** mientras eleva el tiempo de inferencia a **$36.585 ms** y la memoria a **$1.436 MB**.</w:t>
       </w:r>
     </w:p>
     <w:p>
@@ -1943,18 +1985,22 @@
         <w:br/>
         <w:t>| :--- | :--- | :--- | :--- |</w:t>
         <w:br/>
-        <w:t>| **Desempeño (Fitness media ± DE / máx)** | **0.8257 ± 0.0713** / **0.8992** | 0.7728 ± 0.0849 / 0.8879 | 0.7678 ± 0.0472 / 0.8133 |</w:t>
-        <w:br/>
-        <w:t>| **Ventajas demostradas** | Más rápido en respuesta transitoria ($t_r^+=10.05\text{ s}, t_s^+=13.30\text{ s}$ en el mejor); máxima poda de reglas (11/25); inferencia más veloz (4.50 ms) y mínima memoria (0.42 MB). | En su mejor corrida (semilla 42) logra el menor error estacionario simétrico ($SSE^+=0.0115, SSE^-=0.0115\text{ rad}$) y bajo $OS^+=0.0124$. | Alta resolución granular potencial en el baseline sin optimizar ($0.6459$), aunque desaprovechada en GA por alta dimensionalidad. |</w:t>
-        <w:br/>
-        <w:t>| **Desventajas observadas** | En su mejor corrida presenta un ligero sobreimpulso positivo ($OS^+=0.0321$, 3.21%) por su alta agresividad de subida. | Mayor varianza entre semillas ($\text{DE}=0.0849$) y $2.77\times$ más tiempo de inferencia promedio (18.37 ms vs 6.64 ms). | Espacio de 243 genes difícil de converger en 30 generaciones; $4.44\times$ más lento en inferencia (29.51 ms) y $2.90\times$ más memoria (1.41 MB). |</w:t>
-        <w:br/>
-        <w:t>| **Impacto del costo computacional** | Óptimo: 16.16 s de optimización, 6.64 ms de inferencia y 0.49 MB. | Moderado-alto: 17.34 s de optimización, 18.37 ms de inferencia (+177%) y 0.96 MB (+97%). | Elevado: 24.35 s de optimización (+51%), 29.51 ms de inferencia (+344%) y 1.41 MB (+190%). |</w:t>
+        <w:t>| **Desempeño (Fitness media ± DE / máx)** | 0.7218 ± 0.0488 / 0.7616 | **0.7299 ± 0.0593** / **0.8199** | 0.7134 ± 0.0649 / 0.7946 |</w:t>
+        <w:br/>
+        <w:t>| **Ventajas demostradas** | Mínima complejidad (95 genes, 16/25 reglas activas); inferencia más veloz (10.065 ms), mínima memoria (0.491 MB) y menor dispersión entre semillas (DE = 0.0488). | Mayor fitness máximo (0.8199) y promedio (0.7299); respuesta rápida y simétrica en ambos sentidos ($t_r^+=13.40\text{ s}, t_r^-=11.70\text{ s}, t_s^+=17.60\text{ s}, t_s^-=15.60\text{ s}$) y mínimo $SSE^{\pm} \approx 0.006\text{ rad}$. | En su mejor corrida (semilla 999) logra buen desempeño ($f=0.7946, t_s^-=15.10\text{ s}$), aunque con alto costo computacional. |</w:t>
+        <w:br/>
+        <w:t>| **Desventajas observadas** | En la semilla 999 presenta asimetría en el tiempo de bajada ($t_r^-=30.40\text{ s}$), aunque en la semilla 100 logra $t_r^+=11.70\text{ s}, t_r^-=16.60\text{ s}$. | Requiere $2.26\times$ más tiempo de inferencia (22.761 ms) y $1.80\times$ más memoria (0.884 MB) que 5 términos. | Espacio de 243 genes difícil de converger (menor fitness medio 0.7134); $3.63\times$ más lento en inferencia (36.585 ms) y $2.92\times$ más memoria (1.436 MB). |</w:t>
+        <w:br/>
+        <w:t>| **Impacto del costo computacional** | Muy bajo: 169.63 s de optimización, 10.065 ms de inferencia y 0.491 MB. | Moderado: 172.32 s de optimización, 22.761 ms de inferencia (+126%) y 0.884 MB (+80%). | Elevado: 181.87 s de optimización, 36.585 ms de inferencia (+263%) y 1.436 MB (+192%). |</w:t>
       </w:r>
     </w:p>
     <w:p>
       <w:r>
-        <w:t>* **Determinación del mejor equilibrio entre desempeño y complejidad:** El **Controlador A (5 términos lingüísticos)** domina en el sentido de Pareto al Controlador C en todos los criterios y supera al Controlador B en fitness promedio, fitness máximo, rapidez de respuesta, parsimonia de reglas, tiempo de optimización, tiempo de inferencia y uso de memoria. Por tanto, el **Controlador A (5 términos)** representa indiscutiblemente el mejor equilibrio entre desempeño y complejidad.</w:t>
+        <w:t>* **Determinación del mejor equilibrio entre desempeño y complejidad:**</w:t>
+        <w:br/>
+        <w:t xml:space="preserve">  * Desde el punto de vista de **desempeño de control simétrico vs. complejidad moderada**, el **Controlador B (7 términos, semilla 42)** logra el mejor desempeño global (**fitness = 0.8199**, $t_s^+ = 17.60\text{ s}, t_s^- = 15.60\text{ s}$, $SSE^{\pm} \approx 0.006\text{ rad}$) manteniendo un tiempo de inferencia de **24.498 ms** que cabe más de 4 veces dentro del paso de muestreo $\Delta t = 100\text{ ms}$.</w:t>
+        <w:br/>
+        <w:t xml:space="preserve">  * Desde el punto de vista de **eficiencia computacional estricta y parsimonia**, el **Controlador A (5 términos)** obtiene prácticamente el mismo fitness promedio ($0.7218$ vs $0.7299$) con menos de la mitad de reglas activas ($16/25$), la mitad de tiempo de inferencia ($10.065 ms) y la mitad de memoria ($0.491 MB).</w:t>
       </w:r>
     </w:p>
     <w:p>
@@ -1984,34 +2030,36 @@
       <w:r>
         <w:t>* **a. Análisis del compromiso (*trade-off*) entre desempeño y complejidad:**</w:t>
         <w:br/>
-        <w:t xml:space="preserve">  Los resultados demuestran que la relación entre complejidad estructural ($N \in \{5, 7, 9\}$) y desempeño efectivo tras la optimización evolutiva **no es monótona creciente**. Mientras que la complejidad paramétrica crece de **95 a 161 y 243 genes** y la base de reglas crece cuadráticamente de **25 a 49 y 81 reglas**, el costo de inferencia se multiplica de **6.640 ms a 18.372 ms y 29.512 ms** y el consumo de memoria sube de **0.486 MB a 0.958 MB y 1.407 MB**. Lejos de obtener un retorno positivo por esa complejidad adicional, la dificultad de optimizar 161 o 243 parámetros simultáneamente en 30 generaciones reduce el fitness promedio de **0.8257** (5 términos) a **0.7728** (7 términos) y **0.7678** (9 términos). Además, la poda evolutiva de reglas demuestra que eliminar reglas innecesarias (dejando solo 11/25 reglas en el mejor controlador de 5 términos) mejora simultáneamente el desempeño dinámico y la velocidad de inferencia.</w:t>
+        <w:t xml:space="preserve">  Los resultados demuestran que la relación entre complejidad estructural ($N \in \{5, 7, 9\}$) y desempeño efectivo tras la optimización evolutiva presenta una curva con un máximo intermedio en $N=7$ y degradación en $N=9$. Mientras que la complejidad paramétrica crece de **95 a 161 y 243 genes** y la base de reglas crece cuadráticamente de **25 a 49 y 81 reglas**, el costo de inferencia se multiplica de **10.065 ms a 22.761 ms y 36.585 ms** y el consumo de memoria sube de **0.491 MB a 0.884 MB y 1.436 MB**. Pasar de 5 a 7 términos aporta suficiente flexibilidad para mejorar el fitness máximo de **0.7616 a 0.8199** (y la media de $0.7218$ a $0.7299$), pero pasar de 7 a 9 términos provoca una caída en el fitness promedio a **$0.7134$** y en el máximo a **$0.7946$** debido a la maldición de la dimensionalidad.</w:t>
       </w:r>
     </w:p>
     <w:p>
       <w:r>
         <w:t>* **b. ¿Incrementar el número de términos produjo una mejora real o únicamente mayor complejidad?**</w:t>
         <w:br/>
-        <w:t xml:space="preserve">  Produjo **únicamente una mayor complejidad estructural y computacional sin una mejora real en el desempeño optimizado**. En la Fase 1 (Baselines con `automf` sin optimizar), pasar de 5 a 9 términos apenas mejoró el fitness de $0.6319$ a $0.6459$ ($+0.0140$) a cambio de quintuplicar el tiempo de inferencia ($10.258\text{ ms} \to 52.314\text{ ms}$). Una vez aplicada la optimización genética (Fase 2–5), el controlador de 5 términos superó ampliamente a los de 7 y 9 términos tanto en promedio como en el mejor individuo encontrado.</w:t>
+        <w:t xml:space="preserve">  * Incrementar de **5 a 7 términos** produjo una **mejora moderada en el mejor individuo encontrado** (`0.7616` $\to$ `0.8199`, logrando simetría completa en $t_r^{\pm}$ y $t_s^{\pm}$), aunque en el promedio de las 5 semillas la diferencia fue de solo $+1.12\%$ (`0.7218` $\to$ `0.7299`) a cambio de $+126\%$ en tiempo de inferencia y $+80\%$ en memoria.</w:t>
+        <w:br/>
+        <w:t xml:space="preserve">  * Incrementar de **7 a 9 términos** produjo **únicamente mayor complejidad estructural y computacional sin mejora real**, reduciendo tanto el fitness promedio (`0.7299` $\to$ `0.7134`) como el fitness máximo (`0.8199` $\to$ `0.7946`) y encareciendo la inferencia en $+263\%$ respecto a 5 términos.</w:t>
       </w:r>
     </w:p>
     <w:p>
       <w:r>
         <w:t>* **c. Elección para una aplicación industrial real:**</w:t>
         <w:br/>
-        <w:t xml:space="preserve">  Seleccionaría e implementaría en planta el **Controlador A optimizado de 5 términos lingüísticos (específicamente el genotipo obtenido con la semilla 42)**, y como alternativa secundaria de alta precisión estacionaria el **Controlador B de 7 términos (semilla 42)** únicamente si el hardware dispone de margen de tiempo de cómputo holgado.</w:t>
+        <w:t xml:space="preserve">  * Si la aplicación industrial requiere **máxima precisión de posicionamiento bidireccional y rapidez simétrica** y el controlador corre en un procesador industrial estándar donde $24.5\text{ ms} &lt; \Delta t = 100\text{ ms}$, utilizaría el **Controlador B optimizado de 7 términos (semilla 42)**.</w:t>
+        <w:br/>
+        <w:t xml:space="preserve">  * Si la aplicación industrial se despliega en un **microcontrolador embebido de bajo costo con memoria y CPU severamente limitados**, utilizaría el **Controlador A optimizado de 5 términos** (semilla 100 para respuesta simétrica rápida $t_r^+=11.70\text{ s}, t_r^-=16.60\text{ s}$ o semilla 999 para mínimo sobreimpulso).</w:t>
       </w:r>
     </w:p>
     <w:p>
       <w:r>
         <w:t>* **d. Justificación basada exclusivamente en la evidencia experimental obtenida:**</w:t>
         <w:br/>
-        <w:t xml:space="preserve">  1. **Superioridad en aptitud multiobjetivo:** El Controlador A (5 términos) obtuvo el **mayor fitness máximo (0.8992)** y el **mayor fitness promedio en las 5 corridas (0.8257 $\pm$ 0.0713)** frente a $0.7728 \pm 0.0849$ (7 términos) y $0.7678 \pm 0.0472$ (9 términos).</w:t>
-        <w:br/>
-        <w:t xml:space="preserve">  2. **Respuesta transitoria rápida y estable en ambas transiciones:** En el mejor individuo de 5 términos, el tiempo de crecimiento positivo fue $t_r^+ = 10.05\text{ s}$ (cercano al ideal $t_r^0 = 9.0\text{ s}$) y el de establecimiento $t_s^+ = 13.30\text{ s}$ (prácticamente igual a la referencia $t_s^0 = 13.0\text{ s}$), con $OS^- = 0.0000$, $OS^+ = 0.0321$, $SSE^+ = 0.0298\text{ rad}$ y $SSE^- = 0.0334\text{ rad}$, cumpliendo holgadamente la banda del $\pm 5\%$ ($0.05\text{ rad}$).</w:t>
-        <w:br/>
-        <w:t xml:space="preserve">  3. **Mínima latencia de inferencia para control en tiempo real:** El mejor controlador de 5 términos ejecuta `controller.compute()` en **4.497 ms** (promedio de las 5 corridas: **6.640 $\pm$ 1.401 ms**), lo cual representa **3.65 veces menos tiempo** que el mejor de 7 términos (**16.431 ms**) y **5.53 veces menos tiempo** que el mejor de 9 términos (**24.861 ms**), cabiendo cómodamente dentro del período de muestreo $\Delta t = 50\text{ ms}$.</w:t>
-        <w:br/>
-        <w:t xml:space="preserve">  4. **Mínima huella de memoria y máxima auditabilidad:** Consume apenas **0.422 MB** de memoria (media **0.486 $\pm$ 0.039 MB**, casi 3 veces menos que los **1.407 MB** de 9 términos) y opera con solo **11 reglas activas**, permitiendo que un ingeniero de planta inspeccione, verifique y dé mantenimiento a la base de reglas completa de forma directa.</w:t>
+        <w:t xml:space="preserve">  1. **Desempeño dinámico y estacionario verificado con `scipy.signal.lsim`:** El Controlador B (7 términos, semilla 42) obtuvo el **mayor fitness global (0.8199)** y la **mayor media (0.7299 $\pm$ 0.0593)**, logrando $t_r^+ = 13.40\text{ s}, t_r^- = 11.70\text{ s}$, $t_s^+ = 17.60\text{ s}, t_s^- = 15.60\text{ s}$, errores en estado estacionario casi nulos ($SSE^+ = 0.0063\text{ rad}, SSE^- = 0.0060\text{ rad}$, muy por debajo de la tolerancia de $0.05\text{ rad}$) y sobreimpulsos mínimos ($OS^+ = 0.7896\%, OS^- = 0.0000\%$).</w:t>
+        <w:br/>
+        <w:t xml:space="preserve">  2. **Eficiencia computacional del Controlador A (5 términos):** Logró un fitness promedio de **0.7218 $\pm$ 0.0488** (máximo **0.7616**) operando con solo **16/25 reglas activas** (media $17.4 \pm 3.4$), el menor tiempo de inferencia (**10.065 $\pm$ 0.762 ms**), el menor tiempo de optimización (**169.63 s**) y la menor huella de memoria (**0.491 MB**).</w:t>
+        <w:br/>
+        <w:t xml:space="preserve">  3. **Descarte cuantitativo del Controlador C (9 términos):** Obtuvo el menor fitness promedio (**0.7134 $\pm$ 0.0649**), la mayor dispersión entre semillas, el mayor tiempo de optimización (**181.87 s**), el mayor tiempo de inferencia (**36.585 ms**) y el mayor consumo de memoria (**1.436 MB**).</w:t>
       </w:r>
     </w:p>
     <w:sectPr>

</xml_diff>

<commit_message>
docs: regenracion de archivos
</commit_message>
<xml_diff>
--- a/Reporte_Parcial2_ComputacionFlexible.docx
+++ b/Reporte_Parcial2_ComputacionFlexible.docx
@@ -126,7 +126,7 @@
           </w:tcPr>
           <w:p>
             <w:r>
-              <w:t>0.7218 ± 0.0488</w:t>
+              <w:t>0.7639 ± 0.0248</w:t>
             </w:r>
           </w:p>
         </w:tc>
@@ -136,7 +136,7 @@
           </w:tcPr>
           <w:p>
             <w:r>
-              <w:t>0.7299 ± 0.0593</w:t>
+              <w:t>0.7663 ± 0.0357</w:t>
             </w:r>
           </w:p>
         </w:tc>
@@ -146,7 +146,7 @@
           </w:tcPr>
           <w:p>
             <w:r>
-              <w:t>0.7134 ± 0.0649</w:t>
+              <w:t>0.7225 ± 0.0821</w:t>
             </w:r>
           </w:p>
         </w:tc>
@@ -168,7 +168,7 @@
           </w:tcPr>
           <w:p>
             <w:r>
-              <w:t>0.7616 (semilla 999)</w:t>
+              <w:t>0.7936 (semilla 100)</w:t>
             </w:r>
           </w:p>
         </w:tc>
@@ -178,7 +178,7 @@
           </w:tcPr>
           <w:p>
             <w:r>
-              <w:t>0.8199 (semilla 42)</w:t>
+              <w:t>0.8071 (semilla 42)</w:t>
             </w:r>
           </w:p>
         </w:tc>
@@ -188,7 +188,7 @@
           </w:tcPr>
           <w:p>
             <w:r>
-              <w:t>0.7946 (semilla 999)</w:t>
+              <w:t>0.8599 (semilla 100)</w:t>
             </w:r>
           </w:p>
         </w:tc>
@@ -210,7 +210,7 @@
           </w:tcPr>
           <w:p>
             <w:r>
-              <w:t>0.0577 (0.0115 ± 0.0258)</w:t>
+              <w:t>0.1484 (0.0297 ± 0.0663)</w:t>
             </w:r>
           </w:p>
         </w:tc>
@@ -220,7 +220,7 @@
           </w:tcPr>
           <w:p>
             <w:r>
-              <w:t>0.7896 (1.2004 ± 1.3434)</w:t>
+              <w:t>0.0000 (0.5584 ± 0.7607)</w:t>
             </w:r>
           </w:p>
         </w:tc>
@@ -230,7 +230,7 @@
           </w:tcPr>
           <w:p>
             <w:r>
-              <w:t>0.0000 (0.4326 ± 0.9673)</w:t>
+              <w:t>0.0000 (0.0000 ± 0.0000)</w:t>
             </w:r>
           </w:p>
         </w:tc>
@@ -252,7 +252,17 @@
           </w:tcPr>
           <w:p>
             <w:r>
-              <w:t>0.0000 (0.2439 ± 0.5453)</w:t>
+              <w:t>0.0000 (0.8171 ± 1.8272)</w:t>
+            </w:r>
+          </w:p>
+        </w:tc>
+        <w:tc>
+          <w:tcPr>
+            <w:tcW w:type="dxa" w:w="2160"/>
+          </w:tcPr>
+          <w:p>
+            <w:r>
+              <w:t>0.2676 (0.2381 ± 0.3100)</w:t>
             </w:r>
           </w:p>
         </w:tc>
@@ -263,16 +273,6 @@
           <w:p>
             <w:r>
               <w:t>0.0000 (0.0000 ± 0.0000)</w:t>
-            </w:r>
-          </w:p>
-        </w:tc>
-        <w:tc>
-          <w:tcPr>
-            <w:tcW w:type="dxa" w:w="2160"/>
-          </w:tcPr>
-          <w:p>
-            <w:r>
-              <w:t>1.3638 (1.2498 ± 1.9562)</w:t>
             </w:r>
           </w:p>
         </w:tc>
@@ -294,7 +294,7 @@
           </w:tcPr>
           <w:p>
             <w:r>
-              <w:t>0.0031 (0.0390 ± 0.0508)</w:t>
+              <w:t>0.0064 (0.1039 ± 0.1590)</w:t>
             </w:r>
           </w:p>
         </w:tc>
@@ -304,7 +304,7 @@
           </w:tcPr>
           <w:p>
             <w:r>
-              <w:t>0.0063 (0.0213 ± 0.0089)</w:t>
+              <w:t>0.0032 (0.0069 ± 0.0059)</w:t>
             </w:r>
           </w:p>
         </w:tc>
@@ -314,7 +314,7 @@
           </w:tcPr>
           <w:p>
             <w:r>
-              <w:t>0.0144 (0.0879 ± 0.1139)</w:t>
+              <w:t>0.0449 (0.0465 ± 0.0614)</w:t>
             </w:r>
           </w:p>
         </w:tc>
@@ -336,7 +336,7 @@
           </w:tcPr>
           <w:p>
             <w:r>
-              <w:t>0.0104 (0.0344 ± 0.0235)</w:t>
+              <w:t>0.0097 (0.0425 ± 0.0523)</w:t>
             </w:r>
           </w:p>
         </w:tc>
@@ -346,7 +346,7 @@
           </w:tcPr>
           <w:p>
             <w:r>
-              <w:t>0.0060 (0.0379 ± 0.0303)</w:t>
+              <w:t>0.0021 (0.0072 ± 0.0055)</w:t>
             </w:r>
           </w:p>
         </w:tc>
@@ -356,7 +356,7 @@
           </w:tcPr>
           <w:p>
             <w:r>
-              <w:t>0.0122 (0.0478 ± 0.0649)</w:t>
+              <w:t>0.0038 (0.0906 ± 0.1228)</w:t>
             </w:r>
           </w:p>
         </w:tc>
@@ -378,7 +378,7 @@
           </w:tcPr>
           <w:p>
             <w:r>
-              <w:t>11.70 (15.90 ± 5.82)</w:t>
+              <w:t>13.00 (21.60 ± 16.21)</w:t>
             </w:r>
           </w:p>
         </w:tc>
@@ -388,7 +388,7 @@
           </w:tcPr>
           <w:p>
             <w:r>
-              <w:t>13.40 (17.50 ± 5.85)</w:t>
+              <w:t>19.20 (17.78 ± 3.85)</w:t>
             </w:r>
           </w:p>
         </w:tc>
@@ -398,7 +398,7 @@
           </w:tcPr>
           <w:p>
             <w:r>
-              <w:t>14.70 (21.80 ± 16.08)</w:t>
+              <w:t>9.80 (16.40 ± 4.54)</w:t>
             </w:r>
           </w:p>
         </w:tc>
@@ -420,7 +420,7 @@
           </w:tcPr>
           <w:p>
             <w:r>
-              <w:t>30.40 (21.80 ± 9.01)</w:t>
+              <w:t>15.00 (17.88 ± 12.60)</w:t>
             </w:r>
           </w:p>
         </w:tc>
@@ -430,7 +430,7 @@
           </w:tcPr>
           <w:p>
             <w:r>
-              <w:t>11.70 (14.90 ± 3.99)</w:t>
+              <w:t>11.10 (13.48 ± 2.36)</w:t>
             </w:r>
           </w:p>
         </w:tc>
@@ -440,7 +440,7 @@
           </w:tcPr>
           <w:p>
             <w:r>
-              <w:t>11.30 (18.99 ± 10.64)</w:t>
+              <w:t>17.65 (28.99 ± 12.52)</w:t>
             </w:r>
           </w:p>
         </w:tc>
@@ -462,7 +462,7 @@
           </w:tcPr>
           <w:p>
             <w:r>
-              <w:t>16.80 (27.50 ± 15.23)</w:t>
+              <w:t>19.90 (30.72 ± 17.86)</w:t>
             </w:r>
           </w:p>
         </w:tc>
@@ -472,7 +472,7 @@
           </w:tcPr>
           <w:p>
             <w:r>
-              <w:t>17.60 (27.38 ± 10.96)</w:t>
+              <w:t>25.20 (23.10 ± 4.86)</w:t>
             </w:r>
           </w:p>
         </w:tc>
@@ -482,7 +482,7 @@
           </w:tcPr>
           <w:p>
             <w:r>
-              <w:t>18.60 (30.60 ± 17.79)</w:t>
+              <w:t>13.80 (25.72 ± 14.01)</w:t>
             </w:r>
           </w:p>
         </w:tc>
@@ -504,7 +504,7 @@
           </w:tcPr>
           <w:p>
             <w:r>
-              <w:t>40.40 (42.26 ± 10.17)</w:t>
+              <w:t>23.70 (23.57 ± 15.37)</w:t>
             </w:r>
           </w:p>
         </w:tc>
@@ -514,7 +514,7 @@
           </w:tcPr>
           <w:p>
             <w:r>
-              <w:t>15.60 (30.45 ± 16.94)</w:t>
+              <w:t>14.80 (17.38 ± 2.72)</w:t>
             </w:r>
           </w:p>
         </w:tc>
@@ -524,7 +524,7 @@
           </w:tcPr>
           <w:p>
             <w:r>
-              <w:t>15.10 (24.36 ± 14.90)</w:t>
+              <w:t>22.15 (38.51 ± 12.60)</w:t>
             </w:r>
           </w:p>
         </w:tc>
@@ -546,7 +546,7 @@
           </w:tcPr>
           <w:p>
             <w:r>
-              <w:t>16/25 (17.4 ± 3.4)</w:t>
+              <w:t>18/25 (18.4 ± 2.2)</w:t>
             </w:r>
           </w:p>
         </w:tc>
@@ -556,7 +556,7 @@
           </w:tcPr>
           <w:p>
             <w:r>
-              <w:t>39/49 (35.8 ± 4.1)</w:t>
+              <w:t>39/49 (32.2 ± 4.6)</w:t>
             </w:r>
           </w:p>
         </w:tc>
@@ -566,7 +566,7 @@
           </w:tcPr>
           <w:p>
             <w:r>
-              <w:t>58/81 (54.4 ± 7.8)</w:t>
+              <w:t>53/81 (59.4 ± 8.4)</w:t>
             </w:r>
           </w:p>
         </w:tc>
@@ -630,7 +630,7 @@
           </w:tcPr>
           <w:p>
             <w:r>
-              <w:t>169.63 ± 1.47 s</w:t>
+              <w:t>10349.80 ± 108.83 s</w:t>
             </w:r>
           </w:p>
         </w:tc>
@@ -640,7 +640,7 @@
           </w:tcPr>
           <w:p>
             <w:r>
-              <w:t>172.32 ± 0.76 s</w:t>
+              <w:t>10111.51 ± 417.47 s</w:t>
             </w:r>
           </w:p>
         </w:tc>
@@ -650,7 +650,7 @@
           </w:tcPr>
           <w:p>
             <w:r>
-              <w:t>181.87 ± 0.81 s</w:t>
+              <w:t>10334.25 ± 113.84 s</w:t>
             </w:r>
           </w:p>
         </w:tc>
@@ -672,7 +672,7 @@
           </w:tcPr>
           <w:p>
             <w:r>
-              <w:t>10.065 ± 0.762 ms</w:t>
+              <w:t>17.928 ± 11.362 ms</w:t>
             </w:r>
           </w:p>
         </w:tc>
@@ -682,7 +682,7 @@
           </w:tcPr>
           <w:p>
             <w:r>
-              <w:t>22.761 ± 2.088 ms</w:t>
+              <w:t>62.235 ± 29.745 ms</w:t>
             </w:r>
           </w:p>
         </w:tc>
@@ -692,7 +692,7 @@
           </w:tcPr>
           <w:p>
             <w:r>
-              <w:t>36.585 ± 5.642 ms</w:t>
+              <w:t>95.968 ± 40.747 ms</w:t>
             </w:r>
           </w:p>
         </w:tc>
@@ -714,7 +714,7 @@
           </w:tcPr>
           <w:p>
             <w:r>
-              <w:t>0.491 ± 0.037 MB</w:t>
+              <w:t>0.451 ± 0.011 MB</w:t>
             </w:r>
           </w:p>
         </w:tc>
@@ -724,7 +724,7 @@
           </w:tcPr>
           <w:p>
             <w:r>
-              <w:t>0.884 ± 0.071 MB</w:t>
+              <w:t>0.671 ± 0.012 MB</w:t>
             </w:r>
           </w:p>
         </w:tc>
@@ -734,7 +734,7 @@
           </w:tcPr>
           <w:p>
             <w:r>
-              <w:t>1.436 ± 0.205 MB</w:t>
+              <w:t>0.902 ± 0.043 MB</w:t>
             </w:r>
           </w:p>
         </w:tc>
@@ -753,40 +753,44 @@
         <w:pStyle w:val="Heading3"/>
       </w:pPr>
       <w:r>
-        <w:t>Controlador A (5 términos) — Semilla 999 (16/25 reglas activas)</w:t>
+        <w:t>Controlador A (5 términos) — Semilla 100 (18/25 reglas activas)</w:t>
       </w:r>
     </w:p>
     <w:p>
       <w:r>
-        <w:t>R01 (celda [1,1]): IF error IS NB AND derror IS NB THEN voltage IS PB</w:t>
-        <w:br/>
-        <w:t>R02 (celda [1,2]): IF error IS NB AND derror IS NS THEN voltage IS NB</w:t>
-        <w:br/>
-        <w:t>R03 (celda [1,3]): IF error IS NB AND derror IS ZE THEN voltage IS NS</w:t>
-        <w:br/>
-        <w:t>R04 (celda [1,4]): IF error IS NB AND derror IS PS THEN voltage IS ZE</w:t>
-        <w:br/>
-        <w:t>R06 (celda [2,1]): IF error IS NS AND derror IS NB THEN voltage IS NS</w:t>
-        <w:br/>
-        <w:t>R09 (celda [2,4]): IF error IS NS AND derror IS PS THEN voltage IS NS</w:t>
-        <w:br/>
-        <w:t>R10 (celda [2,5]): IF error IS NS AND derror IS PB THEN voltage IS NS</w:t>
+        <w:t>R01 (celda [1,1]): IF error IS NB AND derror IS NB THEN voltage IS NB</w:t>
+        <w:br/>
+        <w:t>R03 (celda [1,3]): IF error IS NB AND derror IS ZE THEN voltage IS NB</w:t>
+        <w:br/>
+        <w:t>R05 (celda [1,5]): IF error IS NB AND derror IS PB THEN voltage IS ZE</w:t>
+        <w:br/>
+        <w:t>R06 (celda [2,1]): IF error IS NS AND derror IS NB THEN voltage IS NB</w:t>
+        <w:br/>
+        <w:t>R07 (celda [2,2]): IF error IS NS AND derror IS NS THEN voltage IS PB</w:t>
+        <w:br/>
+        <w:t>R08 (celda [2,3]): IF error IS NS AND derror IS ZE THEN voltage IS ZE</w:t>
+        <w:br/>
+        <w:t>R10 (celda [2,5]): IF error IS NS AND derror IS PB THEN voltage IS PS</w:t>
         <w:br/>
         <w:t>R11 (celda [3,1]): IF error IS ZE AND derror IS NB THEN voltage IS NB</w:t>
         <w:br/>
-        <w:t>R15 (celda [3,5]): IF error IS ZE AND derror IS PB THEN voltage IS PB</w:t>
-        <w:br/>
-        <w:t>R17 (celda [4,2]): IF error IS PS AND derror IS NS THEN voltage IS NB</w:t>
+        <w:t>R13 (celda [3,3]): IF error IS ZE AND derror IS ZE THEN voltage IS NS</w:t>
+        <w:br/>
+        <w:t>R14 (celda [3,4]): IF error IS ZE AND derror IS PS THEN voltage IS ZE</w:t>
+        <w:br/>
+        <w:t>R15 (celda [3,5]): IF error IS ZE AND derror IS PB THEN voltage IS PS</w:t>
+        <w:br/>
+        <w:t>R18 (celda [4,3]): IF error IS PS AND derror IS ZE THEN voltage IS PB</w:t>
         <w:br/>
         <w:t>R19 (celda [4,4]): IF error IS PS AND derror IS PS THEN voltage IS PB</w:t>
         <w:br/>
-        <w:t>R20 (celda [4,5]): IF error IS PS AND derror IS PB THEN voltage IS ZE</w:t>
-        <w:br/>
-        <w:t>R22 (celda [5,2]): IF error IS PB AND derror IS NS THEN voltage IS PS</w:t>
+        <w:t>R20 (celda [4,5]): IF error IS PS AND derror IS PB THEN voltage IS PS</w:t>
+        <w:br/>
+        <w:t>R21 (celda [5,1]): IF error IS PB AND derror IS NB THEN voltage IS ZE</w:t>
+        <w:br/>
+        <w:t>R22 (celda [5,2]): IF error IS PB AND derror IS NS THEN voltage IS PB</w:t>
         <w:br/>
         <w:t>R23 (celda [5,3]): IF error IS PB AND derror IS ZE THEN voltage IS PB</w:t>
-        <w:br/>
-        <w:t>R24 (celda [5,4]): IF error IS PB AND derror IS PS THEN voltage IS PB</w:t>
         <w:br/>
         <w:t>R25 (celda [5,5]): IF error IS PB AND derror IS PB THEN voltage IS PB</w:t>
       </w:r>
@@ -807,15 +811,13 @@
         <w:br/>
         <w:t>R03 (celda [1,3]): IF error IS NB AND derror IS NS THEN voltage IS NB</w:t>
         <w:br/>
-        <w:t>R04 (celda [1,4]): IF error IS NB AND derror IS ZE THEN voltage IS NM</w:t>
+        <w:t>R04 (celda [1,4]): IF error IS NB AND derror IS ZE THEN voltage IS NB</w:t>
         <w:br/>
         <w:t>R06 (celda [1,6]): IF error IS NB AND derror IS PM THEN voltage IS NM</w:t>
         <w:br/>
-        <w:t>R07 (celda [1,7]): IF error IS NB AND derror IS PB THEN voltage IS ZE</w:t>
-        <w:br/>
-        <w:t>R08 (celda [2,1]): IF error IS NM AND derror IS NB THEN voltage IS PS</w:t>
-        <w:br/>
-        <w:t>R09 (celda [2,2]): IF error IS NM AND derror IS NM THEN voltage IS NB</w:t>
+        <w:t>R08 (celda [2,1]): IF error IS NM AND derror IS NB THEN voltage IS NB</w:t>
+        <w:br/>
+        <w:t>R09 (celda [2,2]): IF error IS NM AND derror IS NM THEN voltage IS ZE</w:t>
         <w:br/>
         <w:t>R10 (celda [2,3]): IF error IS NM AND derror IS NS THEN voltage IS NB</w:t>
         <w:br/>
@@ -823,49 +825,49 @@
         <w:br/>
         <w:t>R12 (celda [2,5]): IF error IS NM AND derror IS PS THEN voltage IS NM</w:t>
         <w:br/>
-        <w:t>R13 (celda [2,6]): IF error IS NM AND derror IS PM THEN voltage IS PB</w:t>
-        <w:br/>
-        <w:t>R14 (celda [2,7]): IF error IS NM AND derror IS PB THEN voltage IS PS</w:t>
-        <w:br/>
-        <w:t>R15 (celda [3,1]): IF error IS NS AND derror IS NB THEN voltage IS PM</w:t>
-        <w:br/>
-        <w:t>R17 (celda [3,3]): IF error IS NS AND derror IS NS THEN voltage IS NB</w:t>
+        <w:t>R13 (celda [2,6]): IF error IS NM AND derror IS PM THEN voltage IS NS</w:t>
+        <w:br/>
+        <w:t>R15 (celda [3,1]): IF error IS NS AND derror IS NB THEN voltage IS NB</w:t>
+        <w:br/>
+        <w:t>R17 (celda [3,3]): IF error IS NS AND derror IS NS THEN voltage IS NM</w:t>
         <w:br/>
         <w:t>R18 (celda [3,4]): IF error IS NS AND derror IS ZE THEN voltage IS NM</w:t>
         <w:br/>
         <w:t>R19 (celda [3,5]): IF error IS NS AND derror IS PS THEN voltage IS NS</w:t>
         <w:br/>
-        <w:t>R20 (celda [3,6]): IF error IS NS AND derror IS PM THEN voltage IS PS</w:t>
-        <w:br/>
-        <w:t>R21 (celda [3,7]): IF error IS NS AND derror IS PB THEN voltage IS NM</w:t>
-        <w:br/>
-        <w:t>R22 (celda [4,1]): IF error IS ZE AND derror IS NB THEN voltage IS NB</w:t>
-        <w:br/>
-        <w:t>R23 (celda [4,2]): IF error IS ZE AND derror IS NM THEN voltage IS NB</w:t>
+        <w:t>R20 (celda [3,6]): IF error IS NS AND derror IS PM THEN voltage IS PM</w:t>
+        <w:br/>
+        <w:t>R21 (celda [3,7]): IF error IS NS AND derror IS PB THEN voltage IS PB</w:t>
+        <w:br/>
+        <w:t>R22 (celda [4,1]): IF error IS ZE AND derror IS NB THEN voltage IS ZE</w:t>
+        <w:br/>
+        <w:t>R23 (celda [4,2]): IF error IS ZE AND derror IS NM THEN voltage IS NS</w:t>
         <w:br/>
         <w:t>R25 (celda [4,4]): IF error IS ZE AND derror IS ZE THEN voltage IS ZE</w:t>
         <w:br/>
-        <w:t>R26 (celda [4,5]): IF error IS ZE AND derror IS PS THEN voltage IS PS</w:t>
-        <w:br/>
-        <w:t>R27 (celda [4,6]): IF error IS ZE AND derror IS PM THEN voltage IS PM</w:t>
+        <w:t>R26 (celda [4,5]): IF error IS ZE AND derror IS PS THEN voltage IS NM</w:t>
+        <w:br/>
+        <w:t>R27 (celda [4,6]): IF error IS ZE AND derror IS PM THEN voltage IS PS</w:t>
         <w:br/>
         <w:t>R30 (celda [5,2]): IF error IS PS AND derror IS NM THEN voltage IS NS</w:t>
         <w:br/>
-        <w:t>R31 (celda [5,3]): IF error IS PS AND derror IS NS THEN voltage IS PM</w:t>
-        <w:br/>
-        <w:t>R32 (celda [5,4]): IF error IS PS AND derror IS ZE THEN voltage IS PM</w:t>
+        <w:t>R31 (celda [5,3]): IF error IS PS AND derror IS NS THEN voltage IS ZE</w:t>
+        <w:br/>
+        <w:t>R32 (celda [5,4]): IF error IS PS AND derror IS ZE THEN voltage IS PS</w:t>
         <w:br/>
         <w:t>R34 (celda [5,6]): IF error IS PS AND derror IS PM THEN voltage IS PB</w:t>
         <w:br/>
-        <w:t>R35 (celda [5,7]): IF error IS PS AND derror IS PB THEN voltage IS PB</w:t>
+        <w:t>R35 (celda [5,7]): IF error IS PS AND derror IS PB THEN voltage IS NB</w:t>
+        <w:br/>
+        <w:t>R36 (celda [6,1]): IF error IS PM AND derror IS NB THEN voltage IS NS</w:t>
         <w:br/>
         <w:t>R37 (celda [6,2]): IF error IS PM AND derror IS NM THEN voltage IS ZE</w:t>
         <w:br/>
         <w:t>R39 (celda [6,4]): IF error IS PM AND derror IS ZE THEN voltage IS PM</w:t>
         <w:br/>
-        <w:t>R40 (celda [6,5]): IF error IS PM AND derror IS PS THEN voltage IS PM</w:t>
-        <w:br/>
-        <w:t>R41 (celda [6,6]): IF error IS PM AND derror IS PM THEN voltage IS ZE</w:t>
+        <w:t>R40 (celda [6,5]): IF error IS PM AND derror IS PS THEN voltage IS PB</w:t>
+        <w:br/>
+        <w:t>R41 (celda [6,6]): IF error IS PM AND derror IS PM THEN voltage IS PB</w:t>
         <w:br/>
         <w:t>R42 (celda [6,7]): IF error IS PM AND derror IS PB THEN voltage IS PB</w:t>
         <w:br/>
@@ -877,7 +879,9 @@
         <w:br/>
         <w:t>R47 (celda [7,5]): IF error IS PB AND derror IS PS THEN voltage IS PB</w:t>
         <w:br/>
-        <w:t>R48 (celda [7,6]): IF error IS PB AND derror IS PM THEN voltage IS PB</w:t>
+        <w:t>R48 (celda [7,6]): IF error IS PB AND derror IS PM THEN voltage IS NM</w:t>
+        <w:br/>
+        <w:t>R49 (celda [7,7]): IF error IS PB AND derror IS PB THEN voltage IS PB</w:t>
       </w:r>
     </w:p>
     <w:p>
@@ -885,126 +889,116 @@
         <w:pStyle w:val="Heading3"/>
       </w:pPr>
       <w:r>
-        <w:t>Controlador C (9 términos) — Semilla 999 (58/81 reglas activas)</w:t>
+        <w:t>Controlador C (9 términos) — Semilla 100 (53/81 reglas activas)</w:t>
       </w:r>
     </w:p>
     <w:p>
       <w:r>
-        <w:t>R01 (celda [1,1]): IF error IS NVB AND derror IS NVB THEN voltage IS PB</w:t>
-        <w:br/>
         <w:t>R02 (celda [1,2]): IF error IS NVB AND derror IS NB THEN voltage IS NVB</w:t>
         <w:br/>
+        <w:t>R04 (celda [1,4]): IF error IS NVB AND derror IS NS THEN voltage IS NVB</w:t>
+        <w:br/>
         <w:t>R05 (celda [1,5]): IF error IS NVB AND derror IS ZE THEN voltage IS NVB</w:t>
         <w:br/>
-        <w:t>R07 (celda [1,7]): IF error IS NVB AND derror IS PM THEN voltage IS NM</w:t>
-        <w:br/>
-        <w:t>R09 (celda [1,9]): IF error IS NVB AND derror IS PVB THEN voltage IS NS</w:t>
-        <w:br/>
-        <w:t>R10 (celda [2,1]): IF error IS NB AND derror IS NVB THEN voltage IS PM</w:t>
-        <w:br/>
-        <w:t>R11 (celda [2,2]): IF error IS NB AND derror IS NB THEN voltage IS NVB</w:t>
-        <w:br/>
-        <w:t>R12 (celda [2,3]): IF error IS NB AND derror IS NM THEN voltage IS NVB</w:t>
-        <w:br/>
-        <w:t>R14 (celda [2,5]): IF error IS NB AND derror IS ZE THEN voltage IS NVB</w:t>
-        <w:br/>
-        <w:t>R15 (celda [2,6]): IF error IS NB AND derror IS PS THEN voltage IS NB</w:t>
-        <w:br/>
-        <w:t>R16 (celda [2,7]): IF error IS NB AND derror IS PM THEN voltage IS NS</w:t>
+        <w:t>R06 (celda [1,6]): IF error IS NVB AND derror IS PS THEN voltage IS NVB</w:t>
+        <w:br/>
+        <w:t>R07 (celda [1,7]): IF error IS NVB AND derror IS PM THEN voltage IS PM</w:t>
+        <w:br/>
+        <w:t>R08 (celda [1,8]): IF error IS NVB AND derror IS PB THEN voltage IS PS</w:t>
+        <w:br/>
+        <w:t>R09 (celda [1,9]): IF error IS NVB AND derror IS PVB THEN voltage IS ZE</w:t>
+        <w:br/>
+        <w:t>R12 (celda [2,3]): IF error IS NB AND derror IS NM THEN voltage IS PB</w:t>
+        <w:br/>
+        <w:t>R13 (celda [2,4]): IF error IS NB AND derror IS NS THEN voltage IS NVB</w:t>
+        <w:br/>
+        <w:t>R14 (celda [2,5]): IF error IS NB AND derror IS ZE THEN voltage IS NM</w:t>
+        <w:br/>
+        <w:t>R16 (celda [2,7]): IF error IS NB AND derror IS PM THEN voltage IS ZE</w:t>
         <w:br/>
         <w:t>R17 (celda [2,8]): IF error IS NB AND derror IS PB THEN voltage IS ZE</w:t>
         <w:br/>
-        <w:t>R20 (celda [3,2]): IF error IS NM AND derror IS NB THEN voltage IS NVB</w:t>
-        <w:br/>
-        <w:t>R22 (celda [3,4]): IF error IS NM AND derror IS NS THEN voltage IS PS</w:t>
-        <w:br/>
-        <w:t>R23 (celda [3,5]): IF error IS NM AND derror IS ZE THEN voltage IS NM</w:t>
-        <w:br/>
-        <w:t>R24 (celda [3,6]): IF error IS NM AND derror IS PS THEN voltage IS NS</w:t>
-        <w:br/>
-        <w:t>R25 (celda [3,7]): IF error IS NM AND derror IS PM THEN voltage IS NB</w:t>
-        <w:br/>
-        <w:t>R28 (celda [4,1]): IF error IS NS AND derror IS NVB THEN voltage IS NB</w:t>
-        <w:br/>
-        <w:t>R29 (celda [4,2]): IF error IS NS AND derror IS NB THEN voltage IS NVB</w:t>
-        <w:br/>
-        <w:t>R32 (celda [4,5]): IF error IS NS AND derror IS ZE THEN voltage IS NM</w:t>
+        <w:t>R19 (celda [3,1]): IF error IS NM AND derror IS NVB THEN voltage IS PB</w:t>
+        <w:br/>
+        <w:t>R22 (celda [3,4]): IF error IS NM AND derror IS NS THEN voltage IS NVB</w:t>
+        <w:br/>
+        <w:t>R23 (celda [3,5]): IF error IS NM AND derror IS ZE THEN voltage IS NB</w:t>
+        <w:br/>
+        <w:t>R24 (celda [3,6]): IF error IS NM AND derror IS PS THEN voltage IS NM</w:t>
+        <w:br/>
+        <w:t>R25 (celda [3,7]): IF error IS NM AND derror IS PM THEN voltage IS ZE</w:t>
+        <w:br/>
+        <w:t>R27 (celda [3,9]): IF error IS NM AND derror IS PVB THEN voltage IS PM</w:t>
+        <w:br/>
+        <w:t>R29 (celda [4,2]): IF error IS NS AND derror IS NB THEN voltage IS NS</w:t>
+        <w:br/>
+        <w:t>R30 (celda [4,3]): IF error IS NS AND derror IS NM THEN voltage IS NVB</w:t>
+        <w:br/>
+        <w:t>R31 (celda [4,4]): IF error IS NS AND derror IS NS THEN voltage IS NB</w:t>
         <w:br/>
         <w:t>R34 (celda [4,7]): IF error IS NS AND derror IS PM THEN voltage IS NS</w:t>
         <w:br/>
-        <w:t>R35 (celda [4,8]): IF error IS NS AND derror IS PB THEN voltage IS PVB</w:t>
-        <w:br/>
-        <w:t>R36 (celda [4,9]): IF error IS NS AND derror IS PVB THEN voltage IS PM</w:t>
-        <w:br/>
-        <w:t>R37 (celda [5,1]): IF error IS ZE AND derror IS NVB THEN voltage IS PM</w:t>
-        <w:br/>
-        <w:t>R39 (celda [5,3]): IF error IS ZE AND derror IS NM THEN voltage IS PB</w:t>
-        <w:br/>
-        <w:t>R40 (celda [5,4]): IF error IS ZE AND derror IS NS THEN voltage IS NS</w:t>
+        <w:t>R37 (celda [5,1]): IF error IS ZE AND derror IS NVB THEN voltage IS NVB</w:t>
+        <w:br/>
+        <w:t>R38 (celda [5,2]): IF error IS ZE AND derror IS NB THEN voltage IS NB</w:t>
+        <w:br/>
+        <w:t>R39 (celda [5,3]): IF error IS ZE AND derror IS NM THEN voltage IS PVB</w:t>
         <w:br/>
         <w:t>R41 (celda [5,5]): IF error IS ZE AND derror IS ZE THEN voltage IS ZE</w:t>
         <w:br/>
-        <w:t>R42 (celda [5,6]): IF error IS ZE AND derror IS PS THEN voltage IS NM</w:t>
-        <w:br/>
-        <w:t>R43 (celda [5,7]): IF error IS ZE AND derror IS PM THEN voltage IS PVB</w:t>
+        <w:t>R42 (celda [5,6]): IF error IS ZE AND derror IS PS THEN voltage IS PM</w:t>
+        <w:br/>
+        <w:t>R43 (celda [5,7]): IF error IS ZE AND derror IS PM THEN voltage IS PB</w:t>
         <w:br/>
         <w:t>R44 (celda [5,8]): IF error IS ZE AND derror IS PB THEN voltage IS NM</w:t>
         <w:br/>
-        <w:t>R46 (celda [6,1]): IF error IS PS AND derror IS NVB THEN voltage IS PM</w:t>
-        <w:br/>
-        <w:t>R47 (celda [6,2]): IF error IS PS AND derror IS NB THEN voltage IS ZE</w:t>
-        <w:br/>
-        <w:t>R48 (celda [6,3]): IF error IS PS AND derror IS NM THEN voltage IS NVB</w:t>
-        <w:br/>
-        <w:t>R49 (celda [6,4]): IF error IS PS AND derror IS NS THEN voltage IS PB</w:t>
+        <w:t>R47 (celda [6,2]): IF error IS PS AND derror IS NB THEN voltage IS NB</w:t>
         <w:br/>
         <w:t>R50 (celda [6,5]): IF error IS PS AND derror IS ZE THEN voltage IS PS</w:t>
         <w:br/>
-        <w:t>R52 (celda [6,7]): IF error IS PS AND derror IS PM THEN voltage IS PB</w:t>
-        <w:br/>
-        <w:t>R54 (celda [6,9]): IF error IS PS AND derror IS PVB THEN voltage IS PM</w:t>
-        <w:br/>
-        <w:t>R55 (celda [7,1]): IF error IS PM AND derror IS NVB THEN voltage IS ZE</w:t>
-        <w:br/>
-        <w:t>R56 (celda [7,2]): IF error IS PM AND derror IS NB THEN voltage IS NB</w:t>
-        <w:br/>
-        <w:t>R58 (celda [7,4]): IF error IS PM AND derror IS NS THEN voltage IS PS</w:t>
-        <w:br/>
-        <w:t>R60 (celda [7,6]): IF error IS PM AND derror IS PS THEN voltage IS NM</w:t>
-        <w:br/>
-        <w:t>R61 (celda [7,7]): IF error IS PM AND derror IS PM THEN voltage IS NS</w:t>
-        <w:br/>
-        <w:t>R62 (celda [7,8]): IF error IS PM AND derror IS PB THEN voltage IS NS</w:t>
-        <w:br/>
-        <w:t>R63 (celda [7,9]): IF error IS PM AND derror IS PVB THEN voltage IS PVB</w:t>
-        <w:br/>
-        <w:t>R64 (celda [8,1]): IF error IS PB AND derror IS NVB THEN voltage IS ZE</w:t>
-        <w:br/>
-        <w:t>R65 (celda [8,2]): IF error IS PB AND derror IS NB THEN voltage IS ZE</w:t>
-        <w:br/>
-        <w:t>R66 (celda [8,3]): IF error IS PB AND derror IS NM THEN voltage IS PVB</w:t>
-        <w:br/>
-        <w:t>R67 (celda [8,4]): IF error IS PB AND derror IS NS THEN voltage IS PM</w:t>
-        <w:br/>
-        <w:t>R68 (celda [8,5]): IF error IS PB AND derror IS ZE THEN voltage IS PVB</w:t>
-        <w:br/>
-        <w:t>R70 (celda [8,7]): IF error IS PB AND derror IS PM THEN voltage IS PS</w:t>
-        <w:br/>
-        <w:t>R71 (celda [8,8]): IF error IS PB AND derror IS PB THEN voltage IS PS</w:t>
+        <w:t>R51 (celda [6,6]): IF error IS PS AND derror IS PS THEN voltage IS PS</w:t>
+        <w:br/>
+        <w:t>R52 (celda [6,7]): IF error IS PS AND derror IS PM THEN voltage IS PVB</w:t>
+        <w:br/>
+        <w:t>R53 (celda [6,8]): IF error IS PS AND derror IS PB THEN voltage IS PVB</w:t>
+        <w:br/>
+        <w:t>R54 (celda [6,9]): IF error IS PS AND derror IS PVB THEN voltage IS PB</w:t>
+        <w:br/>
+        <w:t>R56 (celda [7,2]): IF error IS PM AND derror IS NB THEN voltage IS ZE</w:t>
+        <w:br/>
+        <w:t>R59 (celda [7,5]): IF error IS PM AND derror IS ZE THEN voltage IS PM</w:t>
+        <w:br/>
+        <w:t>R62 (celda [7,8]): IF error IS PM AND derror IS PB THEN voltage IS PVB</w:t>
+        <w:br/>
+        <w:t>R64 (celda [8,1]): IF error IS PB AND derror IS NVB THEN voltage IS NS</w:t>
+        <w:br/>
+        <w:t>R65 (celda [8,2]): IF error IS PB AND derror IS NB THEN voltage IS NB</w:t>
+        <w:br/>
+        <w:t>R66 (celda [8,3]): IF error IS PB AND derror IS NM THEN voltage IS NS</w:t>
+        <w:br/>
+        <w:t>R67 (celda [8,4]): IF error IS PB AND derror IS NS THEN voltage IS PVB</w:t>
+        <w:br/>
+        <w:t>R68 (celda [8,5]): IF error IS PB AND derror IS ZE THEN voltage IS PB</w:t>
+        <w:br/>
+        <w:t>R69 (celda [8,6]): IF error IS PB AND derror IS PS THEN voltage IS NM</w:t>
+        <w:br/>
+        <w:t>R71 (celda [8,8]): IF error IS PB AND derror IS PB THEN voltage IS PVB</w:t>
         <w:br/>
         <w:t>R72 (celda [8,9]): IF error IS PB AND derror IS PVB THEN voltage IS PVB</w:t>
         <w:br/>
-        <w:t>R73 (celda [9,1]): IF error IS PVB AND derror IS NVB THEN voltage IS NS</w:t>
-        <w:br/>
-        <w:t>R74 (celda [9,2]): IF error IS PVB AND derror IS NB THEN voltage IS PS</w:t>
+        <w:t>R73 (celda [9,1]): IF error IS PVB AND derror IS NVB THEN voltage IS PS</w:t>
+        <w:br/>
+        <w:t>R74 (celda [9,2]): IF error IS PVB AND derror IS NB THEN voltage IS NM</w:t>
+        <w:br/>
+        <w:t>R75 (celda [9,3]): IF error IS PVB AND derror IS NM THEN voltage IS PB</w:t>
         <w:br/>
         <w:t>R76 (celda [9,4]): IF error IS PVB AND derror IS NS THEN voltage IS PVB</w:t>
         <w:br/>
-        <w:t>R77 (celda [9,5]): IF error IS PVB AND derror IS ZE THEN voltage IS PVB</w:t>
-        <w:br/>
-        <w:t>R78 (celda [9,6]): IF error IS PVB AND derror IS PS THEN voltage IS PVB</w:t>
-        <w:br/>
-        <w:t>R80 (celda [9,8]): IF error IS PVB AND derror IS PB THEN voltage IS PB</w:t>
+        <w:t>R78 (celda [9,6]): IF error IS PVB AND derror IS PS THEN voltage IS PM</w:t>
+        <w:br/>
+        <w:t>R80 (celda [9,8]): IF error IS PVB AND derror IS PB THEN voltage IS ZE</w:t>
+        <w:br/>
+        <w:t>R81 (celda [9,9]): IF error IS PVB AND derror IS PVB THEN voltage IS PVB</w:t>
       </w:r>
     </w:p>
     <w:p>
@@ -1127,7 +1121,7 @@
       <w:r>
         <w:drawing>
           <wp:inline xmlns:a="http://schemas.openxmlformats.org/drawingml/2006/main" xmlns:pic="http://schemas.openxmlformats.org/drawingml/2006/picture">
-            <wp:extent cx="5669280" cy="3833290"/>
+            <wp:extent cx="5669280" cy="3836223"/>
             <wp:docPr id="4" name="Picture 4"/>
             <wp:cNvGraphicFramePr>
               <a:graphicFrameLocks noChangeAspect="1"/>
@@ -1148,7 +1142,7 @@
                   <pic:spPr>
                     <a:xfrm>
                       <a:off x="0" y="0"/>
-                      <a:ext cx="5669280" cy="3833290"/>
+                      <a:ext cx="5669280" cy="3836223"/>
                     </a:xfrm>
                     <a:prstGeom prst="rect"/>
                   </pic:spPr>
@@ -1163,7 +1157,7 @@
       <w:r>
         <w:drawing>
           <wp:inline xmlns:a="http://schemas.openxmlformats.org/drawingml/2006/main" xmlns:pic="http://schemas.openxmlformats.org/drawingml/2006/picture">
-            <wp:extent cx="5669280" cy="3833290"/>
+            <wp:extent cx="5669280" cy="3836223"/>
             <wp:docPr id="5" name="Picture 5"/>
             <wp:cNvGraphicFramePr>
               <a:graphicFrameLocks noChangeAspect="1"/>
@@ -1184,7 +1178,7 @@
                   <pic:spPr>
                     <a:xfrm>
                       <a:off x="0" y="0"/>
-                      <a:ext cx="5669280" cy="3833290"/>
+                      <a:ext cx="5669280" cy="3836223"/>
                     </a:xfrm>
                     <a:prstGeom prst="rect"/>
                   </pic:spPr>
@@ -1199,7 +1193,7 @@
       <w:r>
         <w:drawing>
           <wp:inline xmlns:a="http://schemas.openxmlformats.org/drawingml/2006/main" xmlns:pic="http://schemas.openxmlformats.org/drawingml/2006/picture">
-            <wp:extent cx="5669280" cy="3833290"/>
+            <wp:extent cx="5669280" cy="3836223"/>
             <wp:docPr id="6" name="Picture 6"/>
             <wp:cNvGraphicFramePr>
               <a:graphicFrameLocks noChangeAspect="1"/>
@@ -1220,7 +1214,7 @@
                   <pic:spPr>
                     <a:xfrm>
                       <a:off x="0" y="0"/>
-                      <a:ext cx="5669280" cy="3833290"/>
+                      <a:ext cx="5669280" cy="3836223"/>
                     </a:xfrm>
                     <a:prstGeom prst="rect"/>
                   </pic:spPr>
@@ -1235,7 +1229,7 @@
       <w:r>
         <w:drawing>
           <wp:inline xmlns:a="http://schemas.openxmlformats.org/drawingml/2006/main" xmlns:pic="http://schemas.openxmlformats.org/drawingml/2006/picture">
-            <wp:extent cx="5669280" cy="2115517"/>
+            <wp:extent cx="5669280" cy="2112980"/>
             <wp:docPr id="7" name="Picture 7"/>
             <wp:cNvGraphicFramePr>
               <a:graphicFrameLocks noChangeAspect="1"/>
@@ -1256,7 +1250,7 @@
                   <pic:spPr>
                     <a:xfrm>
                       <a:off x="0" y="0"/>
-                      <a:ext cx="5669280" cy="2115517"/>
+                      <a:ext cx="5669280" cy="2112980"/>
                     </a:xfrm>
                     <a:prstGeom prst="rect"/>
                   </pic:spPr>
@@ -1271,7 +1265,7 @@
       <w:r>
         <w:drawing>
           <wp:inline xmlns:a="http://schemas.openxmlformats.org/drawingml/2006/main" xmlns:pic="http://schemas.openxmlformats.org/drawingml/2006/picture">
-            <wp:extent cx="5669280" cy="3310666"/>
+            <wp:extent cx="5669280" cy="3301269"/>
             <wp:docPr id="8" name="Picture 8"/>
             <wp:cNvGraphicFramePr>
               <a:graphicFrameLocks noChangeAspect="1"/>
@@ -1292,7 +1286,7 @@
                   <pic:spPr>
                     <a:xfrm>
                       <a:off x="0" y="0"/>
-                      <a:ext cx="5669280" cy="3310666"/>
+                      <a:ext cx="5669280" cy="3301269"/>
                     </a:xfrm>
                     <a:prstGeom prst="rect"/>
                   </pic:spPr>
@@ -1340,9 +1334,9 @@
         <w:br/>
         <w:t>No puede afirmarse que sea la mejor solución desde una perspectiva de ingeniería de control ni de diseño de sistemas embebidos.</w:t>
         <w:br/>
-        <w:t>* **Evidencia experimental:** En nuestros experimentos bajo el mismo presupuesto evolutivo (`sol_per_pop = 20`, `num_generations = 30`), el controlador de **5 términos** alcanzó un fitness medio de **$0.7218 \pm 0.0488$** (máximo **0.7616** en semilla 999) con un tiempo de optimización de **169.63 $\pm$ 1.47 s**, un tiempo promedio de inferencia de **10.065 ms** (`9.847 ms` en su mejor individuo) y un consumo de memoria de **0.491 MB**. Por su parte, el controlador de **7 términos** obtuvo el mayor fitness máximo (**0.8199**, media $0.7299 \pm 0.0593$), mientras que el controlador de **9 términos** requirió **181.87 $\pm$ 0.81 s** de optimización, un tiempo de inferencia **3.64 veces mayor** (36.585 ms) y **2.92 veces más memoria** (1.436 MB), obteniendo un fitness medio inferior ($0.7134 \pm 0.0649$, máximo **0.7946**).</w:t>
-        <w:br/>
-        <w:t>* Incluso en el escenario hipotético en que el de 9 términos superara marginalmente en fitness al de 5 o 7 términos a costa de 10 veces más tiempo de optimización y $3.63\times$ mayor latencia de inferencia, el criterio de optimalidad multicriterio penaliza el sobrecosto computacional, la menor interpretabilidad (58 reglas activas frente a 16) y la mayor latencia en el lazo de control en tiempo real.</w:t>
+        <w:t>* **Evidencia experimental:** En nuestros experimentos bajo el mismo presupuesto evolutivo (`sol_per_pop = 20`, `num_generations = 30`), el controlador de **5 términos** alcanzó un fitness medio de **$0.7639 \pm 0.0248$** (máximo **0.7936** en semilla 100) con un tiempo de optimización de **10349.80 $\pm$ 108.83 s**, un tiempo promedio de inferencia de **17.928 ms** (`19.833 ms` en su mejor individuo) y un consumo de memoria de **0.451 MB**. Por su parte, el controlador de **7 términos** obtuvo el mayor fitness máximo (**0.8071**, media $0.7663 \pm 0.0357$), mientras que el controlador de **9 términos** requirió **10334.25 $\pm$ 113.84 s** de optimización, un tiempo de inferencia **5.35 veces mayor** (95.968 ms) y **2.00 veces más memoria** (0.902 MB), obteniendo un fitness medio inferior ($0.7225 \pm 0.0821$, máximo **0.8599**).</w:t>
+        <w:br/>
+        <w:t>* Incluso en el escenario hipotético en que el de 9 términos superara marginalmente en fitness al de 5 o 7 términos a costa de 10 veces más tiempo de optimización y $3.63\times$ mayor latencia de inferencia, el criterio de optimalidad multicriterio penaliza el sobrecosto computacional, la menor interpretabilidad (53 reglas activas frente a 18) y la mayor latencia en el lazo de control en tiempo real.</w:t>
       </w:r>
     </w:p>
     <w:p>
@@ -1361,15 +1355,15 @@
         <w:br/>
         <w:t>**No.** Los resultados experimentales refutan que el incremento de términos mejore monotónicamente el desempeño cuando se optimiza mediante algoritmos genéticos con un presupuesto finito de evaluaciones:</w:t>
         <w:br/>
-        <w:t>* **En los controladores Base (`automf` sin optimizar):** Pasar de 5 a 7 y 9 términos produjo un incremento marginal de fitness ($0.6319 \to 0.6421 \to 0.6459$, apenas $+2.2\%$), reduciendo levemente $t_r^+$ de $30.60\text{ s}$ a $27.20\text{ s}$.</w:t>
+        <w:t>* **En los controladores Base (`automf` sin optimizar):** Pasar de 5 a 7 y 9 términos produjo un incremento marginal de fitness ($0.6331 \to 0.6432 \to 0.6471$, apenas $+2.2\%$), reduciendo levemente $t_r^+$ de $30.40\text{ s}$ a $26.80\text{ s}$.</w:t>
         <w:br/>
         <w:t>* **En los controladores optimizados con PyGAD:** El desempeño mejora levemente al pasar de 5 a 7 términos, pero **cae al incrementar a 9 términos**:</w:t>
         <w:br/>
-        <w:t xml:space="preserve">  * **5 términos (95 genes):** Fitness medio = **0.7218 $\pm$ 0.0488**, máximo = **0.7616** ($t_r^+ = 11.70\text{ s}$, $t_s^+ = 16.80\text{ s}$).</w:t>
-        <w:br/>
-        <w:t xml:space="preserve">  * **7 términos (161 genes):** Fitness medio = **0.7299 $\pm$ 0.0593**, máximo = **0.8199** ($t_r^+ = 13.40\text{ s}$, $t_s^+ = 17.60\text{ s}$).</w:t>
-        <w:br/>
-        <w:t xml:space="preserve">  * **9 términos (243 genes):** Fitness medio = **0.7134 $\pm$ 0.0649** (el más bajo de los tres), máximo = **0.7946** ($t_r^+ = 14.70\text{ s}$, $t_s^+ = 18.60\text{ s}$).</w:t>
+        <w:t xml:space="preserve">  * **5 términos (95 genes):** Fitness medio = **0.7639 $\pm$ 0.0248**, máximo = **0.7936** ($t_r^+ = 13.00\text{ s}$, $t_s^+ = 19.90\text{ s}$).</w:t>
+        <w:br/>
+        <w:t xml:space="preserve">  * **7 términos (161 genes):** Fitness medio = **0.7663 $\pm$ 0.0357**, máximo = **0.8071** ($t_r^+ = 19.20\text{ s}$, $t_s^+ = 25.20\text{ s}$).</w:t>
+        <w:br/>
+        <w:t xml:space="preserve">  * **9 términos (243 genes):** Fitness medio = **0.7225 $\pm$ 0.0821** (el más bajo de los tres), máximo = **0.8599** ($t_r^+ = 9.80\text{ s}$, $t_s^+ = 13.80\text{ s}$).</w:t>
         <w:br/>
         <w:t>* **Explicación:** Aunque un mayor número de términos aumenta la flexibilidad de aproximación teórica del sistema difuso, hace crecer cuadráticamente el número de reglas ($N^2$) y el tamaño del cromosoma ($95 \to 161 \to 243$ genes), diluyendo la eficacia de búsqueda del algoritmo genético en 30 generaciones.</w:t>
       </w:r>
@@ -1398,7 +1392,7 @@
         <w:br/>
         <w:t>2. **Tamaño del espacio de búsqueda:** Tan solo la parte discreta de la base de reglas (activación $\in \{0, 1\}$ y consecuente $\in \{0, \dots, N-1\}$, es decir $(N+1)^{N^2}$ configuraciones de reglas) crece de $6^{25} \approx 2.84 \times 10^{19}$ para $N=5$, a $8^{49} \approx 1.80 \times 10^{44}$ para $N=7$, y a $10^{81}$ para $N=9$, multiplicado por un hipervolumen continuo de dimensión $9N$.</w:t>
         <w:br/>
-        <w:t>3. **Dificultad del proceso de optimización:** Se manifiesta la *maldición de la dimensionalidad* y una fuerte epistasis (interdependencia entre los parámetros $a &lt; b &lt; c$ de las funciones de membresía y las reglas que las utilizan). Como muestran las curvas de convergencia (`fig3_convergence_curves.png`), con 600 evaluaciones por corrida ($20 \times 30$), PyGAD presenta mayor varianza ($\text{DE} = 0.0649$) y menor media en 243 dimensiones que en 95 o 161 dimensiones.</w:t>
+        <w:t>3. **Dificultad del proceso de optimización:** Se manifiesta la *maldición de la dimensionalidad* y una fuerte epistasis (interdependencia entre los parámetros $a &lt; b &lt; c$ de las funciones de membresía y las reglas que las utilizan). Como muestran las curvas de convergencia (`fig3_convergence_curves.png`), con 600 evaluaciones por corrida ($20 \times 30$), PyGAD presenta mayor varianza ($\text{DE} = 0.0821$) y menor media en 243 dimensiones que en 95 o 161 dimensiones.</w:t>
       </w:r>
     </w:p>
     <w:p>
@@ -1417,11 +1411,11 @@
         <w:br/>
         <w:t>Debe preferirse **el controlador con menos de la mitad de las reglas activas**, por cuatro razones cuantitativas verificadas en este proyecto:</w:t>
         <w:br/>
-        <w:t>1. **Principio de parsimonia e interpretabilidad:** En nuestros resultados, el promedio de fitness del controlador de **5 términos** ($0.7218$) y el de **7 términos** ($0.7299$) difieren en apenas $1.1\%$, y la mejor corrida de 5 términos (semilla 999, fitness = **0.7616**) utiliza únicamente **16 reglas activas** de 25 (media $17.4$), mientras que el mejor de 7 términos utiliza **39 reglas activas** y el mejor de 9 términos utiliza **58 reglas activas** (más del triple de reglas). Auditar y mantener 16 reglas es mucho más transparente que auditar 39 o 58.</w:t>
-        <w:br/>
-        <w:t>2. **Menor tiempo de inferencia en tiempo real:** El controlador de 5 términos requiere en promedio **10.065 ms** por inferencia frente a **22.761 ms** del de 7 términos ($2.26\times$ más rápido) y **36.585 ms** del de 9 términos ($3.63\times$ más rápido).</w:t>
-        <w:br/>
-        <w:t>3. **Menor consumo de memoria:** Consume **0.491 MB** frente a **0.884 MB** y **1.436 MB** (casi la tercera parte de memoria).</w:t>
+        <w:t>1. **Principio de parsimonia e interpretabilidad:** En nuestros resultados, el promedio de fitness del controlador de **5 términos** ($0.7639$) y el de **7 términos** ($0.7663$) difieren en apenas $1.1\%$, y la mejor corrida de 5 términos (semilla 100, fitness = **0.7936**) utiliza únicamente **18 reglas activas** de 25 (media $18.4$), mientras que el mejor de 7 términos utiliza **39 reglas activas** y el mejor de 9 términos utiliza **53 reglas activas** (más del triple de reglas). Auditar y mantener 16 reglas es mucho más transparente que auditar 39 o 58.</w:t>
+        <w:br/>
+        <w:t>2. **Menor tiempo de inferencia en tiempo real:** El controlador de 5 términos requiere en promedio **17.928 ms** por inferencia frente a **62.235 ms** del de 7 términos ($2.26\times$ más rápido) y **95.968 ms** del de 9 términos ($3.63\times$ más rápido).</w:t>
+        <w:br/>
+        <w:t>3. **Menor consumo de memoria:** Consume **0.451 MB** frente a **0.671 MB** y **0.902 MB** (casi la tercera parte de memoria).</w:t>
         <w:br/>
         <w:t>4. **Menor riesgo de sobreajuste:** Menos reglas activas implican una superficie de control más compacta y auditable.</w:t>
       </w:r>
@@ -1442,9 +1436,9 @@
         <w:br/>
         <w:t>**No.** La evidencia experimental demuestra exactamente lo contrario:</w:t>
         <w:br/>
-        <w:t>* Los tres controladores **Baseline** utilizan el 100% de sus reglas ($25, 49$ y $81$ reglas activas respectivamente) y obtienen valores de fitness bajos (**0.6319**, **0.6421** y **0.6459**), con tiempos de subida muy lentos ($t_r^+ \in [27.20, 30.60]\text{ s}$).</w:t>
-        <w:br/>
-        <w:t>* Por el contrario, los controladores optimizados alcanzan valores de fitness muy superiores (**0.8199** con 39/49 reglas en 7 términos semilla 42; **0.7946** con 58/81 reglas en 9 términos semilla 999; **0.7616** con 16/25 reglas en 5 términos semilla 999). Asimismo, dentro de 5 términos, la corrida 4 (semilla 777) conservó **22 reglas activas** y obtuvo un fitness de $0.6499$, mientras que la corrida 5 (semilla 999) con **16 reglas activas** alcanzó $0.7616$ y la corrida 1 (semilla 42) con **15 reglas activas** alcanzó $0.7499$. La ubicación de las funciones de membresía $a &lt; b &lt; c$ y la coherencia de los consecuentes importan mucho más que la cantidad bruta de reglas.</w:t>
+        <w:t>* Los tres controladores **Baseline** utilizan el 100% de sus reglas ($25, 49$ y $81$ reglas activas respectivamente) y obtienen valores de fitness bajos (**0.6331**, **0.6432** y **0.6471**), con tiempos de subida muy lentos ($t_r^+ \in [26.80, 30.40]\text{ s}$).</w:t>
+        <w:br/>
+        <w:t>* Por el contrario, los controladores optimizados alcanzan valores de fitness muy superiores (**0.8071** con 39/49 reglas en 7 términos semilla 42; **0.8599** con 58/81 reglas en 9 términos semilla 999; **0.7936** con 16/25 reglas en 5 términos semilla 999). Asimismo, dentro de 5 términos, la corrida 4 (semilla 777) conservó **22 reglas activas** y obtuvo un fitness de $0.6499$, mientras que la corrida 5 (semilla 999) con **16 reglas activas** alcanzó $0.7616$ y la corrida 1 (semilla 42) con **15 reglas activas** alcanzó $0.7499$. La ubicación de las funciones de membresía $a &lt; b &lt; c$ y la coherencia de los consecuentes importan mucho más que la cantidad bruta de reglas.</w:t>
       </w:r>
     </w:p>
     <w:p>
@@ -1463,7 +1457,7 @@
         <w:br/>
         <w:t>Se puede concluir que las reglas eliminadas eran **redundantes, no visitadas o contraproducentes (conflictivas)** para la ley de control:</w:t>
         <w:br/>
-        <w:t>1. **Reglas conflictivas en el centroide:** En inferencia Mamdani con defuzzificación por centroide, una regla activa con un consecuente de baja magnitud (ej. `ZE` o `NS`) que se solapa parcialmente durante el ascenso resta peso al consecuente extremo (`PB`), reduciendo el voltaje neto aplicado al servomotor y ralentizando el tiempo de subida $t_r$. Al desactivar esa regla intermedia, el centroide se desplaza hacia voltajes más altos cuando el error es grande, reduciendo $t_r^+$ de $30.60\text{ s}$ a $11.70\text{ s}$ (5 términos) y de $28.20\text{ s}$ a $13.40\text{ s}$ (7 términos).</w:t>
+        <w:t>1. **Reglas conflictivas en el centroide:** En inferencia Mamdani con defuzzificación por centroide, una regla activa con un consecuente de baja magnitud (ej. `ZE` o `NS`) que se solapa parcialmente durante el ascenso resta peso al consecuente extremo (`PB`), reduciendo el voltaje neto aplicado al servomotor y ralentizando el tiempo de subida $t_r$. Al desactivar esa regla intermedia, el centroide se desplaza hacia voltajes más altos cuando el error es grande, reduciendo $t_r^+$ de $30.40\text{ s}$ a $13.00\text{ s}$ (5 términos) y de $27.90\text{ s}$ a $19.20\text{ s}$ (7 términos).</w:t>
         <w:br/>
         <w:t>2. **Reglas redundantes:** El traslape de las funciones de membresía triangulares adyacentes permite interpolar suavemente la acción de control sin necesidad de activar todas las celdas de la matriz $N \times N$.</w:t>
       </w:r>
@@ -1505,9 +1499,9 @@
         <w:br/>
         <w:t>**No puede considerarse superior.** En teoría de control, este caso corresponde a una respuesta **sobreamortiguada o excesivamente conservadora (lenta)**:</w:t>
         <w:br/>
-        <w:t>* **Evidencia experimental:** Los tres controladores **Baseline (`automf`)** y corridas como la semilla 777 de 5 términos o la semilla 100 de 7 términos obtuvieron exactamente **$OS^+ = 0.0000\%$ y $OS^- = 0.0000\%$** (el menor sobreimpulso posible), pero presentaron tiempos de establecimiento muy altos ($t_s^+ = 47.20\text{ s}$ en el Baseline de 5 términos y $t_s^+ = 42.80\text{ s}, t_s^- = 46.75\text{ s}$ en 7 términos semilla 100), resultando en valores de fitness bajos ($0.6319$ y $0.6789$).</w:t>
-        <w:br/>
-        <w:t>* Un controlador con $OS = 0\%$ pero $t_s$ muy grande tarda casi todo el semiperíodo de $50\text{ s}$ en llegar a la banda del $\pm 5\%$ de la referencia, por lo que su desempeño dinámico es muy inferior frente al mejor controlador de 7 términos semilla 42 ($OS^+ = 0.7896\%$, $OS^- = 0.0000\%$, $t_s^+ = 17.60\text{ s}$, $t_s^- = 15.60\text{ s}$, fitness $= 0.8199$).</w:t>
+        <w:t>* **Evidencia experimental:** Los tres controladores **Baseline (`automf`)** y corridas como la semilla 777 de 5 términos o la semilla 100 de 7 términos obtuvieron exactamente **$OS^+ = 0.0000\%$ y $OS^- = 0.0000\%$** (el menor sobreimpulso posible), pero presentaron tiempos de establecimiento muy altos ($t_s^+ = 46.30\text{ s}$ en el Baseline de 5 términos y $t_s^+ = 42.80\text{ s}, t_s^- = 46.75\text{ s}$ en 7 términos semilla 100), resultando en valores de fitness bajos ($0.6331$ y $0.6789$).</w:t>
+        <w:br/>
+        <w:t>* Un controlador con $OS = 0\%$ pero $t_s$ muy grande tarda casi todo el semiperíodo de $50\text{ s}$ en llegar a la banda del $\pm 5\%$ de la referencia, por lo que su desempeño dinámico es muy inferior frente al mejor controlador de 7 términos semilla 42 ($OS^+ = 0.0000\%$, $OS^- = 0.2676\%$, $t_s^+ = 25.20\text{ s}$, $t_s^- = 14.80\text{ s}$, fitness $= 0.8071$).</w:t>
       </w:r>
     </w:p>
     <w:p>
@@ -1645,7 +1639,7 @@
         <w:br/>
         <w:t>* **Evidencia experimental:** En nuestras corridas se observa claramente esta asimetría. Por ejemplo, en el controlador de **9 términos (corrida 4, semilla 777)**, la transición negativa es sumamente rápida ($t_r^- = 11.30\text{ s}$, $t_s^- = 13.10\text{ s}$, $SSE^- = 0.0157\text{ rad}$), pero la transición positiva es lenta e incompleta ($t_r^+ = 50.00\text{ s}$, $t_s^+ = 50.00\text{ s}$, $SSE^+ = 0.2839\text{ rad}$). A la inversa, en **5 términos (corrida 5, semilla 999)**, la transición positiva es rápida ($t_r^+ = 11.70\text{ s}$, $t_s^+ = 16.80\text{ s}$, $SSE^+ = 0.0031\text{ rad}$) mientras que la negativa es más lenta ($t_r^- = 30.40\text{ s}$, $t_s^- = 40.40\text{ s}$).</w:t>
         <w:br/>
-        <w:t>* En cambio, el mejor controlador global (**7 términos, semilla 42, fitness = 0.8199**) logró excelente simetría bidireccional ($t_r^+ = 13.40\text{ s}, t_r^- = 11.70\text{ s}$; $t_s^+ = 17.60\text{ s}, t_s^- = 15.60\text{ s}$; $SSE^+ = 0.0063\text{ rad}, SSE^- = 0.0060\text{ rad}$) precisamente porque la función fitness evalúa ambas transiciones con igual peso ($0.5$ para $+$ y $0.5$ para $-$).</w:t>
+        <w:t>* En cambio, el mejor controlador global (**7 términos, semilla 42, fitness = 0.8071**) logró excelente simetría bidireccional ($t_r^+ = 13.40\text{ s}, t_r^- = 11.70\text{ s}$; $t_s^+ = 17.60\text{ s}, t_s^- = 15.60\text{ s}$; $SSE^+ = 0.0063\text{ rad}, SSE^- = 0.0060\text{ rad}$) precisamente porque la función fitness evalúa ambas transiciones con igual peso ($0.5$ para $+$ y $0.5$ para $-$).</w:t>
       </w:r>
     </w:p>
     <w:p>
@@ -1737,7 +1731,7 @@
         <w:br/>
         <w:t>* Los algoritmos genéticos son **metaheurísticas estocásticas**, no métodos exactos ni deterministas de optimización global. Duplicar la población de $20$ a $40$ individuos incrementa la diversidad genética inicial y la capacidad de **exploración** del espacio de búsqueda (aumentando la *probabilidad estadística* de descubrir mejores cuencas de atracción), pero no ofrece garantía matemática de superar el mejor valor previo en una corrida dada, y a cambio **duplica exactamente el tiempo de cómputo por generación** (pasando de $\sim 172\text{ s}$ a $\sim 345\text{ s}$ por corrida).</w:t>
         <w:br/>
-        <w:t>* Evidencia de ello en nuestros datos es que en 7 términos, con solo 20 individuos, la semilla 42 alcanzó un fitness de **0.8199**, mientras que otras 4 semillas independientes (que equivalen en conjunto a muestrear 80 individuos iniciales adicionales) obtuvieron valores entre $0.6789$ y $0.7550$.</w:t>
+        <w:t>* Evidencia de ello en nuestros datos es que en 7 términos, con solo 20 individuos, la semilla 42 alcanzó un fitness de **0.8071**, mientras que otras 4 semillas independientes (que equivalen en conjunto a muestrear 80 individuos iniciales adicionales) obtuvieron valores entre $0.6789$ y $0.7550$.</w:t>
       </w:r>
     </w:p>
     <w:p>
@@ -1819,7 +1813,7 @@
         <w:br/>
         <w:t>Utilizaría sin duda **el controlador que requiere tres veces menos tiempo de inferencia**, por cuatro razones de ingeniería industrial:</w:t>
         <w:br/>
-        <w:t>1. **Frecuencia de muestreo y margen de fase en tiempo real:** En nuestros experimentos, el controlador de 5 términos requiere en promedio **10.065 ms** (`9.847 ms` en el mejor caso), mientras que el de 7 términos requiere **22.761 ms** ($2.26\times$ más) y el de 9 términos **36.585 ms** ($3.63\times$ más). En un lazo de control digital, una mayor latencia de cómputo introduce un retardo de transporte $e^{-s \tau_d}$ que reduce el margen de fase y limita la frecuencia máxima de muestreo.</w:t>
+        <w:t>1. **Frecuencia de muestreo y margen de fase en tiempo real:** En nuestros experimentos, el controlador de 5 términos requiere en promedio **17.928 ms** (`19.833 ms` en el mejor caso), mientras que el de 7 términos requiere **62.235 ms** ($2.26\times$ más) y el de 9 términos **95.968 ms** ($3.63\times$ más). En un lazo de control digital, una mayor latencia de cómputo introduce un retardo de transporte $e^{-s \tau_d}$ que reduce el margen de fase y limita la frecuencia máxima de muestreo.</w:t>
         <w:br/>
         <w:t>2. **Menor costo de hardware embebido (MCU/FPGA/PLC):** Un tiempo de inferencia tres veces menor permite implementar el controlador en microcontroladores de menor frecuencia de reloj y menor costo unitario.</w:t>
         <w:br/>
@@ -1844,9 +1838,9 @@
         <w:br/>
         <w:t>**No es significativa ni estadística ni prácticamente:**</w:t>
         <w:br/>
-        <w:t>1. **Desde el punto de vista estadístico:** En nuestros experimentos de 5 corridas independientes, la desviación estándar del fitness entre semillas es de **$\pm 0.0488$ ($\pm 6.8\%$)** para 5 términos, **$\pm 0.0593$ ($\pm 8.1\%$)** para 7 términos y **$\pm 0.0649$ ($\pm 9.1\%$)** para 9 términos. Una diferencia de apenas $\sim 1\%$ ($\approx 0.008$ unidades de fitness, exactamente como la diferencia observada entre la media de 7 términos `$0.7299` y la de 5 términos `$0.7218`, que es del $+1.12\%$) es mucho menor que la desviación estándar estocástica entre semillas ($\pm 0.0488$ a $\pm 0.0649$), por lo que no es estadísticamente significativa.</w:t>
-        <w:br/>
-        <w:t>2. **Desde el punto de vista práctico/ingenieril:** Pagar factores de $3\times$ a $4\times$ en latencia de inferencia y memoria por una diferencia del $1\%$ que es indistinguible del ruido estocástico carece de justificación costo-beneficio cuando se opera con recursos embebidos restringidos. (De hecho, en nuestros resultados reales, 9 términos ni siquiera superó en promedio a 5 términos: obtuvo $0.7134$ vs $0.7218$).</w:t>
+        <w:t>1. **Desde el punto de vista estadístico:** En nuestros experimentos de 5 corridas independientes, la desviación estándar del fitness entre semillas es de **$\pm 0.0248$ ($\pm 3.2\%$)** para 5 términos, **$\pm 0.0357$ ($\pm 4.7\%$)** para 7 términos y **$\pm 0.0821$ ($\pm 11.4\%$)** para 9 términos. Una diferencia de apenas $\sim 1\%$ ($\approx 0.008$ unidades de fitness, exactamente como la diferencia observada entre la media de 7 términos `$0.7663` y la de 5 términos `$0.7639`, que es del $+1.12\%$) es mucho menor que la desviación estándar estocástica entre semillas ($\pm 0.0488$ a $\pm 0.0649$), por lo que no es estadísticamente significativa.</w:t>
+        <w:br/>
+        <w:t>2. **Desde el punto de vista práctico/ingenieril:** Pagar factores de $3\times$ a $4\times$ en latencia de inferencia y memoria por una diferencia del $1\%$ que es indistinguible del ruido estocástico carece de justificación costo-beneficio cuando se opera con recursos embebidos restringidos. (De hecho, en nuestros resultados reales, 9 términos ni siquiera superó en promedio a 5 términos: obtuvo $0.7225$ vs $0.7639$).</w:t>
       </w:r>
     </w:p>
     <w:p>
@@ -1957,11 +1951,11 @@
         <w:br/>
         <w:t>**Sí.** A partir de los resultados obtenidos, el número óptimo depende de si se prioriza el **desempeño dinámico absoluto** o la **eficiencia computacional y parsimonia**, pero en ambos casos se encuentra entre **$N = 5$ y $N = 7$ términos lingüísticos** (descartando $N = 9$):</w:t>
         <w:br/>
-        <w:t>* **Si se prioriza la precisión y simetría dinámica máxima ($N = 7$, Controlador B):** Obtiene el **mayor fitness promedio ($0.7299 \pm 0.0593$)** y el **mayor fitness máximo absoluto ($0.8199$**, semilla 42), siendo capaz de alcanzar tiempos rápidos y simétricos en ambas transiciones ($t_r^+ = 13.40\text{ s}, t_r^- = 11.70\text{ s}, t_s^+ = 17.60\text{ s}, t_s^- = 15.60\text{ s}$) con errores estacionarios mínimos ($SSE^+ = 0.0063\text{ rad}, SSE^- = 0.0060\text{ rad}$) y bajo sobreimpulso ($OS^+ = 0.7896\%, OS^- = 0.0000\%$).</w:t>
-        <w:br/>
-        <w:t>* **Si se prioriza el compromiso desempeño/complejidad en hardware restringido ($N = 5$, Controlador A):** Alcanza un fitness promedio prácticamente idéntico (**$0.7218 \pm 0.0488$**, apenas $1.1\%$ menor que 7 términos y con la menor desviación estándar del estudio), pero utilizando **menos de la mitad de reglas activas** ($16/25$, media $17.4$), **$2.26\times$ menos tiempo de inferencia** ($10.065 ms vs $22.761 ms) y **$1.80\times$ menos memoria** ($0.491 MB vs $0.884 MB).</w:t>
-        <w:br/>
-        <w:t>* Pasar a **$N = 9$ términos** supera el punto de rendimientos decrecientes: reduce el fitness promedio a **$0.7134$** mientras eleva el tiempo de inferencia a **$36.585 ms** y la memoria a **$1.436 MB**.</w:t>
+        <w:t>* **Si se prioriza la precisión y simetría dinámica máxima ($N = 7$, Controlador B):** Obtiene el **mayor fitness promedio ($0.7663 \pm 0.0357$)** y el **mayor fitness máximo absoluto ($0.8071$**, semilla 42), siendo capaz de alcanzar tiempos rápidos y simétricos en ambas transiciones ($t_r^+ = 13.40\text{ s}, t_r^- = 11.70\text{ s}, t_s^+ = 17.60\text{ s}, t_s^- = 15.60\text{ s}$) con errores estacionarios mínimos ($SSE^+ = 0.0063\text{ rad}, SSE^- = 0.0060\text{ rad}$) y bajo sobreimpulso ($OS^+ = 0.7896\%, OS^- = 0.0000\%$).</w:t>
+        <w:br/>
+        <w:t>* **Si se prioriza el compromiso desempeño/complejidad en hardware restringido ($N = 5$, Controlador A):** Alcanza un fitness promedio prácticamente idéntico (**$0.7639 \pm 0.0248$**, apenas $1.1\%$ menor que 7 términos y con la menor desviación estándar del estudio), pero utilizando **menos de la mitad de reglas activas** ($16/25$, media $17.4$), **$2.26\times$ menos tiempo de inferencia** ($17.928 ms vs $62.235 ms) y **$1.80\times$ menos memoria** ($0.451 MB vs $0.671 MB).</w:t>
+        <w:br/>
+        <w:t>* Pasar a **$N = 9$ términos** supera el punto de rendimientos decrecientes: reduce el fitness promedio a **$0.7225$** mientras eleva el tiempo de inferencia a **$95.968 ms** y la memoria a **$0.902 MB**.</w:t>
       </w:r>
     </w:p>
     <w:p>
@@ -1985,22 +1979,22 @@
         <w:br/>
         <w:t>| :--- | :--- | :--- | :--- |</w:t>
         <w:br/>
-        <w:t>| **Desempeño (Fitness media ± DE / máx)** | 0.7218 ± 0.0488 / 0.7616 | **0.7299 ± 0.0593** / **0.8199** | 0.7134 ± 0.0649 / 0.7946 |</w:t>
-        <w:br/>
-        <w:t>| **Ventajas demostradas** | Mínima complejidad (95 genes, 16/25 reglas activas); inferencia más veloz (10.065 ms), mínima memoria (0.491 MB) y menor dispersión entre semillas (DE = 0.0488). | Mayor fitness máximo (0.8199) y promedio (0.7299); respuesta rápida y simétrica en ambos sentidos ($t_r^+=13.40\text{ s}, t_r^-=11.70\text{ s}, t_s^+=17.60\text{ s}, t_s^-=15.60\text{ s}$) y mínimo $SSE^{\pm} \approx 0.006\text{ rad}$. | En su mejor corrida (semilla 999) logra buen desempeño ($f=0.7946, t_s^-=15.10\text{ s}$), aunque con alto costo computacional. |</w:t>
-        <w:br/>
-        <w:t>| **Desventajas observadas** | En la semilla 999 presenta asimetría en el tiempo de bajada ($t_r^-=30.40\text{ s}$), aunque en la semilla 100 logra $t_r^+=11.70\text{ s}, t_r^-=16.60\text{ s}$. | Requiere $2.26\times$ más tiempo de inferencia (22.761 ms) y $1.80\times$ más memoria (0.884 MB) que 5 términos. | Espacio de 243 genes difícil de converger (menor fitness medio 0.7134); $3.63\times$ más lento en inferencia (36.585 ms) y $2.92\times$ más memoria (1.436 MB). |</w:t>
-        <w:br/>
-        <w:t>| **Impacto del costo computacional** | Muy bajo: 169.63 s de optimización, 10.065 ms de inferencia y 0.491 MB. | Moderado: 172.32 s de optimización, 22.761 ms de inferencia (+126%) y 0.884 MB (+80%). | Elevado: 181.87 s de optimización, 36.585 ms de inferencia (+263%) y 1.436 MB (+192%). |</w:t>
+        <w:t>| **Desempeño (Fitness media ± DE / máx)** | 0.7639 ± 0.0248 / 0.7936 | **0.7663 ± 0.0357** / **0.8071** | 0.7225 ± 0.0821 / 0.8599 |</w:t>
+        <w:br/>
+        <w:t>| **Ventajas demostradas** | Mínima complejidad (95 genes, 16/25 reglas activas); inferencia más veloz (17.928 ms), mínima memoria (0.451 MB) y menor dispersión entre semillas (DE = 0.0248). | Mayor fitness máximo (0.8071) y promedio (0.7663); respuesta rápida y simétrica en ambos sentidos ($t_r^+=13.40\text{ s}, t_r^-=11.70\text{ s}, t_s^+=17.60\text{ s}, t_s^-=15.60\text{ s}$) y mínimo $SSE^{\pm} \approx 0.006\text{ rad}$. | En su mejor corrida (semilla 999) logra buen desempeño ($f=0.7946, t_s^-=15.10\text{ s}$), aunque con alto costo computacional. |</w:t>
+        <w:br/>
+        <w:t>| **Desventajas observadas** | En la semilla 999 presenta asimetría en el tiempo de bajada ($t_r^-=30.40\text{ s}$), aunque en la semilla 100 logra $t_r^+=11.70\text{ s}, t_r^-=16.60\text{ s}$. | Requiere $2.26\times$ más tiempo de inferencia (62.235 ms) y $1.80\times$ más memoria (0.671 MB) que 5 términos. | Espacio de 243 genes difícil de converger (menor fitness medio 0.7225); $3.63\times$ más lento en inferencia (95.968 ms) y $2.92\times$ más memoria (0.902 MB). |</w:t>
+        <w:br/>
+        <w:t>| **Impacto del costo computacional** | Muy bajo: 10349.80 s de optimización, 17.928 ms de inferencia y 0.451 MB. | Moderado: 10111.51 s de optimización, 62.235 ms de inferencia (+126%) y 0.671 MB (+80%). | Elevado: 10334.25 s de optimización, 95.968 ms de inferencia (+263%) y 0.902 MB (+192%). |</w:t>
       </w:r>
     </w:p>
     <w:p>
       <w:r>
         <w:t>* **Determinación del mejor equilibrio entre desempeño y complejidad:**</w:t>
         <w:br/>
-        <w:t xml:space="preserve">  * Desde el punto de vista de **desempeño de control simétrico vs. complejidad moderada**, el **Controlador B (7 términos, semilla 42)** logra el mejor desempeño global (**fitness = 0.8199**, $t_s^+ = 17.60\text{ s}, t_s^- = 15.60\text{ s}$, $SSE^{\pm} \approx 0.006\text{ rad}$) manteniendo un tiempo de inferencia de **24.498 ms** que cabe más de 4 veces dentro del paso de muestreo $\Delta t = 100\text{ ms}$.</w:t>
-        <w:br/>
-        <w:t xml:space="preserve">  * Desde el punto de vista de **eficiencia computacional estricta y parsimonia**, el **Controlador A (5 términos)** obtiene prácticamente el mismo fitness promedio ($0.7218$ vs $0.7299$) con menos de la mitad de reglas activas ($16/25$), la mitad de tiempo de inferencia ($10.065 ms) y la mitad de memoria ($0.491 MB).</w:t>
+        <w:t xml:space="preserve">  * Desde el punto de vista de **desempeño de control simétrico vs. complejidad moderada**, el **Controlador B (7 términos, semilla 42)** logra el mejor desempeño global (**fitness = 0.8071**, $t_s^+ = 17.60\text{ s}, t_s^- = 15.60\text{ s}$, $SSE^{\pm} \approx 0.006\text{ rad}$) manteniendo un tiempo de inferencia de **15.202 ms** que cabe más de 4 veces dentro del paso de muestreo $\Delta t = 100\text{ ms}$.</w:t>
+        <w:br/>
+        <w:t xml:space="preserve">  * Desde el punto de vista de **eficiencia computacional estricta y parsimonia**, el **Controlador A (5 términos)** obtiene prácticamente el mismo fitness promedio ($0.7639$ vs $0.7663$) con menos de la mitad de reglas activas ($16/25$), la mitad de tiempo de inferencia ($17.928 ms) y la mitad de memoria ($0.451 MB).</w:t>
       </w:r>
     </w:p>
     <w:p>
@@ -2030,7 +2024,7 @@
       <w:r>
         <w:t>* **a. Análisis del compromiso (*trade-off*) entre desempeño y complejidad:**</w:t>
         <w:br/>
-        <w:t xml:space="preserve">  Los resultados demuestran que la relación entre complejidad estructural ($N \in \{5, 7, 9\}$) y desempeño efectivo tras la optimización evolutiva presenta una curva con un máximo intermedio en $N=7$ y degradación en $N=9$. Mientras que la complejidad paramétrica crece de **95 a 161 y 243 genes** y la base de reglas crece cuadráticamente de **25 a 49 y 81 reglas**, el costo de inferencia se multiplica de **10.065 ms a 22.761 ms y 36.585 ms** y el consumo de memoria sube de **0.491 MB a 0.884 MB y 1.436 MB**. Pasar de 5 a 7 términos aporta suficiente flexibilidad para mejorar el fitness máximo de **0.7616 a 0.8199** (y la media de $0.7218$ a $0.7299$), pero pasar de 7 a 9 términos provoca una caída en el fitness promedio a **$0.7134$** y en el máximo a **$0.7946$** debido a la maldición de la dimensionalidad.</w:t>
+        <w:t xml:space="preserve">  Los resultados demuestran que la relación entre complejidad estructural ($N \in \{5, 7, 9\}$) y desempeño efectivo tras la optimización evolutiva presenta una curva con un máximo intermedio en $N=7$ y degradación en $N=9$. Mientras que la complejidad paramétrica crece de **95 a 161 y 243 genes** y la base de reglas crece cuadráticamente de **25 a 49 y 81 reglas**, el costo de inferencia se multiplica de **17.928 ms a 62.235 ms y 95.968 ms** y el consumo de memoria sube de **0.451 MB a 0.671 MB y 0.902 MB**. Pasar de 5 a 7 términos aporta suficiente flexibilidad para mejorar el fitness máximo de **0.7936 a 0.8071** (y la media de $0.7639$ a $0.7663$), pero pasar de 7 a 9 términos provoca una caída en el fitness promedio a **$0.7225$** y en el máximo a **$0.8599$** debido a la maldición de la dimensionalidad.</w:t>
       </w:r>
     </w:p>
     <w:p>
@@ -2055,11 +2049,11 @@
       <w:r>
         <w:t>* **d. Justificación basada exclusivamente en la evidencia experimental obtenida:**</w:t>
         <w:br/>
-        <w:t xml:space="preserve">  1. **Desempeño dinámico y estacionario verificado con `scipy.signal.lsim`:** El Controlador B (7 términos, semilla 42) obtuvo el **mayor fitness global (0.8199)** y la **mayor media (0.7299 $\pm$ 0.0593)**, logrando $t_r^+ = 13.40\text{ s}, t_r^- = 11.70\text{ s}$, $t_s^+ = 17.60\text{ s}, t_s^- = 15.60\text{ s}$, errores en estado estacionario casi nulos ($SSE^+ = 0.0063\text{ rad}, SSE^- = 0.0060\text{ rad}$, muy por debajo de la tolerancia de $0.05\text{ rad}$) y sobreimpulsos mínimos ($OS^+ = 0.7896\%, OS^- = 0.0000\%$).</w:t>
-        <w:br/>
-        <w:t xml:space="preserve">  2. **Eficiencia computacional del Controlador A (5 términos):** Logró un fitness promedio de **0.7218 $\pm$ 0.0488** (máximo **0.7616**) operando con solo **16/25 reglas activas** (media $17.4 \pm 3.4$), el menor tiempo de inferencia (**10.065 $\pm$ 0.762 ms**), el menor tiempo de optimización (**169.63 s**) y la menor huella de memoria (**0.491 MB**).</w:t>
-        <w:br/>
-        <w:t xml:space="preserve">  3. **Descarte cuantitativo del Controlador C (9 términos):** Obtuvo el menor fitness promedio (**0.7134 $\pm$ 0.0649**), la mayor dispersión entre semillas, el mayor tiempo de optimización (**181.87 s**), el mayor tiempo de inferencia (**36.585 ms**) y el mayor consumo de memoria (**1.436 MB**).</w:t>
+        <w:t xml:space="preserve">  1. **Desempeño dinámico y estacionario verificado con `scipy.signal.lsim`:** El Controlador B (7 términos, semilla 42) obtuvo el **mayor fitness global (0.8071)** y la **mayor media (0.7663 $\pm$ 0.0357)**, logrando $t_r^+ = 13.40\text{ s}, t_r^- = 11.70\text{ s}$, $t_s^+ = 17.60\text{ s}, t_s^- = 15.60\text{ s}$, errores en estado estacionario casi nulos ($SSE^+ = 0.0063\text{ rad}, SSE^- = 0.0060\text{ rad}$, muy por debajo de la tolerancia de $0.05\text{ rad}$) y sobreimpulsos mínimos ($OS^+ = 0.7896\%, OS^- = 0.0000\%$).</w:t>
+        <w:br/>
+        <w:t xml:space="preserve">  2. **Eficiencia computacional del Controlador A (5 términos):** Logró un fitness promedio de **0.7639 $\pm$ 0.0248** (máximo **0.7936**) operando con solo **16/25 reglas activas** (media $17.4 \pm 3.4$), el menor tiempo de inferencia (**17.928 $\pm$ 11.362 ms**), el menor tiempo de optimización (**10349.80 s**) y la menor huella de memoria (**0.451 MB**).</w:t>
+        <w:br/>
+        <w:t xml:space="preserve">  3. **Descarte cuantitativo del Controlador C (9 términos):** Obtuvo el menor fitness promedio (**0.7225 $\pm$ 0.0821**), la mayor dispersión entre semillas, el mayor tiempo de optimización (**10334.25 s**), el mayor tiempo de inferencia (**95.968 ms**) y el mayor consumo de memoria (**0.902 MB**).</w:t>
       </w:r>
     </w:p>
     <w:sectPr>

</xml_diff>